<commit_message>
update the 'bibliography' in the table of contents
</commit_message>
<xml_diff>
--- a/report_spring2026.docx
+++ b/report_spring2026.docx
@@ -725,7 +725,7 @@
             </w:rPr>
             <w:fldChar w:fldCharType="separate"/>
           </w:r>
-          <w:hyperlink w:anchor="_Toc230365352" w:history="1">
+          <w:hyperlink w:anchor="_Toc230367721" w:history="1">
             <w:r>
               <w:rPr>
                 <w:rStyle w:val="af1"/>
@@ -756,7 +756,7 @@
                 <w:noProof/>
                 <w:webHidden/>
               </w:rPr>
-              <w:instrText xml:space="preserve"> PAGEREF _Toc230365352 \h </w:instrText>
+              <w:instrText xml:space="preserve"> PAGEREF _Toc230367721 \h </w:instrText>
             </w:r>
             <w:r>
               <w:rPr>
@@ -803,7 +803,7 @@
               <w:lang w:eastAsia="ru-RU"/>
             </w:rPr>
           </w:pPr>
-          <w:hyperlink w:anchor="_Toc230365353" w:history="1">
+          <w:hyperlink w:anchor="_Toc230367722" w:history="1">
             <w:r>
               <w:rPr>
                 <w:rStyle w:val="af1"/>
@@ -834,7 +834,7 @@
                 <w:noProof/>
                 <w:webHidden/>
               </w:rPr>
-              <w:instrText xml:space="preserve"> PAGEREF _Toc230365353 \h </w:instrText>
+              <w:instrText xml:space="preserve"> PAGEREF _Toc230367722 \h </w:instrText>
             </w:r>
             <w:r>
               <w:rPr>
@@ -857,7 +857,7 @@
                 <w:noProof/>
                 <w:webHidden/>
               </w:rPr>
-              <w:t>5</w:t>
+              <w:t>6</w:t>
             </w:r>
             <w:r>
               <w:rPr>
@@ -881,7 +881,7 @@
               <w:lang w:eastAsia="ru-RU"/>
             </w:rPr>
           </w:pPr>
-          <w:hyperlink w:anchor="_Toc230365354" w:history="1">
+          <w:hyperlink w:anchor="_Toc230367723" w:history="1">
             <w:r>
               <w:rPr>
                 <w:rStyle w:val="af1"/>
@@ -912,7 +912,7 @@
                 <w:noProof/>
                 <w:webHidden/>
               </w:rPr>
-              <w:instrText xml:space="preserve"> PAGEREF _Toc230365354 \h </w:instrText>
+              <w:instrText xml:space="preserve"> PAGEREF _Toc230367723 \h </w:instrText>
             </w:r>
             <w:r>
               <w:rPr>
@@ -935,7 +935,7 @@
                 <w:noProof/>
                 <w:webHidden/>
               </w:rPr>
-              <w:t>5</w:t>
+              <w:t>6</w:t>
             </w:r>
             <w:r>
               <w:rPr>
@@ -959,7 +959,7 @@
               <w:lang w:eastAsia="ru-RU"/>
             </w:rPr>
           </w:pPr>
-          <w:hyperlink w:anchor="_Toc230365355" w:history="1">
+          <w:hyperlink w:anchor="_Toc230367724" w:history="1">
             <w:r>
               <w:rPr>
                 <w:rStyle w:val="af1"/>
@@ -990,7 +990,7 @@
                 <w:noProof/>
                 <w:webHidden/>
               </w:rPr>
-              <w:instrText xml:space="preserve"> PAGEREF _Toc230365355 \h </w:instrText>
+              <w:instrText xml:space="preserve"> PAGEREF _Toc230367724 \h </w:instrText>
             </w:r>
             <w:r>
               <w:rPr>
@@ -1013,7 +1013,7 @@
                 <w:noProof/>
                 <w:webHidden/>
               </w:rPr>
-              <w:t>5</w:t>
+              <w:t>6</w:t>
             </w:r>
             <w:r>
               <w:rPr>
@@ -1037,7 +1037,7 @@
               <w:lang w:eastAsia="ru-RU"/>
             </w:rPr>
           </w:pPr>
-          <w:hyperlink w:anchor="_Toc230365356" w:history="1">
+          <w:hyperlink w:anchor="_Toc230367725" w:history="1">
             <w:r>
               <w:rPr>
                 <w:rStyle w:val="af1"/>
@@ -1094,7 +1094,7 @@
                 <w:noProof/>
                 <w:webHidden/>
               </w:rPr>
-              <w:instrText xml:space="preserve"> PAGEREF _Toc230365356 \h </w:instrText>
+              <w:instrText xml:space="preserve"> PAGEREF _Toc230367725 \h </w:instrText>
             </w:r>
             <w:r>
               <w:rPr>
@@ -1117,7 +1117,7 @@
                 <w:noProof/>
                 <w:webHidden/>
               </w:rPr>
-              <w:t>5</w:t>
+              <w:t>6</w:t>
             </w:r>
             <w:r>
               <w:rPr>
@@ -1141,7 +1141,7 @@
               <w:lang w:eastAsia="ru-RU"/>
             </w:rPr>
           </w:pPr>
-          <w:hyperlink w:anchor="_Toc230365357" w:history="1">
+          <w:hyperlink w:anchor="_Toc230367726" w:history="1">
             <w:r>
               <w:rPr>
                 <w:rStyle w:val="af1"/>
@@ -1172,7 +1172,7 @@
                 <w:noProof/>
                 <w:webHidden/>
               </w:rPr>
-              <w:instrText xml:space="preserve"> PAGEREF _Toc230365357 \h </w:instrText>
+              <w:instrText xml:space="preserve"> PAGEREF _Toc230367726 \h </w:instrText>
             </w:r>
             <w:r>
               <w:rPr>
@@ -1195,7 +1195,7 @@
                 <w:noProof/>
                 <w:webHidden/>
               </w:rPr>
-              <w:t>6</w:t>
+              <w:t>7</w:t>
             </w:r>
             <w:r>
               <w:rPr>
@@ -1219,7 +1219,7 @@
               <w:lang w:eastAsia="ru-RU"/>
             </w:rPr>
           </w:pPr>
-          <w:hyperlink w:anchor="_Toc230365358" w:history="1">
+          <w:hyperlink w:anchor="_Toc230367727" w:history="1">
             <w:r>
               <w:rPr>
                 <w:rStyle w:val="af1"/>
@@ -1250,7 +1250,7 @@
                 <w:noProof/>
                 <w:webHidden/>
               </w:rPr>
-              <w:instrText xml:space="preserve"> PAGEREF _Toc230365358 \h </w:instrText>
+              <w:instrText xml:space="preserve"> PAGEREF _Toc230367727 \h </w:instrText>
             </w:r>
             <w:r>
               <w:rPr>
@@ -1273,7 +1273,7 @@
                 <w:noProof/>
                 <w:webHidden/>
               </w:rPr>
-              <w:t>6</w:t>
+              <w:t>7</w:t>
             </w:r>
             <w:r>
               <w:rPr>
@@ -1297,7 +1297,7 @@
               <w:lang w:eastAsia="ru-RU"/>
             </w:rPr>
           </w:pPr>
-          <w:hyperlink w:anchor="_Toc230365359" w:history="1">
+          <w:hyperlink w:anchor="_Toc230367728" w:history="1">
             <w:r>
               <w:rPr>
                 <w:rStyle w:val="af1"/>
@@ -1328,7 +1328,7 @@
                 <w:noProof/>
                 <w:webHidden/>
               </w:rPr>
-              <w:instrText xml:space="preserve"> PAGEREF _Toc230365359 \h </w:instrText>
+              <w:instrText xml:space="preserve"> PAGEREF _Toc230367728 \h </w:instrText>
             </w:r>
             <w:r>
               <w:rPr>
@@ -1351,7 +1351,7 @@
                 <w:noProof/>
                 <w:webHidden/>
               </w:rPr>
-              <w:t>7</w:t>
+              <w:t>8</w:t>
             </w:r>
             <w:r>
               <w:rPr>
@@ -1375,7 +1375,7 @@
               <w:lang w:eastAsia="ru-RU"/>
             </w:rPr>
           </w:pPr>
-          <w:hyperlink w:anchor="_Toc230365360" w:history="1">
+          <w:hyperlink w:anchor="_Toc230367729" w:history="1">
             <w:r>
               <w:rPr>
                 <w:rStyle w:val="af1"/>
@@ -1406,7 +1406,7 @@
                 <w:noProof/>
                 <w:webHidden/>
               </w:rPr>
-              <w:instrText xml:space="preserve"> PAGEREF _Toc230365360 \h </w:instrText>
+              <w:instrText xml:space="preserve"> PAGEREF _Toc230367729 \h </w:instrText>
             </w:r>
             <w:r>
               <w:rPr>
@@ -1429,7 +1429,7 @@
                 <w:noProof/>
                 <w:webHidden/>
               </w:rPr>
-              <w:t>7</w:t>
+              <w:t>8</w:t>
             </w:r>
             <w:r>
               <w:rPr>
@@ -1453,7 +1453,7 @@
               <w:lang w:eastAsia="ru-RU"/>
             </w:rPr>
           </w:pPr>
-          <w:hyperlink w:anchor="_Toc230365361" w:history="1">
+          <w:hyperlink w:anchor="_Toc230367730" w:history="1">
             <w:r>
               <w:rPr>
                 <w:rStyle w:val="af1"/>
@@ -1484,7 +1484,7 @@
                 <w:noProof/>
                 <w:webHidden/>
               </w:rPr>
-              <w:instrText xml:space="preserve"> PAGEREF _Toc230365361 \h </w:instrText>
+              <w:instrText xml:space="preserve"> PAGEREF _Toc230367730 \h </w:instrText>
             </w:r>
             <w:r>
               <w:rPr>
@@ -1507,7 +1507,7 @@
                 <w:noProof/>
                 <w:webHidden/>
               </w:rPr>
-              <w:t>7</w:t>
+              <w:t>8</w:t>
             </w:r>
             <w:r>
               <w:rPr>
@@ -1531,7 +1531,7 @@
               <w:lang w:eastAsia="ru-RU"/>
             </w:rPr>
           </w:pPr>
-          <w:hyperlink w:anchor="_Toc230365362" w:history="1">
+          <w:hyperlink w:anchor="_Toc230367731" w:history="1">
             <w:r>
               <w:rPr>
                 <w:rStyle w:val="af1"/>
@@ -1562,7 +1562,7 @@
                 <w:noProof/>
                 <w:webHidden/>
               </w:rPr>
-              <w:instrText xml:space="preserve"> PAGEREF _Toc230365362 \h </w:instrText>
+              <w:instrText xml:space="preserve"> PAGEREF _Toc230367731 \h </w:instrText>
             </w:r>
             <w:r>
               <w:rPr>
@@ -1585,7 +1585,7 @@
                 <w:noProof/>
                 <w:webHidden/>
               </w:rPr>
-              <w:t>8</w:t>
+              <w:t>9</w:t>
             </w:r>
             <w:r>
               <w:rPr>
@@ -1609,7 +1609,7 @@
               <w:lang w:eastAsia="ru-RU"/>
             </w:rPr>
           </w:pPr>
-          <w:hyperlink w:anchor="_Toc230365363" w:history="1">
+          <w:hyperlink w:anchor="_Toc230367732" w:history="1">
             <w:r>
               <w:rPr>
                 <w:rStyle w:val="af1"/>
@@ -1640,7 +1640,7 @@
                 <w:noProof/>
                 <w:webHidden/>
               </w:rPr>
-              <w:instrText xml:space="preserve"> PAGEREF _Toc230365363 \h </w:instrText>
+              <w:instrText xml:space="preserve"> PAGEREF _Toc230367732 \h </w:instrText>
             </w:r>
             <w:r>
               <w:rPr>
@@ -1663,7 +1663,7 @@
                 <w:noProof/>
                 <w:webHidden/>
               </w:rPr>
-              <w:t>8</w:t>
+              <w:t>9</w:t>
             </w:r>
             <w:r>
               <w:rPr>
@@ -1687,7 +1687,7 @@
               <w:lang w:eastAsia="ru-RU"/>
             </w:rPr>
           </w:pPr>
-          <w:hyperlink w:anchor="_Toc230365364" w:history="1">
+          <w:hyperlink w:anchor="_Toc230367733" w:history="1">
             <w:r>
               <w:rPr>
                 <w:rStyle w:val="af1"/>
@@ -1752,7 +1752,7 @@
                 <w:noProof/>
                 <w:webHidden/>
               </w:rPr>
-              <w:instrText xml:space="preserve"> PAGEREF _Toc230365364 \h </w:instrText>
+              <w:instrText xml:space="preserve"> PAGEREF _Toc230367733 \h </w:instrText>
             </w:r>
             <w:r>
               <w:rPr>
@@ -1775,7 +1775,7 @@
                 <w:noProof/>
                 <w:webHidden/>
               </w:rPr>
-              <w:t>9</w:t>
+              <w:t>10</w:t>
             </w:r>
             <w:r>
               <w:rPr>
@@ -1799,7 +1799,7 @@
               <w:lang w:eastAsia="ru-RU"/>
             </w:rPr>
           </w:pPr>
-          <w:hyperlink w:anchor="_Toc230365365" w:history="1">
+          <w:hyperlink w:anchor="_Toc230367734" w:history="1">
             <w:r>
               <w:rPr>
                 <w:rStyle w:val="af1"/>
@@ -1830,7 +1830,7 @@
                 <w:noProof/>
                 <w:webHidden/>
               </w:rPr>
-              <w:instrText xml:space="preserve"> PAGEREF _Toc230365365 \h </w:instrText>
+              <w:instrText xml:space="preserve"> PAGEREF _Toc230367734 \h </w:instrText>
             </w:r>
             <w:r>
               <w:rPr>
@@ -1853,7 +1853,7 @@
                 <w:noProof/>
                 <w:webHidden/>
               </w:rPr>
-              <w:t>9</w:t>
+              <w:t>10</w:t>
             </w:r>
             <w:r>
               <w:rPr>
@@ -1877,7 +1877,7 @@
               <w:lang w:eastAsia="ru-RU"/>
             </w:rPr>
           </w:pPr>
-          <w:hyperlink w:anchor="_Toc230365366" w:history="1">
+          <w:hyperlink w:anchor="_Toc230367735" w:history="1">
             <w:r>
               <w:rPr>
                 <w:rStyle w:val="af1"/>
@@ -1908,7 +1908,7 @@
                 <w:noProof/>
                 <w:webHidden/>
               </w:rPr>
-              <w:instrText xml:space="preserve"> PAGEREF _Toc230365366 \h </w:instrText>
+              <w:instrText xml:space="preserve"> PAGEREF _Toc230367735 \h </w:instrText>
             </w:r>
             <w:r>
               <w:rPr>
@@ -1931,7 +1931,7 @@
                 <w:noProof/>
                 <w:webHidden/>
               </w:rPr>
-              <w:t>10</w:t>
+              <w:t>11</w:t>
             </w:r>
             <w:r>
               <w:rPr>
@@ -1955,7 +1955,7 @@
               <w:lang w:eastAsia="ru-RU"/>
             </w:rPr>
           </w:pPr>
-          <w:hyperlink w:anchor="_Toc230365367" w:history="1">
+          <w:hyperlink w:anchor="_Toc230367736" w:history="1">
             <w:r>
               <w:rPr>
                 <w:rStyle w:val="af1"/>
@@ -1986,7 +1986,7 @@
                 <w:noProof/>
                 <w:webHidden/>
               </w:rPr>
-              <w:instrText xml:space="preserve"> PAGEREF _Toc230365367 \h </w:instrText>
+              <w:instrText xml:space="preserve"> PAGEREF _Toc230367736 \h </w:instrText>
             </w:r>
             <w:r>
               <w:rPr>
@@ -2009,7 +2009,7 @@
                 <w:noProof/>
                 <w:webHidden/>
               </w:rPr>
-              <w:t>10</w:t>
+              <w:t>11</w:t>
             </w:r>
             <w:r>
               <w:rPr>
@@ -2033,7 +2033,7 @@
               <w:lang w:eastAsia="ru-RU"/>
             </w:rPr>
           </w:pPr>
-          <w:hyperlink w:anchor="_Toc230365368" w:history="1">
+          <w:hyperlink w:anchor="_Toc230367737" w:history="1">
             <w:r>
               <w:rPr>
                 <w:rStyle w:val="af1"/>
@@ -2115,7 +2115,7 @@
                 <w:noProof/>
                 <w:webHidden/>
               </w:rPr>
-              <w:instrText xml:space="preserve"> PAGEREF _Toc230365368 \h </w:instrText>
+              <w:instrText xml:space="preserve"> PAGEREF _Toc230367737 \h </w:instrText>
             </w:r>
             <w:r>
               <w:rPr>
@@ -2138,7 +2138,7 @@
                 <w:noProof/>
                 <w:webHidden/>
               </w:rPr>
-              <w:t>10</w:t>
+              <w:t>11</w:t>
             </w:r>
             <w:r>
               <w:rPr>
@@ -2162,7 +2162,7 @@
               <w:lang w:eastAsia="ru-RU"/>
             </w:rPr>
           </w:pPr>
-          <w:hyperlink w:anchor="_Toc230365369" w:history="1">
+          <w:hyperlink w:anchor="_Toc230367738" w:history="1">
             <w:r>
               <w:rPr>
                 <w:rStyle w:val="af1"/>
@@ -2193,7 +2193,7 @@
                 <w:noProof/>
                 <w:webHidden/>
               </w:rPr>
-              <w:instrText xml:space="preserve"> PAGEREF _Toc230365369 \h </w:instrText>
+              <w:instrText xml:space="preserve"> PAGEREF _Toc230367738 \h </w:instrText>
             </w:r>
             <w:r>
               <w:rPr>
@@ -2216,7 +2216,7 @@
                 <w:noProof/>
                 <w:webHidden/>
               </w:rPr>
-              <w:t>11</w:t>
+              <w:t>12</w:t>
             </w:r>
             <w:r>
               <w:rPr>
@@ -2240,7 +2240,7 @@
               <w:lang w:eastAsia="ru-RU"/>
             </w:rPr>
           </w:pPr>
-          <w:hyperlink w:anchor="_Toc230365370" w:history="1">
+          <w:hyperlink w:anchor="_Toc230367739" w:history="1">
             <w:r>
               <w:rPr>
                 <w:rStyle w:val="af1"/>
@@ -2271,7 +2271,7 @@
                 <w:noProof/>
                 <w:webHidden/>
               </w:rPr>
-              <w:instrText xml:space="preserve"> PAGEREF _Toc230365370 \h </w:instrText>
+              <w:instrText xml:space="preserve"> PAGEREF _Toc230367739 \h </w:instrText>
             </w:r>
             <w:r>
               <w:rPr>
@@ -2294,7 +2294,7 @@
                 <w:noProof/>
                 <w:webHidden/>
               </w:rPr>
-              <w:t>12</w:t>
+              <w:t>13</w:t>
             </w:r>
             <w:r>
               <w:rPr>
@@ -2318,7 +2318,7 @@
               <w:lang w:eastAsia="ru-RU"/>
             </w:rPr>
           </w:pPr>
-          <w:hyperlink w:anchor="_Toc230365371" w:history="1">
+          <w:hyperlink w:anchor="_Toc230367740" w:history="1">
             <w:r>
               <w:rPr>
                 <w:rStyle w:val="af1"/>
@@ -2349,7 +2349,7 @@
                 <w:noProof/>
                 <w:webHidden/>
               </w:rPr>
-              <w:instrText xml:space="preserve"> PAGEREF _Toc230365371 \h </w:instrText>
+              <w:instrText xml:space="preserve"> PAGEREF _Toc230367740 \h </w:instrText>
             </w:r>
             <w:r>
               <w:rPr>
@@ -2372,7 +2372,7 @@
                 <w:noProof/>
                 <w:webHidden/>
               </w:rPr>
-              <w:t>12</w:t>
+              <w:t>13</w:t>
             </w:r>
             <w:r>
               <w:rPr>
@@ -2396,7 +2396,7 @@
               <w:lang w:eastAsia="ru-RU"/>
             </w:rPr>
           </w:pPr>
-          <w:hyperlink w:anchor="_Toc230365372" w:history="1">
+          <w:hyperlink w:anchor="_Toc230367741" w:history="1">
             <w:r>
               <w:rPr>
                 <w:rStyle w:val="af1"/>
@@ -2427,7 +2427,7 @@
                 <w:noProof/>
                 <w:webHidden/>
               </w:rPr>
-              <w:instrText xml:space="preserve"> PAGEREF _Toc230365372 \h </w:instrText>
+              <w:instrText xml:space="preserve"> PAGEREF _Toc230367741 \h </w:instrText>
             </w:r>
             <w:r>
               <w:rPr>
@@ -2450,7 +2450,7 @@
                 <w:noProof/>
                 <w:webHidden/>
               </w:rPr>
-              <w:t>12</w:t>
+              <w:t>13</w:t>
             </w:r>
             <w:r>
               <w:rPr>
@@ -2474,7 +2474,7 @@
               <w:lang w:eastAsia="ru-RU"/>
             </w:rPr>
           </w:pPr>
-          <w:hyperlink w:anchor="_Toc230365373" w:history="1">
+          <w:hyperlink w:anchor="_Toc230367742" w:history="1">
             <w:r>
               <w:rPr>
                 <w:rStyle w:val="af1"/>
@@ -2505,7 +2505,7 @@
                 <w:noProof/>
                 <w:webHidden/>
               </w:rPr>
-              <w:instrText xml:space="preserve"> PAGEREF _Toc230365373 \h </w:instrText>
+              <w:instrText xml:space="preserve"> PAGEREF _Toc230367742 \h </w:instrText>
             </w:r>
             <w:r>
               <w:rPr>
@@ -2528,7 +2528,7 @@
                 <w:noProof/>
                 <w:webHidden/>
               </w:rPr>
-              <w:t>13</w:t>
+              <w:t>14</w:t>
             </w:r>
             <w:r>
               <w:rPr>
@@ -2552,7 +2552,7 @@
               <w:lang w:eastAsia="ru-RU"/>
             </w:rPr>
           </w:pPr>
-          <w:hyperlink w:anchor="_Toc230365374" w:history="1">
+          <w:hyperlink w:anchor="_Toc230367743" w:history="1">
             <w:r>
               <w:rPr>
                 <w:rStyle w:val="af1"/>
@@ -2583,7 +2583,7 @@
                 <w:noProof/>
                 <w:webHidden/>
               </w:rPr>
-              <w:instrText xml:space="preserve"> PAGEREF _Toc230365374 \h </w:instrText>
+              <w:instrText xml:space="preserve"> PAGEREF _Toc230367743 \h </w:instrText>
             </w:r>
             <w:r>
               <w:rPr>
@@ -2606,7 +2606,7 @@
                 <w:noProof/>
                 <w:webHidden/>
               </w:rPr>
-              <w:t>13</w:t>
+              <w:t>14</w:t>
             </w:r>
             <w:r>
               <w:rPr>
@@ -2630,7 +2630,7 @@
               <w:lang w:eastAsia="ru-RU"/>
             </w:rPr>
           </w:pPr>
-          <w:hyperlink w:anchor="_Toc230365375" w:history="1">
+          <w:hyperlink w:anchor="_Toc230367744" w:history="1">
             <w:r>
               <w:rPr>
                 <w:rStyle w:val="af1"/>
@@ -2661,7 +2661,7 @@
                 <w:noProof/>
                 <w:webHidden/>
               </w:rPr>
-              <w:instrText xml:space="preserve"> PAGEREF _Toc230365375 \h </w:instrText>
+              <w:instrText xml:space="preserve"> PAGEREF _Toc230367744 \h </w:instrText>
             </w:r>
             <w:r>
               <w:rPr>
@@ -2684,7 +2684,7 @@
                 <w:noProof/>
                 <w:webHidden/>
               </w:rPr>
-              <w:t>13</w:t>
+              <w:t>14</w:t>
             </w:r>
             <w:r>
               <w:rPr>
@@ -2708,7 +2708,7 @@
               <w:lang w:eastAsia="ru-RU"/>
             </w:rPr>
           </w:pPr>
-          <w:hyperlink w:anchor="_Toc230365376" w:history="1">
+          <w:hyperlink w:anchor="_Toc230367745" w:history="1">
             <w:r>
               <w:rPr>
                 <w:rStyle w:val="af1"/>
@@ -2739,7 +2739,7 @@
                 <w:noProof/>
                 <w:webHidden/>
               </w:rPr>
-              <w:instrText xml:space="preserve"> PAGEREF _Toc230365376 \h </w:instrText>
+              <w:instrText xml:space="preserve"> PAGEREF _Toc230367745 \h </w:instrText>
             </w:r>
             <w:r>
               <w:rPr>
@@ -2762,7 +2762,7 @@
                 <w:noProof/>
                 <w:webHidden/>
               </w:rPr>
-              <w:t>13</w:t>
+              <w:t>14</w:t>
             </w:r>
             <w:r>
               <w:rPr>
@@ -2786,7 +2786,7 @@
               <w:lang w:eastAsia="ru-RU"/>
             </w:rPr>
           </w:pPr>
-          <w:hyperlink w:anchor="_Toc230365377" w:history="1">
+          <w:hyperlink w:anchor="_Toc230367746" w:history="1">
             <w:r>
               <w:rPr>
                 <w:rStyle w:val="af1"/>
@@ -2817,7 +2817,7 @@
                 <w:noProof/>
                 <w:webHidden/>
               </w:rPr>
-              <w:instrText xml:space="preserve"> PAGEREF _Toc230365377 \h </w:instrText>
+              <w:instrText xml:space="preserve"> PAGEREF _Toc230367746 \h </w:instrText>
             </w:r>
             <w:r>
               <w:rPr>
@@ -2840,7 +2840,7 @@
                 <w:noProof/>
                 <w:webHidden/>
               </w:rPr>
-              <w:t>14</w:t>
+              <w:t>15</w:t>
             </w:r>
             <w:r>
               <w:rPr>
@@ -2864,7 +2864,7 @@
               <w:lang w:eastAsia="ru-RU"/>
             </w:rPr>
           </w:pPr>
-          <w:hyperlink w:anchor="_Toc230365378" w:history="1">
+          <w:hyperlink w:anchor="_Toc230367747" w:history="1">
             <w:r>
               <w:rPr>
                 <w:rStyle w:val="af1"/>
@@ -2895,7 +2895,7 @@
                 <w:noProof/>
                 <w:webHidden/>
               </w:rPr>
-              <w:instrText xml:space="preserve"> PAGEREF _Toc230365378 \h </w:instrText>
+              <w:instrText xml:space="preserve"> PAGEREF _Toc230367747 \h </w:instrText>
             </w:r>
             <w:r>
               <w:rPr>
@@ -2918,7 +2918,7 @@
                 <w:noProof/>
                 <w:webHidden/>
               </w:rPr>
-              <w:t>14</w:t>
+              <w:t>15</w:t>
             </w:r>
             <w:r>
               <w:rPr>
@@ -2942,7 +2942,7 @@
               <w:lang w:eastAsia="ru-RU"/>
             </w:rPr>
           </w:pPr>
-          <w:hyperlink w:anchor="_Toc230365379" w:history="1">
+          <w:hyperlink w:anchor="_Toc230367748" w:history="1">
             <w:r>
               <w:rPr>
                 <w:rStyle w:val="af1"/>
@@ -2973,7 +2973,7 @@
                 <w:noProof/>
                 <w:webHidden/>
               </w:rPr>
-              <w:instrText xml:space="preserve"> PAGEREF _Toc230365379 \h </w:instrText>
+              <w:instrText xml:space="preserve"> PAGEREF _Toc230367748 \h </w:instrText>
             </w:r>
             <w:r>
               <w:rPr>
@@ -2996,7 +2996,7 @@
                 <w:noProof/>
                 <w:webHidden/>
               </w:rPr>
-              <w:t>15</w:t>
+              <w:t>16</w:t>
             </w:r>
             <w:r>
               <w:rPr>
@@ -3020,7 +3020,7 @@
               <w:lang w:eastAsia="ru-RU"/>
             </w:rPr>
           </w:pPr>
-          <w:hyperlink w:anchor="_Toc230365380" w:history="1">
+          <w:hyperlink w:anchor="_Toc230367749" w:history="1">
             <w:r>
               <w:rPr>
                 <w:rStyle w:val="af1"/>
@@ -3051,7 +3051,7 @@
                 <w:noProof/>
                 <w:webHidden/>
               </w:rPr>
-              <w:instrText xml:space="preserve"> PAGEREF _Toc230365380 \h </w:instrText>
+              <w:instrText xml:space="preserve"> PAGEREF _Toc230367749 \h </w:instrText>
             </w:r>
             <w:r>
               <w:rPr>
@@ -3074,7 +3074,7 @@
                 <w:noProof/>
                 <w:webHidden/>
               </w:rPr>
-              <w:t>15</w:t>
+              <w:t>16</w:t>
             </w:r>
             <w:r>
               <w:rPr>
@@ -3098,7 +3098,7 @@
               <w:lang w:eastAsia="ru-RU"/>
             </w:rPr>
           </w:pPr>
-          <w:hyperlink w:anchor="_Toc230365381" w:history="1">
+          <w:hyperlink w:anchor="_Toc230367750" w:history="1">
             <w:r>
               <w:rPr>
                 <w:rStyle w:val="af1"/>
@@ -3129,7 +3129,7 @@
                 <w:noProof/>
                 <w:webHidden/>
               </w:rPr>
-              <w:instrText xml:space="preserve"> PAGEREF _Toc230365381 \h </w:instrText>
+              <w:instrText xml:space="preserve"> PAGEREF _Toc230367750 \h </w:instrText>
             </w:r>
             <w:r>
               <w:rPr>
@@ -3152,7 +3152,7 @@
                 <w:noProof/>
                 <w:webHidden/>
               </w:rPr>
-              <w:t>15</w:t>
+              <w:t>16</w:t>
             </w:r>
             <w:r>
               <w:rPr>
@@ -3176,7 +3176,7 @@
               <w:lang w:eastAsia="ru-RU"/>
             </w:rPr>
           </w:pPr>
-          <w:hyperlink w:anchor="_Toc230365382" w:history="1">
+          <w:hyperlink w:anchor="_Toc230367751" w:history="1">
             <w:r>
               <w:rPr>
                 <w:rStyle w:val="af1"/>
@@ -3207,7 +3207,7 @@
                 <w:noProof/>
                 <w:webHidden/>
               </w:rPr>
-              <w:instrText xml:space="preserve"> PAGEREF _Toc230365382 \h </w:instrText>
+              <w:instrText xml:space="preserve"> PAGEREF _Toc230367751 \h </w:instrText>
             </w:r>
             <w:r>
               <w:rPr>
@@ -3230,7 +3230,7 @@
                 <w:noProof/>
                 <w:webHidden/>
               </w:rPr>
-              <w:t>15</w:t>
+              <w:t>16</w:t>
             </w:r>
             <w:r>
               <w:rPr>
@@ -3254,31 +3254,14 @@
               <w:lang w:eastAsia="ru-RU"/>
             </w:rPr>
           </w:pPr>
-          <w:hyperlink w:anchor="_Toc230365383" w:history="1">
+          <w:hyperlink w:anchor="_Toc230367752" w:history="1">
             <w:r>
               <w:rPr>
                 <w:rStyle w:val="af1"/>
                 <w:rFonts w:ascii="Times New Roman" w:hAnsi="Times New Roman" w:cs="Times New Roman"/>
                 <w:noProof/>
               </w:rPr>
-              <w:t>2.</w:t>
-            </w:r>
-            <w:r>
-              <w:rPr>
-                <w:rStyle w:val="af1"/>
-                <w:rFonts w:ascii="Times New Roman" w:hAnsi="Times New Roman" w:cs="Times New Roman"/>
-                <w:noProof/>
-                <w:lang w:val="en-US"/>
-              </w:rPr>
-              <w:t>6</w:t>
-            </w:r>
-            <w:r>
-              <w:rPr>
-                <w:rStyle w:val="af1"/>
-                <w:rFonts w:ascii="Times New Roman" w:hAnsi="Times New Roman" w:cs="Times New Roman"/>
-                <w:noProof/>
-              </w:rPr>
-              <w:t>.3 Результаты внедрения</w:t>
+              <w:t>2.6.3 Результаты внедрения</w:t>
             </w:r>
             <w:r>
               <w:rPr>
@@ -3302,7 +3285,7 @@
                 <w:noProof/>
                 <w:webHidden/>
               </w:rPr>
-              <w:instrText xml:space="preserve"> PAGEREF _Toc230365383 \h </w:instrText>
+              <w:instrText xml:space="preserve"> PAGEREF _Toc230367752 \h </w:instrText>
             </w:r>
             <w:r>
               <w:rPr>
@@ -3325,7 +3308,7 @@
                 <w:noProof/>
                 <w:webHidden/>
               </w:rPr>
-              <w:t>16</w:t>
+              <w:t>17</w:t>
             </w:r>
             <w:r>
               <w:rPr>
@@ -3349,7 +3332,7 @@
               <w:lang w:eastAsia="ru-RU"/>
             </w:rPr>
           </w:pPr>
-          <w:hyperlink w:anchor="_Toc230365384" w:history="1">
+          <w:hyperlink w:anchor="_Toc230367753" w:history="1">
             <w:r>
               <w:rPr>
                 <w:rStyle w:val="af1"/>
@@ -3380,7 +3363,7 @@
                 <w:noProof/>
                 <w:webHidden/>
               </w:rPr>
-              <w:instrText xml:space="preserve"> PAGEREF _Toc230365384 \h </w:instrText>
+              <w:instrText xml:space="preserve"> PAGEREF _Toc230367753 \h </w:instrText>
             </w:r>
             <w:r>
               <w:rPr>
@@ -3403,7 +3386,7 @@
                 <w:noProof/>
                 <w:webHidden/>
               </w:rPr>
-              <w:t>16</w:t>
+              <w:t>17</w:t>
             </w:r>
             <w:r>
               <w:rPr>
@@ -3427,7 +3410,7 @@
               <w:lang w:eastAsia="ru-RU"/>
             </w:rPr>
           </w:pPr>
-          <w:hyperlink w:anchor="_Toc230365385" w:history="1">
+          <w:hyperlink w:anchor="_Toc230367754" w:history="1">
             <w:r>
               <w:rPr>
                 <w:rStyle w:val="af1"/>
@@ -3458,7 +3441,7 @@
                 <w:noProof/>
                 <w:webHidden/>
               </w:rPr>
-              <w:instrText xml:space="preserve"> PAGEREF _Toc230365385 \h </w:instrText>
+              <w:instrText xml:space="preserve"> PAGEREF _Toc230367754 \h </w:instrText>
             </w:r>
             <w:r>
               <w:rPr>
@@ -3481,7 +3464,7 @@
                 <w:noProof/>
                 <w:webHidden/>
               </w:rPr>
-              <w:t>16</w:t>
+              <w:t>17</w:t>
             </w:r>
             <w:r>
               <w:rPr>
@@ -3505,7 +3488,7 @@
               <w:lang w:eastAsia="ru-RU"/>
             </w:rPr>
           </w:pPr>
-          <w:hyperlink w:anchor="_Toc230365386" w:history="1">
+          <w:hyperlink w:anchor="_Toc230367755" w:history="1">
             <w:r>
               <w:rPr>
                 <w:rStyle w:val="af1"/>
@@ -3536,7 +3519,7 @@
                 <w:noProof/>
                 <w:webHidden/>
               </w:rPr>
-              <w:instrText xml:space="preserve"> PAGEREF _Toc230365386 \h </w:instrText>
+              <w:instrText xml:space="preserve"> PAGEREF _Toc230367755 \h </w:instrText>
             </w:r>
             <w:r>
               <w:rPr>
@@ -3559,7 +3542,7 @@
                 <w:noProof/>
                 <w:webHidden/>
               </w:rPr>
-              <w:t>17</w:t>
+              <w:t>18</w:t>
             </w:r>
             <w:r>
               <w:rPr>
@@ -3583,7 +3566,7 @@
               <w:lang w:eastAsia="ru-RU"/>
             </w:rPr>
           </w:pPr>
-          <w:hyperlink w:anchor="_Toc230365387" w:history="1">
+          <w:hyperlink w:anchor="_Toc230367756" w:history="1">
             <w:r>
               <w:rPr>
                 <w:rStyle w:val="af1"/>
@@ -3614,7 +3597,7 @@
                 <w:noProof/>
                 <w:webHidden/>
               </w:rPr>
-              <w:instrText xml:space="preserve"> PAGEREF _Toc230365387 \h </w:instrText>
+              <w:instrText xml:space="preserve"> PAGEREF _Toc230367756 \h </w:instrText>
             </w:r>
             <w:r>
               <w:rPr>
@@ -3637,7 +3620,7 @@
                 <w:noProof/>
                 <w:webHidden/>
               </w:rPr>
-              <w:t>18</w:t>
+              <w:t>19</w:t>
             </w:r>
             <w:r>
               <w:rPr>
@@ -3661,7 +3644,7 @@
               <w:lang w:eastAsia="ru-RU"/>
             </w:rPr>
           </w:pPr>
-          <w:hyperlink w:anchor="_Toc230365388" w:history="1">
+          <w:hyperlink w:anchor="_Toc230367757" w:history="1">
             <w:r>
               <w:rPr>
                 <w:rStyle w:val="af1"/>
@@ -3692,7 +3675,7 @@
                 <w:noProof/>
                 <w:webHidden/>
               </w:rPr>
-              <w:instrText xml:space="preserve"> PAGEREF _Toc230365388 \h </w:instrText>
+              <w:instrText xml:space="preserve"> PAGEREF _Toc230367757 \h </w:instrText>
             </w:r>
             <w:r>
               <w:rPr>
@@ -3715,7 +3698,7 @@
                 <w:noProof/>
                 <w:webHidden/>
               </w:rPr>
-              <w:t>19</w:t>
+              <w:t>20</w:t>
             </w:r>
             <w:r>
               <w:rPr>
@@ -3739,7 +3722,7 @@
               <w:lang w:eastAsia="ru-RU"/>
             </w:rPr>
           </w:pPr>
-          <w:hyperlink w:anchor="_Toc230365389" w:history="1">
+          <w:hyperlink w:anchor="_Toc230367758" w:history="1">
             <w:r>
               <w:rPr>
                 <w:rStyle w:val="af1"/>
@@ -3770,7 +3753,7 @@
                 <w:noProof/>
                 <w:webHidden/>
               </w:rPr>
-              <w:instrText xml:space="preserve"> PAGEREF _Toc230365389 \h </w:instrText>
+              <w:instrText xml:space="preserve"> PAGEREF _Toc230367758 \h </w:instrText>
             </w:r>
             <w:r>
               <w:rPr>
@@ -3793,7 +3776,7 @@
                 <w:noProof/>
                 <w:webHidden/>
               </w:rPr>
-              <w:t>19</w:t>
+              <w:t>20</w:t>
             </w:r>
             <w:r>
               <w:rPr>
@@ -3817,7 +3800,7 @@
               <w:lang w:eastAsia="ru-RU"/>
             </w:rPr>
           </w:pPr>
-          <w:hyperlink w:anchor="_Toc230365390" w:history="1">
+          <w:hyperlink w:anchor="_Toc230367759" w:history="1">
             <w:r>
               <w:rPr>
                 <w:rStyle w:val="af1"/>
@@ -3848,7 +3831,7 @@
                 <w:noProof/>
                 <w:webHidden/>
               </w:rPr>
-              <w:instrText xml:space="preserve"> PAGEREF _Toc230365390 \h </w:instrText>
+              <w:instrText xml:space="preserve"> PAGEREF _Toc230367759 \h </w:instrText>
             </w:r>
             <w:r>
               <w:rPr>
@@ -3871,7 +3854,7 @@
                 <w:noProof/>
                 <w:webHidden/>
               </w:rPr>
-              <w:t>19</w:t>
+              <w:t>20</w:t>
             </w:r>
             <w:r>
               <w:rPr>
@@ -3895,7 +3878,7 @@
               <w:lang w:eastAsia="ru-RU"/>
             </w:rPr>
           </w:pPr>
-          <w:hyperlink w:anchor="_Toc230365391" w:history="1">
+          <w:hyperlink w:anchor="_Toc230367760" w:history="1">
             <w:r>
               <w:rPr>
                 <w:rStyle w:val="af1"/>
@@ -3926,7 +3909,7 @@
                 <w:noProof/>
                 <w:webHidden/>
               </w:rPr>
-              <w:instrText xml:space="preserve"> PAGEREF _Toc230365391 \h </w:instrText>
+              <w:instrText xml:space="preserve"> PAGEREF _Toc230367760 \h </w:instrText>
             </w:r>
             <w:r>
               <w:rPr>
@@ -3949,7 +3932,7 @@
                 <w:noProof/>
                 <w:webHidden/>
               </w:rPr>
-              <w:t>19</w:t>
+              <w:t>20</w:t>
             </w:r>
             <w:r>
               <w:rPr>
@@ -3973,7 +3956,7 @@
               <w:lang w:eastAsia="ru-RU"/>
             </w:rPr>
           </w:pPr>
-          <w:hyperlink w:anchor="_Toc230365392" w:history="1">
+          <w:hyperlink w:anchor="_Toc230367761" w:history="1">
             <w:r>
               <w:rPr>
                 <w:rStyle w:val="af1"/>
@@ -4004,7 +3987,7 @@
                 <w:noProof/>
                 <w:webHidden/>
               </w:rPr>
-              <w:instrText xml:space="preserve"> PAGEREF _Toc230365392 \h </w:instrText>
+              <w:instrText xml:space="preserve"> PAGEREF _Toc230367761 \h </w:instrText>
             </w:r>
             <w:r>
               <w:rPr>
@@ -4027,7 +4010,7 @@
                 <w:noProof/>
                 <w:webHidden/>
               </w:rPr>
-              <w:t>20</w:t>
+              <w:t>21</w:t>
             </w:r>
             <w:r>
               <w:rPr>
@@ -4051,7 +4034,7 @@
               <w:lang w:eastAsia="ru-RU"/>
             </w:rPr>
           </w:pPr>
-          <w:hyperlink w:anchor="_Toc230365393" w:history="1">
+          <w:hyperlink w:anchor="_Toc230367762" w:history="1">
             <w:r>
               <w:rPr>
                 <w:rStyle w:val="af1"/>
@@ -4082,7 +4065,7 @@
                 <w:noProof/>
                 <w:webHidden/>
               </w:rPr>
-              <w:instrText xml:space="preserve"> PAGEREF _Toc230365393 \h </w:instrText>
+              <w:instrText xml:space="preserve"> PAGEREF _Toc230367762 \h </w:instrText>
             </w:r>
             <w:r>
               <w:rPr>
@@ -4105,7 +4088,7 @@
                 <w:noProof/>
                 <w:webHidden/>
               </w:rPr>
-              <w:t>20</w:t>
+              <w:t>21</w:t>
             </w:r>
             <w:r>
               <w:rPr>
@@ -4129,7 +4112,7 @@
               <w:lang w:eastAsia="ru-RU"/>
             </w:rPr>
           </w:pPr>
-          <w:hyperlink w:anchor="_Toc230365394" w:history="1">
+          <w:hyperlink w:anchor="_Toc230367763" w:history="1">
             <w:r>
               <w:rPr>
                 <w:rStyle w:val="af1"/>
@@ -4160,7 +4143,7 @@
                 <w:noProof/>
                 <w:webHidden/>
               </w:rPr>
-              <w:instrText xml:space="preserve"> PAGEREF _Toc230365394 \h </w:instrText>
+              <w:instrText xml:space="preserve"> PAGEREF _Toc230367763 \h </w:instrText>
             </w:r>
             <w:r>
               <w:rPr>
@@ -4183,7 +4166,7 @@
                 <w:noProof/>
                 <w:webHidden/>
               </w:rPr>
-              <w:t>20</w:t>
+              <w:t>21</w:t>
             </w:r>
             <w:r>
               <w:rPr>
@@ -4207,31 +4190,14 @@
               <w:lang w:eastAsia="ru-RU"/>
             </w:rPr>
           </w:pPr>
-          <w:hyperlink w:anchor="_Toc230365395" w:history="1">
+          <w:hyperlink w:anchor="_Toc230367764" w:history="1">
             <w:r>
               <w:rPr>
                 <w:rStyle w:val="af1"/>
                 <w:rFonts w:ascii="Times New Roman" w:hAnsi="Times New Roman" w:cs="Times New Roman"/>
                 <w:noProof/>
               </w:rPr>
-              <w:t>2.</w:t>
-            </w:r>
-            <w:r>
-              <w:rPr>
-                <w:rStyle w:val="af1"/>
-                <w:rFonts w:ascii="Times New Roman" w:hAnsi="Times New Roman" w:cs="Times New Roman"/>
-                <w:noProof/>
-                <w:lang w:val="en-US"/>
-              </w:rPr>
-              <w:t>9</w:t>
-            </w:r>
-            <w:r>
-              <w:rPr>
-                <w:rStyle w:val="af1"/>
-                <w:rFonts w:ascii="Times New Roman" w:hAnsi="Times New Roman" w:cs="Times New Roman"/>
-                <w:noProof/>
-              </w:rPr>
-              <w:t>.3 Результаты внедрения</w:t>
+              <w:t>2.9.3 Результаты внедрения</w:t>
             </w:r>
             <w:r>
               <w:rPr>
@@ -4255,7 +4221,7 @@
                 <w:noProof/>
                 <w:webHidden/>
               </w:rPr>
-              <w:instrText xml:space="preserve"> PAGEREF _Toc230365395 \h </w:instrText>
+              <w:instrText xml:space="preserve"> PAGEREF _Toc230367764 \h </w:instrText>
             </w:r>
             <w:r>
               <w:rPr>
@@ -4278,7 +4244,7 @@
                 <w:noProof/>
                 <w:webHidden/>
               </w:rPr>
-              <w:t>21</w:t>
+              <w:t>22</w:t>
             </w:r>
             <w:r>
               <w:rPr>
@@ -4302,7 +4268,7 @@
               <w:lang w:eastAsia="ru-RU"/>
             </w:rPr>
           </w:pPr>
-          <w:hyperlink w:anchor="_Toc230365396" w:history="1">
+          <w:hyperlink w:anchor="_Toc230367765" w:history="1">
             <w:r>
               <w:rPr>
                 <w:rStyle w:val="af1"/>
@@ -4333,7 +4299,7 @@
                 <w:noProof/>
                 <w:webHidden/>
               </w:rPr>
-              <w:instrText xml:space="preserve"> PAGEREF _Toc230365396 \h </w:instrText>
+              <w:instrText xml:space="preserve"> PAGEREF _Toc230367765 \h </w:instrText>
             </w:r>
             <w:r>
               <w:rPr>
@@ -4356,7 +4322,7 @@
                 <w:noProof/>
                 <w:webHidden/>
               </w:rPr>
-              <w:t>21</w:t>
+              <w:t>22</w:t>
             </w:r>
             <w:r>
               <w:rPr>
@@ -4380,7 +4346,7 @@
               <w:lang w:eastAsia="ru-RU"/>
             </w:rPr>
           </w:pPr>
-          <w:hyperlink w:anchor="_Toc230365397" w:history="1">
+          <w:hyperlink w:anchor="_Toc230367766" w:history="1">
             <w:r>
               <w:rPr>
                 <w:rStyle w:val="af1"/>
@@ -4411,7 +4377,7 @@
                 <w:noProof/>
                 <w:webHidden/>
               </w:rPr>
-              <w:instrText xml:space="preserve"> PAGEREF _Toc230365397 \h </w:instrText>
+              <w:instrText xml:space="preserve"> PAGEREF _Toc230367766 \h </w:instrText>
             </w:r>
             <w:r>
               <w:rPr>
@@ -4434,7 +4400,7 @@
                 <w:noProof/>
                 <w:webHidden/>
               </w:rPr>
-              <w:t>21</w:t>
+              <w:t>22</w:t>
             </w:r>
             <w:r>
               <w:rPr>
@@ -4458,7 +4424,7 @@
               <w:lang w:eastAsia="ru-RU"/>
             </w:rPr>
           </w:pPr>
-          <w:hyperlink w:anchor="_Toc230365398" w:history="1">
+          <w:hyperlink w:anchor="_Toc230367767" w:history="1">
             <w:r>
               <w:rPr>
                 <w:rStyle w:val="af1"/>
@@ -4489,7 +4455,7 @@
                 <w:noProof/>
                 <w:webHidden/>
               </w:rPr>
-              <w:instrText xml:space="preserve"> PAGEREF _Toc230365398 \h </w:instrText>
+              <w:instrText xml:space="preserve"> PAGEREF _Toc230367767 \h </w:instrText>
             </w:r>
             <w:r>
               <w:rPr>
@@ -4512,7 +4478,7 @@
                 <w:noProof/>
                 <w:webHidden/>
               </w:rPr>
-              <w:t>22</w:t>
+              <w:t>23</w:t>
             </w:r>
             <w:r>
               <w:rPr>
@@ -4536,31 +4502,14 @@
               <w:lang w:eastAsia="ru-RU"/>
             </w:rPr>
           </w:pPr>
-          <w:hyperlink w:anchor="_Toc230365399" w:history="1">
+          <w:hyperlink w:anchor="_Toc230367768" w:history="1">
             <w:r>
               <w:rPr>
                 <w:rStyle w:val="af1"/>
                 <w:rFonts w:ascii="Times New Roman" w:hAnsi="Times New Roman" w:cs="Times New Roman"/>
                 <w:noProof/>
               </w:rPr>
-              <w:t>2.</w:t>
-            </w:r>
-            <w:r>
-              <w:rPr>
-                <w:rStyle w:val="af1"/>
-                <w:rFonts w:ascii="Times New Roman" w:hAnsi="Times New Roman" w:cs="Times New Roman"/>
-                <w:noProof/>
-                <w:lang w:val="en-US"/>
-              </w:rPr>
-              <w:t>10</w:t>
-            </w:r>
-            <w:r>
-              <w:rPr>
-                <w:rStyle w:val="af1"/>
-                <w:rFonts w:ascii="Times New Roman" w:hAnsi="Times New Roman" w:cs="Times New Roman"/>
-                <w:noProof/>
-              </w:rPr>
-              <w:t>.3 Результаты внедрения</w:t>
+              <w:t>2.10.3 Результаты внедрения</w:t>
             </w:r>
             <w:r>
               <w:rPr>
@@ -4584,7 +4533,7 @@
                 <w:noProof/>
                 <w:webHidden/>
               </w:rPr>
-              <w:instrText xml:space="preserve"> PAGEREF _Toc230365399 \h </w:instrText>
+              <w:instrText xml:space="preserve"> PAGEREF _Toc230367768 \h </w:instrText>
             </w:r>
             <w:r>
               <w:rPr>
@@ -4607,7 +4556,7 @@
                 <w:noProof/>
                 <w:webHidden/>
               </w:rPr>
-              <w:t>22</w:t>
+              <w:t>23</w:t>
             </w:r>
             <w:r>
               <w:rPr>
@@ -4631,7 +4580,7 @@
               <w:lang w:eastAsia="ru-RU"/>
             </w:rPr>
           </w:pPr>
-          <w:hyperlink w:anchor="_Toc230365400" w:history="1">
+          <w:hyperlink w:anchor="_Toc230367769" w:history="1">
             <w:r>
               <w:rPr>
                 <w:rStyle w:val="af1"/>
@@ -4662,7 +4611,7 @@
                 <w:noProof/>
                 <w:webHidden/>
               </w:rPr>
-              <w:instrText xml:space="preserve"> PAGEREF _Toc230365400 \h </w:instrText>
+              <w:instrText xml:space="preserve"> PAGEREF _Toc230367769 \h </w:instrText>
             </w:r>
             <w:r>
               <w:rPr>
@@ -4685,7 +4634,7 @@
                 <w:noProof/>
                 <w:webHidden/>
               </w:rPr>
-              <w:t>22</w:t>
+              <w:t>23</w:t>
             </w:r>
             <w:r>
               <w:rPr>
@@ -4709,57 +4658,14 @@
               <w:lang w:eastAsia="ru-RU"/>
             </w:rPr>
           </w:pPr>
-          <w:hyperlink w:anchor="_Toc230365401" w:history="1">
+          <w:hyperlink w:anchor="_Toc230367770" w:history="1">
             <w:r>
               <w:rPr>
                 <w:rStyle w:val="af1"/>
                 <w:rFonts w:ascii="Times New Roman" w:hAnsi="Times New Roman" w:cs="Times New Roman"/>
                 <w:noProof/>
-                <w:lang w:val="en-US"/>
-              </w:rPr>
-              <w:t>2.</w:t>
-            </w:r>
-            <w:r>
-              <w:rPr>
-                <w:rStyle w:val="af1"/>
-                <w:rFonts w:ascii="Times New Roman" w:hAnsi="Times New Roman" w:cs="Times New Roman"/>
-                <w:noProof/>
-              </w:rPr>
-              <w:t>1</w:t>
-            </w:r>
-            <w:r>
-              <w:rPr>
-                <w:rStyle w:val="af1"/>
-                <w:rFonts w:ascii="Times New Roman" w:hAnsi="Times New Roman" w:cs="Times New Roman"/>
-                <w:noProof/>
-                <w:lang w:val="en-US"/>
-              </w:rPr>
-              <w:t>1</w:t>
-            </w:r>
-            <w:r>
-              <w:rPr>
-                <w:rStyle w:val="af1"/>
-                <w:rFonts w:ascii="Times New Roman" w:hAnsi="Times New Roman" w:cs="Times New Roman"/>
-                <w:noProof/>
-              </w:rPr>
-              <w:t>.</w:t>
-            </w:r>
-            <w:r>
-              <w:rPr>
-                <w:rStyle w:val="af1"/>
-                <w:rFonts w:ascii="Times New Roman" w:hAnsi="Times New Roman" w:cs="Times New Roman"/>
-                <w:noProof/>
-                <w:lang w:val="en-US"/>
-              </w:rPr>
-              <w:t>1</w:t>
-            </w:r>
-            <w:r>
-              <w:rPr>
-                <w:rStyle w:val="af1"/>
-                <w:rFonts w:ascii="Times New Roman" w:hAnsi="Times New Roman" w:cs="Times New Roman"/>
-                <w:noProof/>
-              </w:rPr>
-              <w:t xml:space="preserve"> Постановка задачи</w:t>
+              </w:rPr>
+              <w:t>2.11.1 Постановка задачи</w:t>
             </w:r>
             <w:r>
               <w:rPr>
@@ -4783,7 +4689,7 @@
                 <w:noProof/>
                 <w:webHidden/>
               </w:rPr>
-              <w:instrText xml:space="preserve"> PAGEREF _Toc230365401 \h </w:instrText>
+              <w:instrText xml:space="preserve"> PAGEREF _Toc230367770 \h </w:instrText>
             </w:r>
             <w:r>
               <w:rPr>
@@ -4806,7 +4712,7 @@
                 <w:noProof/>
                 <w:webHidden/>
               </w:rPr>
-              <w:t>22</w:t>
+              <w:t>23</w:t>
             </w:r>
             <w:r>
               <w:rPr>
@@ -4830,23 +4736,14 @@
               <w:lang w:eastAsia="ru-RU"/>
             </w:rPr>
           </w:pPr>
-          <w:hyperlink w:anchor="_Toc230365402" w:history="1">
+          <w:hyperlink w:anchor="_Toc230367771" w:history="1">
             <w:r>
               <w:rPr>
                 <w:rStyle w:val="af1"/>
                 <w:rFonts w:ascii="Times New Roman" w:hAnsi="Times New Roman" w:cs="Times New Roman"/>
                 <w:noProof/>
-                <w:lang w:val="en-US"/>
-              </w:rPr>
-              <w:t xml:space="preserve">2.11.2 </w:t>
-            </w:r>
-            <w:r>
-              <w:rPr>
-                <w:rStyle w:val="af1"/>
-                <w:rFonts w:ascii="Times New Roman" w:hAnsi="Times New Roman" w:cs="Times New Roman"/>
-                <w:noProof/>
-              </w:rPr>
-              <w:t>Реализованное решение</w:t>
+              </w:rPr>
+              <w:t>2.11.2 Реализованное решение</w:t>
             </w:r>
             <w:r>
               <w:rPr>
@@ -4870,7 +4767,7 @@
                 <w:noProof/>
                 <w:webHidden/>
               </w:rPr>
-              <w:instrText xml:space="preserve"> PAGEREF _Toc230365402 \h </w:instrText>
+              <w:instrText xml:space="preserve"> PAGEREF _Toc230367771 \h </w:instrText>
             </w:r>
             <w:r>
               <w:rPr>
@@ -4893,7 +4790,7 @@
                 <w:noProof/>
                 <w:webHidden/>
               </w:rPr>
-              <w:t>23</w:t>
+              <w:t>24</w:t>
             </w:r>
             <w:r>
               <w:rPr>
@@ -4917,7 +4814,7 @@
               <w:lang w:eastAsia="ru-RU"/>
             </w:rPr>
           </w:pPr>
-          <w:hyperlink w:anchor="_Toc230365403" w:history="1">
+          <w:hyperlink w:anchor="_Toc230367772" w:history="1">
             <w:r>
               <w:rPr>
                 <w:rStyle w:val="af1"/>
@@ -4948,7 +4845,7 @@
                 <w:noProof/>
                 <w:webHidden/>
               </w:rPr>
-              <w:instrText xml:space="preserve"> PAGEREF _Toc230365403 \h </w:instrText>
+              <w:instrText xml:space="preserve"> PAGEREF _Toc230367772 \h </w:instrText>
             </w:r>
             <w:r>
               <w:rPr>
@@ -4971,7 +4868,7 @@
                 <w:noProof/>
                 <w:webHidden/>
               </w:rPr>
-              <w:t>24</w:t>
+              <w:t>25</w:t>
             </w:r>
             <w:r>
               <w:rPr>
@@ -4995,7 +4892,7 @@
               <w:lang w:eastAsia="ru-RU"/>
             </w:rPr>
           </w:pPr>
-          <w:hyperlink w:anchor="_Toc230365404" w:history="1">
+          <w:hyperlink w:anchor="_Toc230367773" w:history="1">
             <w:r>
               <w:rPr>
                 <w:rStyle w:val="af1"/>
@@ -5026,7 +4923,7 @@
                 <w:noProof/>
                 <w:webHidden/>
               </w:rPr>
-              <w:instrText xml:space="preserve"> PAGEREF _Toc230365404 \h </w:instrText>
+              <w:instrText xml:space="preserve"> PAGEREF _Toc230367773 \h </w:instrText>
             </w:r>
             <w:r>
               <w:rPr>
@@ -5049,7 +4946,7 @@
                 <w:noProof/>
                 <w:webHidden/>
               </w:rPr>
-              <w:t>24</w:t>
+              <w:t>25</w:t>
             </w:r>
             <w:r>
               <w:rPr>
@@ -5073,7 +4970,7 @@
               <w:lang w:eastAsia="ru-RU"/>
             </w:rPr>
           </w:pPr>
-          <w:hyperlink w:anchor="_Toc230365405" w:history="1">
+          <w:hyperlink w:anchor="_Toc230367774" w:history="1">
             <w:r>
               <w:rPr>
                 <w:rStyle w:val="af1"/>
@@ -5104,7 +5001,7 @@
                 <w:noProof/>
                 <w:webHidden/>
               </w:rPr>
-              <w:instrText xml:space="preserve"> PAGEREF _Toc230365405 \h </w:instrText>
+              <w:instrText xml:space="preserve"> PAGEREF _Toc230367774 \h </w:instrText>
             </w:r>
             <w:r>
               <w:rPr>
@@ -5127,7 +5024,7 @@
                 <w:noProof/>
                 <w:webHidden/>
               </w:rPr>
-              <w:t>24</w:t>
+              <w:t>25</w:t>
             </w:r>
             <w:r>
               <w:rPr>
@@ -5151,31 +5048,14 @@
               <w:lang w:eastAsia="ru-RU"/>
             </w:rPr>
           </w:pPr>
-          <w:hyperlink w:anchor="_Toc230365406" w:history="1">
+          <w:hyperlink w:anchor="_Toc230367775" w:history="1">
             <w:r>
               <w:rPr>
                 <w:rStyle w:val="af1"/>
                 <w:rFonts w:ascii="Times New Roman" w:hAnsi="Times New Roman" w:cs="Times New Roman"/>
                 <w:noProof/>
               </w:rPr>
-              <w:t>2.12.</w:t>
-            </w:r>
-            <w:r>
-              <w:rPr>
-                <w:rStyle w:val="af1"/>
-                <w:rFonts w:ascii="Times New Roman" w:hAnsi="Times New Roman" w:cs="Times New Roman"/>
-                <w:noProof/>
-                <w:lang w:val="en-US"/>
-              </w:rPr>
-              <w:t>2</w:t>
-            </w:r>
-            <w:r>
-              <w:rPr>
-                <w:rStyle w:val="af1"/>
-                <w:rFonts w:ascii="Times New Roman" w:hAnsi="Times New Roman" w:cs="Times New Roman"/>
-                <w:noProof/>
-              </w:rPr>
-              <w:t xml:space="preserve"> Реализованное решение</w:t>
+              <w:t>2.12.2 Реализованное решение</w:t>
             </w:r>
             <w:r>
               <w:rPr>
@@ -5199,7 +5079,7 @@
                 <w:noProof/>
                 <w:webHidden/>
               </w:rPr>
-              <w:instrText xml:space="preserve"> PAGEREF _Toc230365406 \h </w:instrText>
+              <w:instrText xml:space="preserve"> PAGEREF _Toc230367775 \h </w:instrText>
             </w:r>
             <w:r>
               <w:rPr>
@@ -5222,7 +5102,7 @@
                 <w:noProof/>
                 <w:webHidden/>
               </w:rPr>
-              <w:t>24</w:t>
+              <w:t>25</w:t>
             </w:r>
             <w:r>
               <w:rPr>
@@ -5246,7 +5126,7 @@
               <w:lang w:eastAsia="ru-RU"/>
             </w:rPr>
           </w:pPr>
-          <w:hyperlink w:anchor="_Toc230365407" w:history="1">
+          <w:hyperlink w:anchor="_Toc230367776" w:history="1">
             <w:r>
               <w:rPr>
                 <w:rStyle w:val="af1"/>
@@ -5277,7 +5157,7 @@
                 <w:noProof/>
                 <w:webHidden/>
               </w:rPr>
-              <w:instrText xml:space="preserve"> PAGEREF _Toc230365407 \h </w:instrText>
+              <w:instrText xml:space="preserve"> PAGEREF _Toc230367776 \h </w:instrText>
             </w:r>
             <w:r>
               <w:rPr>
@@ -5300,7 +5180,7 @@
                 <w:noProof/>
                 <w:webHidden/>
               </w:rPr>
-              <w:t>26</w:t>
+              <w:t>27</w:t>
             </w:r>
             <w:r>
               <w:rPr>
@@ -5324,7 +5204,7 @@
               <w:lang w:eastAsia="ru-RU"/>
             </w:rPr>
           </w:pPr>
-          <w:hyperlink w:anchor="_Toc230365408" w:history="1">
+          <w:hyperlink w:anchor="_Toc230367777" w:history="1">
             <w:r>
               <w:rPr>
                 <w:rStyle w:val="af1"/>
@@ -5355,7 +5235,7 @@
                 <w:noProof/>
                 <w:webHidden/>
               </w:rPr>
-              <w:instrText xml:space="preserve"> PAGEREF _Toc230365408 \h </w:instrText>
+              <w:instrText xml:space="preserve"> PAGEREF _Toc230367777 \h </w:instrText>
             </w:r>
             <w:r>
               <w:rPr>
@@ -5378,7 +5258,7 @@
                 <w:noProof/>
                 <w:webHidden/>
               </w:rPr>
-              <w:t>26</w:t>
+              <w:t>27</w:t>
             </w:r>
             <w:r>
               <w:rPr>
@@ -5402,7 +5282,7 @@
               <w:lang w:eastAsia="ru-RU"/>
             </w:rPr>
           </w:pPr>
-          <w:hyperlink w:anchor="_Toc230365409" w:history="1">
+          <w:hyperlink w:anchor="_Toc230367778" w:history="1">
             <w:r>
               <w:rPr>
                 <w:rStyle w:val="af1"/>
@@ -5433,7 +5313,7 @@
                 <w:noProof/>
                 <w:webHidden/>
               </w:rPr>
-              <w:instrText xml:space="preserve"> PAGEREF _Toc230365409 \h </w:instrText>
+              <w:instrText xml:space="preserve"> PAGEREF _Toc230367778 \h </w:instrText>
             </w:r>
             <w:r>
               <w:rPr>
@@ -5456,7 +5336,7 @@
                 <w:noProof/>
                 <w:webHidden/>
               </w:rPr>
-              <w:t>26</w:t>
+              <w:t>27</w:t>
             </w:r>
             <w:r>
               <w:rPr>
@@ -5480,7 +5360,7 @@
               <w:lang w:eastAsia="ru-RU"/>
             </w:rPr>
           </w:pPr>
-          <w:hyperlink w:anchor="_Toc230365410" w:history="1">
+          <w:hyperlink w:anchor="_Toc230367779" w:history="1">
             <w:r>
               <w:rPr>
                 <w:rStyle w:val="af1"/>
@@ -5511,7 +5391,7 @@
                 <w:noProof/>
                 <w:webHidden/>
               </w:rPr>
-              <w:instrText xml:space="preserve"> PAGEREF _Toc230365410 \h </w:instrText>
+              <w:instrText xml:space="preserve"> PAGEREF _Toc230367779 \h </w:instrText>
             </w:r>
             <w:r>
               <w:rPr>
@@ -5534,7 +5414,7 @@
                 <w:noProof/>
                 <w:webHidden/>
               </w:rPr>
-              <w:t>26</w:t>
+              <w:t>27</w:t>
             </w:r>
             <w:r>
               <w:rPr>
@@ -5558,7 +5438,7 @@
               <w:lang w:eastAsia="ru-RU"/>
             </w:rPr>
           </w:pPr>
-          <w:hyperlink w:anchor="_Toc230365411" w:history="1">
+          <w:hyperlink w:anchor="_Toc230367780" w:history="1">
             <w:r>
               <w:rPr>
                 <w:rStyle w:val="af1"/>
@@ -5589,7 +5469,7 @@
                 <w:noProof/>
                 <w:webHidden/>
               </w:rPr>
-              <w:instrText xml:space="preserve"> PAGEREF _Toc230365411 \h </w:instrText>
+              <w:instrText xml:space="preserve"> PAGEREF _Toc230367780 \h </w:instrText>
             </w:r>
             <w:r>
               <w:rPr>
@@ -5612,7 +5492,7 @@
                 <w:noProof/>
                 <w:webHidden/>
               </w:rPr>
-              <w:t>27</w:t>
+              <w:t>28</w:t>
             </w:r>
             <w:r>
               <w:rPr>
@@ -5636,7 +5516,7 @@
               <w:lang w:eastAsia="ru-RU"/>
             </w:rPr>
           </w:pPr>
-          <w:hyperlink w:anchor="_Toc230365412" w:history="1">
+          <w:hyperlink w:anchor="_Toc230367781" w:history="1">
             <w:r>
               <w:rPr>
                 <w:rStyle w:val="af1"/>
@@ -5667,7 +5547,7 @@
                 <w:noProof/>
                 <w:webHidden/>
               </w:rPr>
-              <w:instrText xml:space="preserve"> PAGEREF _Toc230365412 \h </w:instrText>
+              <w:instrText xml:space="preserve"> PAGEREF _Toc230367781 \h </w:instrText>
             </w:r>
             <w:r>
               <w:rPr>
@@ -5690,7 +5570,7 @@
                 <w:noProof/>
                 <w:webHidden/>
               </w:rPr>
-              <w:t>27</w:t>
+              <w:t>28</w:t>
             </w:r>
             <w:r>
               <w:rPr>
@@ -5714,7 +5594,7 @@
               <w:lang w:eastAsia="ru-RU"/>
             </w:rPr>
           </w:pPr>
-          <w:hyperlink w:anchor="_Toc230365413" w:history="1">
+          <w:hyperlink w:anchor="_Toc230367782" w:history="1">
             <w:r>
               <w:rPr>
                 <w:rStyle w:val="af1"/>
@@ -5745,7 +5625,7 @@
                 <w:noProof/>
                 <w:webHidden/>
               </w:rPr>
-              <w:instrText xml:space="preserve"> PAGEREF _Toc230365413 \h </w:instrText>
+              <w:instrText xml:space="preserve"> PAGEREF _Toc230367782 \h </w:instrText>
             </w:r>
             <w:r>
               <w:rPr>
@@ -5768,7 +5648,7 @@
                 <w:noProof/>
                 <w:webHidden/>
               </w:rPr>
-              <w:t>27</w:t>
+              <w:t>28</w:t>
             </w:r>
             <w:r>
               <w:rPr>
@@ -5792,7 +5672,7 @@
               <w:lang w:eastAsia="ru-RU"/>
             </w:rPr>
           </w:pPr>
-          <w:hyperlink w:anchor="_Toc230365414" w:history="1">
+          <w:hyperlink w:anchor="_Toc230367783" w:history="1">
             <w:r>
               <w:rPr>
                 <w:rStyle w:val="af1"/>
@@ -5823,7 +5703,7 @@
                 <w:noProof/>
                 <w:webHidden/>
               </w:rPr>
-              <w:instrText xml:space="preserve"> PAGEREF _Toc230365414 \h </w:instrText>
+              <w:instrText xml:space="preserve"> PAGEREF _Toc230367783 \h </w:instrText>
             </w:r>
             <w:r>
               <w:rPr>
@@ -5846,7 +5726,7 @@
                 <w:noProof/>
                 <w:webHidden/>
               </w:rPr>
-              <w:t>28</w:t>
+              <w:t>29</w:t>
             </w:r>
             <w:r>
               <w:rPr>
@@ -5870,7 +5750,7 @@
               <w:lang w:eastAsia="ru-RU"/>
             </w:rPr>
           </w:pPr>
-          <w:hyperlink w:anchor="_Toc230365415" w:history="1">
+          <w:hyperlink w:anchor="_Toc230367784" w:history="1">
             <w:r>
               <w:rPr>
                 <w:rStyle w:val="af1"/>
@@ -5901,7 +5781,7 @@
                 <w:noProof/>
                 <w:webHidden/>
               </w:rPr>
-              <w:instrText xml:space="preserve"> PAGEREF _Toc230365415 \h </w:instrText>
+              <w:instrText xml:space="preserve"> PAGEREF _Toc230367784 \h </w:instrText>
             </w:r>
             <w:r>
               <w:rPr>
@@ -5924,7 +5804,7 @@
                 <w:noProof/>
                 <w:webHidden/>
               </w:rPr>
-              <w:t>28</w:t>
+              <w:t>29</w:t>
             </w:r>
             <w:r>
               <w:rPr>
@@ -5948,7 +5828,7 @@
               <w:lang w:eastAsia="ru-RU"/>
             </w:rPr>
           </w:pPr>
-          <w:hyperlink w:anchor="_Toc230365416" w:history="1">
+          <w:hyperlink w:anchor="_Toc230367785" w:history="1">
             <w:r>
               <w:rPr>
                 <w:rStyle w:val="af1"/>
@@ -5979,7 +5859,7 @@
                 <w:noProof/>
                 <w:webHidden/>
               </w:rPr>
-              <w:instrText xml:space="preserve"> PAGEREF _Toc230365416 \h </w:instrText>
+              <w:instrText xml:space="preserve"> PAGEREF _Toc230367785 \h </w:instrText>
             </w:r>
             <w:r>
               <w:rPr>
@@ -6002,7 +5882,7 @@
                 <w:noProof/>
                 <w:webHidden/>
               </w:rPr>
-              <w:t>29</w:t>
+              <w:t>30</w:t>
             </w:r>
             <w:r>
               <w:rPr>
@@ -6026,14 +5906,14 @@
               <w:lang w:eastAsia="ru-RU"/>
             </w:rPr>
           </w:pPr>
-          <w:hyperlink w:anchor="_Toc230365417" w:history="1">
+          <w:hyperlink w:anchor="_Toc230367786" w:history="1">
             <w:r>
               <w:rPr>
                 <w:rStyle w:val="af1"/>
                 <w:rFonts w:cs="Times New Roman"/>
                 <w:noProof/>
               </w:rPr>
-              <w:t>Список литературы (источников)</w:t>
+              <w:t>Список литературы</w:t>
             </w:r>
             <w:r>
               <w:rPr>
@@ -6057,7 +5937,7 @@
                 <w:noProof/>
                 <w:webHidden/>
               </w:rPr>
-              <w:instrText xml:space="preserve"> PAGEREF _Toc230365417 \h </w:instrText>
+              <w:instrText xml:space="preserve"> PAGEREF _Toc230367786 \h </w:instrText>
             </w:r>
             <w:r>
               <w:rPr>
@@ -6080,7 +5960,7 @@
                 <w:noProof/>
                 <w:webHidden/>
               </w:rPr>
-              <w:t>30</w:t>
+              <w:t>31</w:t>
             </w:r>
             <w:r>
               <w:rPr>
@@ -6106,7 +5986,7 @@
       <w:pPr>
         <w:pStyle w:val="011"/>
       </w:pPr>
-      <w:bookmarkStart w:id="1" w:name="_Toc230365352"/>
+      <w:bookmarkStart w:id="1" w:name="_Toc230367721"/>
       <w:r>
         <w:lastRenderedPageBreak/>
         <w:t>Введение</w:t>
@@ -6350,7 +6230,7 @@
       <w:pPr>
         <w:pStyle w:val="011"/>
       </w:pPr>
-      <w:bookmarkStart w:id="2" w:name="_Toc230365353"/>
+      <w:bookmarkStart w:id="2" w:name="_Toc230367722"/>
       <w:r>
         <w:lastRenderedPageBreak/>
         <w:t xml:space="preserve">1 </w:t>
@@ -6364,7 +6244,7 @@
       <w:pPr>
         <w:pStyle w:val="022"/>
       </w:pPr>
-      <w:bookmarkStart w:id="3" w:name="_Toc230365354"/>
+      <w:bookmarkStart w:id="3" w:name="_Toc230367723"/>
       <w:r>
         <w:t>1.1 Назначение и архитектура веб-приложения</w:t>
       </w:r>
@@ -6425,7 +6305,7 @@
       <w:pPr>
         <w:pStyle w:val="022"/>
       </w:pPr>
-      <w:bookmarkStart w:id="4" w:name="_Toc230365355"/>
+      <w:bookmarkStart w:id="4" w:name="_Toc230367724"/>
       <w:r>
         <w:t>1.2 Клиентская часть веб-приложения</w:t>
       </w:r>
@@ -6613,7 +6493,7 @@
       <w:pPr>
         <w:pStyle w:val="022"/>
       </w:pPr>
-      <w:bookmarkStart w:id="5" w:name="_Toc230365356"/>
+      <w:bookmarkStart w:id="5" w:name="_Toc230367725"/>
       <w:r>
         <w:t xml:space="preserve">1.3 Серверная часть и </w:t>
       </w:r>
@@ -6814,7 +6694,7 @@
       <w:pPr>
         <w:pStyle w:val="022"/>
       </w:pPr>
-      <w:bookmarkStart w:id="6" w:name="_Toc230365357"/>
+      <w:bookmarkStart w:id="6" w:name="_Toc230367726"/>
       <w:r>
         <w:t>1.4 Работа с базой данных</w:t>
       </w:r>
@@ -6858,7 +6738,7 @@
       <w:pPr>
         <w:pStyle w:val="022"/>
       </w:pPr>
-      <w:bookmarkStart w:id="7" w:name="_Toc230365358"/>
+      <w:bookmarkStart w:id="7" w:name="_Toc230367727"/>
       <w:r>
         <w:t>1.5 Механизм бронирования</w:t>
       </w:r>
@@ -6937,7 +6817,7 @@
       <w:pPr>
         <w:pStyle w:val="022"/>
       </w:pPr>
-      <w:bookmarkStart w:id="8" w:name="_Toc230365359"/>
+      <w:bookmarkStart w:id="8" w:name="_Toc230367728"/>
       <w:r>
         <w:lastRenderedPageBreak/>
         <w:t>1.6 Методы обработки дат и времени</w:t>
@@ -6982,7 +6862,7 @@
       <w:pPr>
         <w:pStyle w:val="022"/>
       </w:pPr>
-      <w:bookmarkStart w:id="9" w:name="_Toc230365360"/>
+      <w:bookmarkStart w:id="9" w:name="_Toc230367729"/>
       <w:r>
         <w:t>1.7 Обеспечение корректности и надёжности работы</w:t>
       </w:r>
@@ -7083,7 +6963,7 @@
       <w:pPr>
         <w:pStyle w:val="022"/>
       </w:pPr>
-      <w:bookmarkStart w:id="10" w:name="_Toc230365361"/>
+      <w:bookmarkStart w:id="10" w:name="_Toc230367730"/>
       <w:r>
         <w:t>1.</w:t>
       </w:r>
@@ -7144,7 +7024,7 @@
       <w:pPr>
         <w:pStyle w:val="011"/>
       </w:pPr>
-      <w:bookmarkStart w:id="11" w:name="_Toc230365362"/>
+      <w:bookmarkStart w:id="11" w:name="_Toc230367731"/>
       <w:r>
         <w:lastRenderedPageBreak/>
         <w:t>2 Практическая часть</w:t>
@@ -7158,7 +7038,7 @@
       <w:pPr>
         <w:pStyle w:val="022"/>
       </w:pPr>
-      <w:bookmarkStart w:id="12" w:name="_Toc230365363"/>
+      <w:bookmarkStart w:id="12" w:name="_Toc230367732"/>
       <w:r>
         <w:t xml:space="preserve">2.1 </w:t>
       </w:r>
@@ -7559,7 +7439,7 @@
       <w:pPr>
         <w:pStyle w:val="022"/>
       </w:pPr>
-      <w:bookmarkStart w:id="16" w:name="_Toc230365364"/>
+      <w:bookmarkStart w:id="16" w:name="_Toc230367733"/>
       <w:r>
         <w:t xml:space="preserve">2.2 </w:t>
       </w:r>
@@ -7627,7 +7507,7 @@
       <w:pPr>
         <w:pStyle w:val="022"/>
       </w:pPr>
-      <w:bookmarkStart w:id="17" w:name="_Toc230365365"/>
+      <w:bookmarkStart w:id="17" w:name="_Toc230367734"/>
       <w:r>
         <w:t xml:space="preserve">2.3 </w:t>
       </w:r>
@@ -7765,7 +7645,7 @@
       <w:pPr>
         <w:pStyle w:val="022"/>
       </w:pPr>
-      <w:bookmarkStart w:id="18" w:name="_Toc230365366"/>
+      <w:bookmarkStart w:id="18" w:name="_Toc230367735"/>
       <w:r>
         <w:t xml:space="preserve">2.4 </w:t>
       </w:r>
@@ -7778,8 +7658,8 @@
       <w:pPr>
         <w:pStyle w:val="0213"/>
       </w:pPr>
-      <w:bookmarkStart w:id="19" w:name="_Toc230365367"/>
-      <w:bookmarkStart w:id="20" w:name="_Hlk230079966"/>
+      <w:bookmarkStart w:id="19" w:name="_Hlk230079966"/>
+      <w:bookmarkStart w:id="20" w:name="_Toc230367736"/>
       <w:r>
         <w:t>2</w:t>
       </w:r>
@@ -7792,9 +7672,9 @@
       <w:r>
         <w:t xml:space="preserve"> Система аутентификации и авторизации</w:t>
       </w:r>
-      <w:bookmarkEnd w:id="19"/>
-    </w:p>
-    <w:bookmarkEnd w:id="20"/>
+      <w:bookmarkEnd w:id="20"/>
+    </w:p>
+    <w:bookmarkEnd w:id="19"/>
     <w:p>
       <w:pPr>
         <w:pStyle w:val="03"/>
@@ -7896,7 +7776,7 @@
       <w:pPr>
         <w:pStyle w:val="0213"/>
       </w:pPr>
-      <w:bookmarkStart w:id="21" w:name="_Toc230365368"/>
+      <w:bookmarkStart w:id="21" w:name="_Toc230367737"/>
       <w:r>
         <w:t>2.4.2 Админ</w:t>
       </w:r>
@@ -8376,7 +8256,7 @@
       <w:pPr>
         <w:pStyle w:val="0213"/>
       </w:pPr>
-      <w:bookmarkStart w:id="22" w:name="_Toc230365369"/>
+      <w:bookmarkStart w:id="22" w:name="_Toc230367738"/>
       <w:r>
         <w:t>2.4.3 Админ</w:t>
       </w:r>
@@ -8632,7 +8512,7 @@
       <w:pPr>
         <w:pStyle w:val="0213"/>
       </w:pPr>
-      <w:bookmarkStart w:id="23" w:name="_Toc230365370"/>
+      <w:bookmarkStart w:id="23" w:name="_Toc230367739"/>
       <w:r>
         <w:t>2.4.4 Админ</w:t>
       </w:r>
@@ -8759,7 +8639,7 @@
       <w:pPr>
         <w:pStyle w:val="0213"/>
       </w:pPr>
-      <w:bookmarkStart w:id="24" w:name="_Toc230365371"/>
+      <w:bookmarkStart w:id="24" w:name="_Toc230367740"/>
       <w:r>
         <w:t>2.4.5 Админ</w:t>
       </w:r>
@@ -8962,7 +8842,7 @@
       <w:pPr>
         <w:pStyle w:val="0213"/>
       </w:pPr>
-      <w:bookmarkStart w:id="25" w:name="_Toc230365372"/>
+      <w:bookmarkStart w:id="25" w:name="_Toc230367741"/>
       <w:r>
         <w:t>2.4.6 Интеграция административных функций в клиентскую часть</w:t>
       </w:r>
@@ -8997,7 +8877,7 @@
       <w:pPr>
         <w:pStyle w:val="0213"/>
       </w:pPr>
-      <w:bookmarkStart w:id="26" w:name="_Toc230365373"/>
+      <w:bookmarkStart w:id="26" w:name="_Toc230367742"/>
       <w:r>
         <w:lastRenderedPageBreak/>
         <w:t>2.4.7 Технические аспекты реализации</w:t>
@@ -9385,7 +9265,7 @@
       <w:pPr>
         <w:pStyle w:val="0213"/>
       </w:pPr>
-      <w:bookmarkStart w:id="27" w:name="_Toc230365374"/>
+      <w:bookmarkStart w:id="27" w:name="_Toc230367743"/>
       <w:r>
         <w:t>2.4.</w:t>
       </w:r>
@@ -9494,7 +9374,7 @@
       <w:pPr>
         <w:pStyle w:val="022"/>
       </w:pPr>
-      <w:bookmarkStart w:id="28" w:name="_Toc230365375"/>
+      <w:bookmarkStart w:id="28" w:name="_Toc230367744"/>
       <w:r>
         <w:t xml:space="preserve">2.5 </w:t>
       </w:r>
@@ -9510,7 +9390,7 @@
       <w:pPr>
         <w:pStyle w:val="0213"/>
       </w:pPr>
-      <w:bookmarkStart w:id="29" w:name="_Toc230365376"/>
+      <w:bookmarkStart w:id="29" w:name="_Toc230367745"/>
       <w:r>
         <w:t xml:space="preserve">2.5.1 </w:t>
       </w:r>
@@ -9611,7 +9491,7 @@
       <w:pPr>
         <w:pStyle w:val="0213"/>
       </w:pPr>
-      <w:bookmarkStart w:id="30" w:name="_Toc230365377"/>
+      <w:bookmarkStart w:id="30" w:name="_Toc230367746"/>
       <w:r>
         <w:t>2.5.</w:t>
       </w:r>
@@ -9812,7 +9692,7 @@
       <w:pPr>
         <w:pStyle w:val="0213"/>
       </w:pPr>
-      <w:bookmarkStart w:id="31" w:name="_Toc230365378"/>
+      <w:bookmarkStart w:id="31" w:name="_Toc230367747"/>
       <w:r>
         <w:t xml:space="preserve">2.5.3 </w:t>
       </w:r>
@@ -9886,7 +9766,7 @@
       <w:pPr>
         <w:pStyle w:val="022"/>
       </w:pPr>
-      <w:bookmarkStart w:id="32" w:name="_Toc230365379"/>
+      <w:bookmarkStart w:id="32" w:name="_Toc230367748"/>
       <w:r>
         <w:t>2.</w:t>
       </w:r>
@@ -9908,7 +9788,7 @@
       <w:pPr>
         <w:pStyle w:val="0213"/>
       </w:pPr>
-      <w:bookmarkStart w:id="33" w:name="_Toc230365380"/>
+      <w:bookmarkStart w:id="33" w:name="_Toc230367749"/>
       <w:r>
         <w:t xml:space="preserve">2.6.1 </w:t>
       </w:r>
@@ -9937,7 +9817,7 @@
       <w:pPr>
         <w:pStyle w:val="0213"/>
       </w:pPr>
-      <w:bookmarkStart w:id="34" w:name="_Toc230365381"/>
+      <w:bookmarkStart w:id="34" w:name="_Toc230367750"/>
       <w:r>
         <w:t>2.6.2 Причина возникновения проблемы</w:t>
       </w:r>
@@ -10025,7 +9905,7 @@
       <w:pPr>
         <w:pStyle w:val="0213"/>
       </w:pPr>
-      <w:bookmarkStart w:id="35" w:name="_Toc230365382"/>
+      <w:bookmarkStart w:id="35" w:name="_Toc230367751"/>
       <w:r>
         <w:t>2.6.3 Реализованное решение</w:t>
       </w:r>
@@ -10169,7 +10049,7 @@
       <w:pPr>
         <w:pStyle w:val="0213"/>
       </w:pPr>
-      <w:bookmarkStart w:id="36" w:name="_Toc230365383"/>
+      <w:bookmarkStart w:id="36" w:name="_Toc230367752"/>
       <w:r>
         <w:t>2.</w:t>
       </w:r>
@@ -10246,7 +10126,7 @@
       <w:pPr>
         <w:pStyle w:val="022"/>
       </w:pPr>
-      <w:bookmarkStart w:id="37" w:name="_Toc230365384"/>
+      <w:bookmarkStart w:id="37" w:name="_Toc230367753"/>
       <w:r>
         <w:t>2.</w:t>
       </w:r>
@@ -10273,7 +10153,7 @@
       <w:pPr>
         <w:pStyle w:val="0213"/>
       </w:pPr>
-      <w:bookmarkStart w:id="38" w:name="_Toc230365385"/>
+      <w:bookmarkStart w:id="38" w:name="_Toc230367754"/>
       <w:r>
         <w:t>2.7.1 Удобное окно для переноса бронирования</w:t>
       </w:r>
@@ -10459,7 +10339,7 @@
       <w:pPr>
         <w:pStyle w:val="0213"/>
       </w:pPr>
-      <w:bookmarkStart w:id="39" w:name="_Toc230365386"/>
+      <w:bookmarkStart w:id="39" w:name="_Toc230367755"/>
       <w:r>
         <w:t xml:space="preserve">2.7.2 </w:t>
       </w:r>
@@ -10628,7 +10508,7 @@
       <w:pPr>
         <w:pStyle w:val="0213"/>
       </w:pPr>
-      <w:bookmarkStart w:id="41" w:name="_Toc230365387"/>
+      <w:bookmarkStart w:id="41" w:name="_Toc230367756"/>
       <w:r>
         <w:t xml:space="preserve">2.7.3 Редактирование каталога </w:t>
       </w:r>
@@ -10774,7 +10654,7 @@
       <w:pPr>
         <w:pStyle w:val="0213"/>
       </w:pPr>
-      <w:bookmarkStart w:id="42" w:name="_Toc230365388"/>
+      <w:bookmarkStart w:id="42" w:name="_Toc230367757"/>
       <w:r>
         <w:lastRenderedPageBreak/>
         <w:t xml:space="preserve">2.7.4 </w:t>
@@ -10978,7 +10858,7 @@
       <w:pPr>
         <w:pStyle w:val="022"/>
       </w:pPr>
-      <w:bookmarkStart w:id="43" w:name="_Toc230365389"/>
+      <w:bookmarkStart w:id="43" w:name="_Toc230367758"/>
       <w:r>
         <w:t>2.</w:t>
       </w:r>
@@ -11000,7 +10880,7 @@
       <w:pPr>
         <w:pStyle w:val="0213"/>
       </w:pPr>
-      <w:bookmarkStart w:id="44" w:name="_Toc230365390"/>
+      <w:bookmarkStart w:id="44" w:name="_Toc230367759"/>
       <w:r>
         <w:t xml:space="preserve">2.8.1 </w:t>
       </w:r>
@@ -11037,7 +10917,7 @@
       <w:pPr>
         <w:pStyle w:val="0213"/>
       </w:pPr>
-      <w:bookmarkStart w:id="45" w:name="_Toc230365391"/>
+      <w:bookmarkStart w:id="45" w:name="_Toc230367760"/>
       <w:r>
         <w:t>2.8.2 Реализованное решение</w:t>
       </w:r>
@@ -11137,7 +11017,7 @@
       <w:pPr>
         <w:pStyle w:val="022"/>
       </w:pPr>
-      <w:bookmarkStart w:id="46" w:name="_Toc230365392"/>
+      <w:bookmarkStart w:id="46" w:name="_Toc230367761"/>
       <w:r>
         <w:t>2.</w:t>
       </w:r>
@@ -11162,7 +11042,7 @@
       <w:pPr>
         <w:pStyle w:val="0213"/>
       </w:pPr>
-      <w:bookmarkStart w:id="47" w:name="_Toc230365393"/>
+      <w:bookmarkStart w:id="47" w:name="_Toc230367762"/>
       <w:r>
         <w:t>2.9.1 Постановка задачи</w:t>
       </w:r>
@@ -11220,7 +11100,7 @@
       <w:pPr>
         <w:pStyle w:val="0213"/>
       </w:pPr>
-      <w:bookmarkStart w:id="48" w:name="_Toc230365394"/>
+      <w:bookmarkStart w:id="48" w:name="_Toc230367763"/>
       <w:r>
         <w:t>2.</w:t>
       </w:r>
@@ -11410,7 +11290,7 @@
       <w:pPr>
         <w:pStyle w:val="0213"/>
       </w:pPr>
-      <w:bookmarkStart w:id="49" w:name="_Toc230365395"/>
+      <w:bookmarkStart w:id="49" w:name="_Toc230367764"/>
       <w:r>
         <w:t>2.</w:t>
       </w:r>
@@ -11471,7 +11351,7 @@
       <w:pPr>
         <w:pStyle w:val="022"/>
       </w:pPr>
-      <w:bookmarkStart w:id="51" w:name="_Toc230365396"/>
+      <w:bookmarkStart w:id="51" w:name="_Toc230367765"/>
       <w:r>
         <w:t>2.</w:t>
       </w:r>
@@ -11490,7 +11370,7 @@
       <w:pPr>
         <w:pStyle w:val="0213"/>
       </w:pPr>
-      <w:bookmarkStart w:id="52" w:name="_Toc230365397"/>
+      <w:bookmarkStart w:id="52" w:name="_Toc230367766"/>
       <w:r>
         <w:t>2.</w:t>
       </w:r>
@@ -11575,7 +11455,7 @@
       <w:pPr>
         <w:pStyle w:val="0213"/>
       </w:pPr>
-      <w:bookmarkStart w:id="53" w:name="_Toc230365398"/>
+      <w:bookmarkStart w:id="53" w:name="_Toc230367767"/>
       <w:r>
         <w:lastRenderedPageBreak/>
         <w:t>2.10.</w:t>
@@ -11761,7 +11641,7 @@
       <w:pPr>
         <w:pStyle w:val="0213"/>
       </w:pPr>
-      <w:bookmarkStart w:id="54" w:name="_Toc230365399"/>
+      <w:bookmarkStart w:id="54" w:name="_Toc230367768"/>
       <w:r>
         <w:t>2.</w:t>
       </w:r>
@@ -11846,7 +11726,7 @@
       <w:pPr>
         <w:pStyle w:val="022"/>
       </w:pPr>
-      <w:bookmarkStart w:id="55" w:name="_Toc230365400"/>
+      <w:bookmarkStart w:id="55" w:name="_Toc230367769"/>
       <w:r>
         <w:t>2.1</w:t>
       </w:r>
@@ -11868,7 +11748,7 @@
       <w:pPr>
         <w:pStyle w:val="0213"/>
       </w:pPr>
-      <w:bookmarkStart w:id="56" w:name="_Toc230365401"/>
+      <w:bookmarkStart w:id="56" w:name="_Toc230367770"/>
       <w:r>
         <w:t>2.</w:t>
       </w:r>
@@ -11985,7 +11865,7 @@
       <w:pPr>
         <w:pStyle w:val="0213"/>
       </w:pPr>
-      <w:bookmarkStart w:id="57" w:name="_Toc230365402"/>
+      <w:bookmarkStart w:id="57" w:name="_Toc230367771"/>
       <w:r>
         <w:t xml:space="preserve">2.11.2 </w:t>
       </w:r>
@@ -12280,7 +12160,7 @@
       <w:pPr>
         <w:pStyle w:val="0213"/>
       </w:pPr>
-      <w:bookmarkStart w:id="58" w:name="_Toc230365403"/>
+      <w:bookmarkStart w:id="58" w:name="_Toc230367772"/>
       <w:r>
         <w:t>2.11.3 Результаты внедрения</w:t>
       </w:r>
@@ -12393,7 +12273,7 @@
       <w:pPr>
         <w:pStyle w:val="022"/>
       </w:pPr>
-      <w:bookmarkStart w:id="60" w:name="_Toc230365404"/>
+      <w:bookmarkStart w:id="60" w:name="_Toc230367773"/>
       <w:r>
         <w:t>2.12 Внедрение уведомлений о бронированиях</w:t>
       </w:r>
@@ -12403,7 +12283,7 @@
       <w:pPr>
         <w:pStyle w:val="0213"/>
       </w:pPr>
-      <w:bookmarkStart w:id="61" w:name="_Toc230365405"/>
+      <w:bookmarkStart w:id="61" w:name="_Toc230367774"/>
       <w:r>
         <w:t>2.12.1 Постановка задачи</w:t>
       </w:r>
@@ -12498,7 +12378,7 @@
       <w:pPr>
         <w:pStyle w:val="0213"/>
       </w:pPr>
-      <w:bookmarkStart w:id="62" w:name="_Toc230365406"/>
+      <w:bookmarkStart w:id="62" w:name="_Toc230367775"/>
       <w:r>
         <w:t>2.12.</w:t>
       </w:r>
@@ -13245,7 +13125,7 @@
       <w:pPr>
         <w:pStyle w:val="0213"/>
       </w:pPr>
-      <w:bookmarkStart w:id="63" w:name="_Toc230365407"/>
+      <w:bookmarkStart w:id="63" w:name="_Toc230367776"/>
       <w:r>
         <w:lastRenderedPageBreak/>
         <w:t>2.1</w:t>
@@ -13355,7 +13235,7 @@
       <w:pPr>
         <w:pStyle w:val="022"/>
       </w:pPr>
-      <w:bookmarkStart w:id="64" w:name="_Toc230365408"/>
+      <w:bookmarkStart w:id="64" w:name="_Toc230367777"/>
       <w:r>
         <w:t>2.13 Завершение</w:t>
       </w:r>
@@ -13374,8 +13254,8 @@
       <w:pPr>
         <w:pStyle w:val="0213"/>
       </w:pPr>
-      <w:bookmarkStart w:id="65" w:name="_Toc230365409"/>
-      <w:bookmarkStart w:id="66" w:name="_Hlk230358221"/>
+      <w:bookmarkStart w:id="65" w:name="_Hlk230358221"/>
+      <w:bookmarkStart w:id="66" w:name="_Toc230367778"/>
       <w:r>
         <w:t>2.1</w:t>
       </w:r>
@@ -13385,9 +13265,9 @@
       <w:r>
         <w:t>.1 Постановка задачи</w:t>
       </w:r>
-      <w:bookmarkEnd w:id="65"/>
-    </w:p>
-    <w:bookmarkEnd w:id="66"/>
+      <w:bookmarkEnd w:id="66"/>
+    </w:p>
+    <w:bookmarkEnd w:id="65"/>
     <w:p>
       <w:pPr>
         <w:pStyle w:val="03"/>
@@ -13406,7 +13286,7 @@
       <w:pPr>
         <w:pStyle w:val="0213"/>
       </w:pPr>
-      <w:bookmarkStart w:id="67" w:name="_Toc230365410"/>
+      <w:bookmarkStart w:id="67" w:name="_Toc230367779"/>
       <w:r>
         <w:t>2.13.</w:t>
       </w:r>
@@ -13809,7 +13689,7 @@
       <w:pPr>
         <w:pStyle w:val="0213"/>
       </w:pPr>
-      <w:bookmarkStart w:id="68" w:name="_Toc230365411"/>
+      <w:bookmarkStart w:id="68" w:name="_Toc230367780"/>
       <w:r>
         <w:t>2.13.3 Результаты внедрения</w:t>
       </w:r>
@@ -13870,7 +13750,7 @@
       <w:pPr>
         <w:pStyle w:val="022"/>
       </w:pPr>
-      <w:bookmarkStart w:id="69" w:name="_Toc230365412"/>
+      <w:bookmarkStart w:id="69" w:name="_Toc230367781"/>
       <w:r>
         <w:t>2.14 У</w:t>
       </w:r>
@@ -13883,7 +13763,7 @@
       <w:pPr>
         <w:pStyle w:val="0213"/>
       </w:pPr>
-      <w:bookmarkStart w:id="70" w:name="_Toc230365413"/>
+      <w:bookmarkStart w:id="70" w:name="_Toc230367782"/>
       <w:r>
         <w:t>2.14.1 Постановка задачи</w:t>
       </w:r>
@@ -13892,9 +13772,6 @@
     <w:p>
       <w:pPr>
         <w:pStyle w:val="03"/>
-        <w:rPr>
-          <w:lang w:val="en-US"/>
-        </w:rPr>
       </w:pPr>
       <w:r>
         <w:t>При выполнении всех предыдущих задач зачастую появлялись наброски, не всегда согласованные со стилем страницы, подразумевающим использование чёрного и белого как основных цветов, а также их оттенков. Данный минимализм призван снизить визуальную нагрузку на пользователя, с</w:t>
@@ -13910,7 +13787,7 @@
       <w:pPr>
         <w:pStyle w:val="0213"/>
       </w:pPr>
-      <w:bookmarkStart w:id="71" w:name="_Toc230365414"/>
+      <w:bookmarkStart w:id="71" w:name="_Toc230367783"/>
       <w:r>
         <w:lastRenderedPageBreak/>
         <w:t xml:space="preserve">2.14.2 </w:t>
@@ -14106,7 +13983,7 @@
       <w:pPr>
         <w:pStyle w:val="0213"/>
       </w:pPr>
-      <w:bookmarkStart w:id="72" w:name="_Toc230365415"/>
+      <w:bookmarkStart w:id="72" w:name="_Toc230367784"/>
       <w:r>
         <w:t xml:space="preserve">2.14.3 </w:t>
       </w:r>
@@ -14177,7 +14054,7 @@
       <w:pPr>
         <w:pStyle w:val="011"/>
       </w:pPr>
-      <w:bookmarkStart w:id="73" w:name="_Toc230365416"/>
+      <w:bookmarkStart w:id="73" w:name="_Toc230367785"/>
       <w:r>
         <w:lastRenderedPageBreak/>
         <w:t>Заключение</w:t>
@@ -14441,7 +14318,7 @@
       <w:pPr>
         <w:pStyle w:val="011"/>
       </w:pPr>
-      <w:bookmarkStart w:id="74" w:name="_Toc230365417"/>
+      <w:bookmarkStart w:id="74" w:name="_Toc230367786"/>
       <w:r>
         <w:lastRenderedPageBreak/>
         <w:t>Список литературы</w:t>
@@ -14458,13 +14335,7 @@
         <w:ind w:left="993"/>
       </w:pPr>
       <w:r>
-        <w:t>Документация по продуктам Microsoft:</w:t>
-      </w:r>
-      <w:r>
-        <w:t xml:space="preserve"> </w:t>
-      </w:r>
-      <w:r>
-        <w:t xml:space="preserve">[сайт]. — URL: </w:t>
+        <w:t xml:space="preserve">Документация по продуктам Microsoft: [сайт]. — URL: </w:t>
       </w:r>
       <w:hyperlink r:id="rId8" w:history="1">
         <w:r>
@@ -14524,19 +14395,7 @@
           <w:rPr>
             <w:rStyle w:val="af1"/>
           </w:rPr>
-          <w:t xml:space="preserve"> https://www.</w:t>
-        </w:r>
-        <w:r>
-          <w:rPr>
-            <w:rStyle w:val="af1"/>
-          </w:rPr>
-          <w:t>p</w:t>
-        </w:r>
-        <w:r>
-          <w:rPr>
-            <w:rStyle w:val="af1"/>
-          </w:rPr>
-          <w:t>ostgresql.org/docs/</w:t>
+          <w:t xml:space="preserve"> https://www.postgresql.org/docs/</w:t>
         </w:r>
       </w:hyperlink>
       <w:r>
@@ -14797,10 +14656,7 @@
       </w:r>
       <w:proofErr w:type="spellEnd"/>
       <w:r>
-        <w:t>:</w:t>
-      </w:r>
-      <w:r>
-        <w:t xml:space="preserve"> [сайт]. — URL: </w:t>
+        <w:t xml:space="preserve">: [сайт]. — URL: </w:t>
       </w:r>
       <w:hyperlink r:id="rId13" w:history="1">
         <w:r>
@@ -14811,10 +14667,7 @@
         </w:r>
       </w:hyperlink>
       <w:r>
-        <w:t xml:space="preserve"> </w:t>
-      </w:r>
-      <w:r>
-        <w:t>(дата обращения: 22.05.2026).</w:t>
+        <w:t xml:space="preserve"> (дата обращения: 22.05.2026).</w:t>
       </w:r>
     </w:p>
     <w:sectPr>

</xml_diff>

<commit_message>
correct the report title ('functionality' word)
</commit_message>
<xml_diff>
--- a/report_spring2026.docx
+++ b/report_spring2026.docx
@@ -271,7 +271,7 @@
           <w:sz w:val="28"/>
           <w:szCs w:val="28"/>
         </w:rPr>
-        <w:t>Расширение функционала информационной системы</w:t>
+        <w:t>Расширение функционал</w:t>
       </w:r>
       <w:r>
         <w:rPr>
@@ -281,7 +281,7 @@
           <w:sz w:val="28"/>
           <w:szCs w:val="28"/>
         </w:rPr>
-        <w:t xml:space="preserve"> </w:t>
+        <w:t>ьности</w:t>
       </w:r>
       <w:r>
         <w:rPr>
@@ -291,7 +291,7 @@
           <w:sz w:val="28"/>
           <w:szCs w:val="28"/>
         </w:rPr>
-        <w:t>для музыкальной студии</w:t>
+        <w:t xml:space="preserve"> информационной системы</w:t>
       </w:r>
       <w:r>
         <w:rPr>
@@ -301,28 +301,28 @@
           <w:sz w:val="28"/>
           <w:szCs w:val="28"/>
         </w:rPr>
-        <w:t>»</w:t>
-      </w:r>
-    </w:p>
-    <w:p>
-      <w:pPr>
-        <w:jc w:val="center"/>
+        <w:t xml:space="preserve"> </w:t>
+      </w:r>
+      <w:r>
         <w:rPr>
           <w:rFonts w:ascii="Times New Roman" w:hAnsi="Times New Roman" w:cs="Times New Roman"/>
           <w:b/>
           <w:bCs/>
-        </w:rPr>
-      </w:pPr>
-    </w:p>
-    <w:p>
-      <w:pPr>
-        <w:jc w:val="center"/>
+          <w:sz w:val="28"/>
+          <w:szCs w:val="28"/>
+        </w:rPr>
+        <w:t>для музыкальной студии</w:t>
+      </w:r>
+      <w:r>
         <w:rPr>
           <w:rFonts w:ascii="Times New Roman" w:hAnsi="Times New Roman" w:cs="Times New Roman"/>
           <w:b/>
           <w:bCs/>
-        </w:rPr>
-      </w:pPr>
+          <w:sz w:val="28"/>
+          <w:szCs w:val="28"/>
+        </w:rPr>
+        <w:t>»</w:t>
+      </w:r>
     </w:p>
     <w:p>
       <w:pPr>
@@ -333,92 +333,41 @@
           <w:bCs/>
         </w:rPr>
       </w:pPr>
-      <w:r>
+    </w:p>
+    <w:p>
+      <w:pPr>
+        <w:jc w:val="center"/>
         <w:rPr>
           <w:rFonts w:ascii="Times New Roman" w:hAnsi="Times New Roman" w:cs="Times New Roman"/>
           <w:b/>
           <w:bCs/>
         </w:rPr>
-        <w:t xml:space="preserve">                                              </w:t>
-      </w:r>
-      <w:r>
+      </w:pPr>
+    </w:p>
+    <w:p>
+      <w:pPr>
+        <w:jc w:val="center"/>
         <w:rPr>
           <w:rFonts w:ascii="Times New Roman" w:hAnsi="Times New Roman" w:cs="Times New Roman"/>
           <w:b/>
           <w:bCs/>
         </w:rPr>
-        <w:t>Выполнил</w:t>
-      </w:r>
+      </w:pPr>
       <w:r>
         <w:rPr>
           <w:rFonts w:ascii="Times New Roman" w:hAnsi="Times New Roman" w:cs="Times New Roman"/>
           <w:b/>
           <w:bCs/>
         </w:rPr>
-        <w:t>:</w:t>
-      </w:r>
-    </w:p>
-    <w:p>
-      <w:pPr>
-        <w:ind w:left="3540" w:firstLine="708"/>
-        <w:jc w:val="center"/>
-        <w:rPr>
-          <w:rFonts w:ascii="Times New Roman" w:hAnsi="Times New Roman" w:cs="Times New Roman"/>
-        </w:rPr>
-      </w:pPr>
-      <w:r>
-        <w:rPr>
-          <w:rFonts w:ascii="Times New Roman" w:hAnsi="Times New Roman" w:cs="Times New Roman"/>
-        </w:rPr>
-        <w:t xml:space="preserve">  </w:t>
-      </w:r>
-      <w:r>
-        <w:rPr>
-          <w:rFonts w:ascii="Times New Roman" w:hAnsi="Times New Roman" w:cs="Times New Roman"/>
-        </w:rPr>
-        <w:t>студент группы 3823Б1ПР2</w:t>
-      </w:r>
-    </w:p>
-    <w:p>
-      <w:pPr>
-        <w:jc w:val="right"/>
-        <w:rPr>
-          <w:rFonts w:ascii="Times New Roman" w:hAnsi="Times New Roman" w:cs="Times New Roman"/>
-        </w:rPr>
-      </w:pPr>
-      <w:r>
-        <w:rPr>
-          <w:rFonts w:ascii="Times New Roman" w:hAnsi="Times New Roman" w:cs="Times New Roman"/>
-        </w:rPr>
-        <w:t>____________________ Клименко</w:t>
-      </w:r>
-      <w:r>
-        <w:rPr>
-          <w:rFonts w:ascii="Times New Roman" w:hAnsi="Times New Roman" w:cs="Times New Roman"/>
-        </w:rPr>
-        <w:t xml:space="preserve"> </w:t>
-      </w:r>
-      <w:r>
-        <w:rPr>
-          <w:rFonts w:ascii="Times New Roman" w:hAnsi="Times New Roman" w:cs="Times New Roman"/>
-        </w:rPr>
-        <w:t>В. С.</w:t>
-      </w:r>
-    </w:p>
-    <w:p>
-      <w:pPr>
-        <w:jc w:val="center"/>
-        <w:rPr>
-          <w:rFonts w:ascii="Times New Roman" w:hAnsi="Times New Roman" w:cs="Times New Roman"/>
-        </w:rPr>
-      </w:pPr>
+        <w:t xml:space="preserve">                                              </w:t>
+      </w:r>
       <w:r>
         <w:rPr>
           <w:rFonts w:ascii="Times New Roman" w:hAnsi="Times New Roman" w:cs="Times New Roman"/>
           <w:b/>
           <w:bCs/>
         </w:rPr>
-        <w:t xml:space="preserve">                                                         </w:t>
+        <w:t>Выполнил</w:t>
       </w:r>
       <w:r>
         <w:rPr>
@@ -426,46 +375,117 @@
           <w:b/>
           <w:bCs/>
         </w:rPr>
-        <w:t xml:space="preserve">      </w:t>
-      </w:r>
-      <w:r>
+        <w:t>:</w:t>
+      </w:r>
+    </w:p>
+    <w:p>
+      <w:pPr>
+        <w:ind w:left="3540" w:firstLine="708"/>
+        <w:jc w:val="center"/>
         <w:rPr>
           <w:rFonts w:ascii="Times New Roman" w:hAnsi="Times New Roman" w:cs="Times New Roman"/>
         </w:rPr>
-        <w:t>(Подпись)</w:t>
+      </w:pPr>
+      <w:r>
+        <w:rPr>
+          <w:rFonts w:ascii="Times New Roman" w:hAnsi="Times New Roman" w:cs="Times New Roman"/>
+        </w:rPr>
+        <w:t xml:space="preserve">  </w:t>
+      </w:r>
+      <w:r>
+        <w:rPr>
+          <w:rFonts w:ascii="Times New Roman" w:hAnsi="Times New Roman" w:cs="Times New Roman"/>
+        </w:rPr>
+        <w:t>студент группы 3823Б1ПР2</w:t>
+      </w:r>
+    </w:p>
+    <w:p>
+      <w:pPr>
+        <w:jc w:val="right"/>
+        <w:rPr>
+          <w:rFonts w:ascii="Times New Roman" w:hAnsi="Times New Roman" w:cs="Times New Roman"/>
+        </w:rPr>
+      </w:pPr>
+      <w:r>
+        <w:rPr>
+          <w:rFonts w:ascii="Times New Roman" w:hAnsi="Times New Roman" w:cs="Times New Roman"/>
+        </w:rPr>
+        <w:t>____________________ Клименко</w:t>
+      </w:r>
+      <w:r>
+        <w:rPr>
+          <w:rFonts w:ascii="Times New Roman" w:hAnsi="Times New Roman" w:cs="Times New Roman"/>
+        </w:rPr>
+        <w:t xml:space="preserve"> </w:t>
+      </w:r>
+      <w:r>
+        <w:rPr>
+          <w:rFonts w:ascii="Times New Roman" w:hAnsi="Times New Roman" w:cs="Times New Roman"/>
+        </w:rPr>
+        <w:t>В. С.</w:t>
       </w:r>
     </w:p>
     <w:p>
       <w:pPr>
         <w:jc w:val="center"/>
+        <w:rPr>
+          <w:rFonts w:ascii="Times New Roman" w:hAnsi="Times New Roman" w:cs="Times New Roman"/>
+        </w:rPr>
+      </w:pPr>
+      <w:r>
         <w:rPr>
           <w:rFonts w:ascii="Times New Roman" w:hAnsi="Times New Roman" w:cs="Times New Roman"/>
           <w:b/>
           <w:bCs/>
         </w:rPr>
-      </w:pPr>
+        <w:t xml:space="preserve">                                                         </w:t>
+      </w:r>
       <w:r>
         <w:rPr>
           <w:rFonts w:ascii="Times New Roman" w:hAnsi="Times New Roman" w:cs="Times New Roman"/>
           <w:b/>
           <w:bCs/>
         </w:rPr>
-        <w:t xml:space="preserve">                                                                      </w:t>
-      </w:r>
-      <w:r>
+        <w:t xml:space="preserve">      </w:t>
+      </w:r>
+      <w:r>
+        <w:rPr>
+          <w:rFonts w:ascii="Times New Roman" w:hAnsi="Times New Roman" w:cs="Times New Roman"/>
+        </w:rPr>
+        <w:t>(Подпись)</w:t>
+      </w:r>
+    </w:p>
+    <w:p>
+      <w:pPr>
+        <w:jc w:val="center"/>
         <w:rPr>
           <w:rFonts w:ascii="Times New Roman" w:hAnsi="Times New Roman" w:cs="Times New Roman"/>
           <w:b/>
           <w:bCs/>
         </w:rPr>
-        <w:t>Научный руководитель</w:t>
-      </w:r>
+      </w:pPr>
       <w:r>
         <w:rPr>
           <w:rFonts w:ascii="Times New Roman" w:hAnsi="Times New Roman" w:cs="Times New Roman"/>
           <w:b/>
           <w:bCs/>
         </w:rPr>
+        <w:t xml:space="preserve">                                                                      </w:t>
+      </w:r>
+      <w:r>
+        <w:rPr>
+          <w:rFonts w:ascii="Times New Roman" w:hAnsi="Times New Roman" w:cs="Times New Roman"/>
+          <w:b/>
+          <w:bCs/>
+        </w:rPr>
+        <w:t>Научный руководитель</w:t>
+      </w:r>
+      <w:r>
+        <w:rPr>
+          <w:rFonts w:ascii="Times New Roman" w:hAnsi="Times New Roman" w:cs="Times New Roman"/>
+          <w:b/>
+          <w:bCs/>
+        </w:rPr>
         <w:t>:</w:t>
       </w:r>
     </w:p>
@@ -487,7 +507,21 @@
         <w:rPr>
           <w:rFonts w:ascii="Times New Roman" w:hAnsi="Times New Roman" w:cs="Times New Roman"/>
         </w:rPr>
-        <w:t xml:space="preserve">кандидат ф.м.н., доцент </w:t>
+        <w:t xml:space="preserve">кандидат </w:t>
+      </w:r>
+      <w:proofErr w:type="spellStart"/>
+      <w:r>
+        <w:rPr>
+          <w:rFonts w:ascii="Times New Roman" w:hAnsi="Times New Roman" w:cs="Times New Roman"/>
+        </w:rPr>
+        <w:t>ф.м.н</w:t>
+      </w:r>
+      <w:proofErr w:type="spellEnd"/>
+      <w:r>
+        <w:rPr>
+          <w:rFonts w:ascii="Times New Roman" w:hAnsi="Times New Roman" w:cs="Times New Roman"/>
+        </w:rPr>
+        <w:t xml:space="preserve">., доцент </w:t>
       </w:r>
     </w:p>
     <w:p>
@@ -6788,21 +6822,25 @@
       <w:r>
         <w:t xml:space="preserve">Для временного хранения данных бронирования на клиентской стороне используются механизмы </w:t>
       </w:r>
+      <w:proofErr w:type="spellStart"/>
       <w:r>
         <w:rPr>
           <w:lang w:val="en-US"/>
         </w:rPr>
         <w:t>localStorage</w:t>
       </w:r>
+      <w:proofErr w:type="spellEnd"/>
       <w:r>
         <w:t xml:space="preserve"> и </w:t>
       </w:r>
+      <w:proofErr w:type="spellStart"/>
       <w:r>
         <w:rPr>
           <w:lang w:val="en-US"/>
         </w:rPr>
         <w:t>sessionStorage</w:t>
       </w:r>
+      <w:proofErr w:type="spellEnd"/>
       <w:r>
         <w:t>, что позволяет сохранять состояние между страницами без необходимости повторного обращения к серверу.</w:t>
       </w:r>
@@ -7657,8 +7695,8 @@
       <w:pPr>
         <w:pStyle w:val="0213"/>
       </w:pPr>
-      <w:bookmarkStart w:id="19" w:name="_Hlk230079966"/>
-      <w:bookmarkStart w:id="20" w:name="_Toc230988466"/>
+      <w:bookmarkStart w:id="19" w:name="_Toc230988466"/>
+      <w:bookmarkStart w:id="20" w:name="_Hlk230079966"/>
       <w:r>
         <w:t>2</w:t>
       </w:r>
@@ -7671,15 +7709,63 @@
       <w:r>
         <w:t xml:space="preserve"> Система аутентификации и авторизации</w:t>
       </w:r>
-      <w:bookmarkEnd w:id="20"/>
-    </w:p>
-    <w:bookmarkEnd w:id="19"/>
+      <w:bookmarkEnd w:id="19"/>
+    </w:p>
+    <w:bookmarkEnd w:id="20"/>
     <w:p>
       <w:pPr>
         <w:pStyle w:val="03"/>
       </w:pPr>
       <w:r>
-        <w:t xml:space="preserve">В рамках реализации ролевой модели доступа была разработана система авторизации, которая при входе пользователя проверяет его принадлежность к категории администраторов. При успешной аутентификации система выполняет дополнительный запрос к эндпоинту StaffAdvanced/byUser/{userUid} для определения наличия у пользователя административных прав. В зависимости от результата проверки в localStorage устанавливается флаг isStaff, который используется для разграничения доступа на клиентской стороне. </w:t>
+        <w:t xml:space="preserve">В рамках реализации ролевой модели доступа была разработана система авторизации, которая при входе пользователя проверяет его принадлежность к категории администраторов. При успешной аутентификации система выполняет дополнительный запрос к </w:t>
+      </w:r>
+      <w:proofErr w:type="spellStart"/>
+      <w:r>
+        <w:t>эндпоинту</w:t>
+      </w:r>
+      <w:proofErr w:type="spellEnd"/>
+      <w:r>
+        <w:t xml:space="preserve"> </w:t>
+      </w:r>
+      <w:proofErr w:type="spellStart"/>
+      <w:r>
+        <w:t>StaffAdvanced</w:t>
+      </w:r>
+      <w:proofErr w:type="spellEnd"/>
+      <w:r>
+        <w:t>/</w:t>
+      </w:r>
+      <w:proofErr w:type="spellStart"/>
+      <w:r>
+        <w:t>byUser</w:t>
+      </w:r>
+      <w:proofErr w:type="spellEnd"/>
+      <w:r>
+        <w:t>/{</w:t>
+      </w:r>
+      <w:proofErr w:type="spellStart"/>
+      <w:r>
+        <w:t>userUid</w:t>
+      </w:r>
+      <w:proofErr w:type="spellEnd"/>
+      <w:r>
+        <w:t xml:space="preserve">} для определения наличия у пользователя административных прав. В зависимости от результата проверки в </w:t>
+      </w:r>
+      <w:proofErr w:type="spellStart"/>
+      <w:r>
+        <w:t>localStorage</w:t>
+      </w:r>
+      <w:proofErr w:type="spellEnd"/>
+      <w:r>
+        <w:t xml:space="preserve"> устанавливается флаг </w:t>
+      </w:r>
+      <w:proofErr w:type="spellStart"/>
+      <w:r>
+        <w:t>isStaff</w:t>
+      </w:r>
+      <w:proofErr w:type="spellEnd"/>
+      <w:r>
+        <w:t xml:space="preserve">, который используется для разграничения доступа на клиентской стороне. </w:t>
       </w:r>
     </w:p>
     <w:p>
@@ -7755,12 +7841,14 @@
       <w:r>
         <w:t>.</w:t>
       </w:r>
+      <w:proofErr w:type="spellStart"/>
       <w:r>
         <w:rPr>
           <w:lang w:val="en-US"/>
         </w:rPr>
         <w:t>js</w:t>
       </w:r>
+      <w:proofErr w:type="spellEnd"/>
       <w:r>
         <w:t>)</w:t>
       </w:r>
@@ -7809,7 +7897,15 @@
         <w:t>п</w:t>
       </w:r>
       <w:r>
-        <w:t>ри отсутствии прав выполняется редирект на страницу входа.</w:t>
+        <w:t xml:space="preserve">ри отсутствии прав выполняется </w:t>
+      </w:r>
+      <w:proofErr w:type="spellStart"/>
+      <w:r>
+        <w:t>редирект</w:t>
+      </w:r>
+      <w:proofErr w:type="spellEnd"/>
+      <w:r>
+        <w:t xml:space="preserve"> на страницу входа.</w:t>
       </w:r>
     </w:p>
     <w:p>
@@ -7817,7 +7913,47 @@
         <w:pStyle w:val="03"/>
       </w:pPr>
       <w:r>
-        <w:t>Реализован механизм автоматического обновления статусов бронирований при загрузке страницы. Система отправляет POST-запрос к эндпоинту admin/refresh-expired-statuses, который переводит просроченные бронирования из статуса "in progress" в статус "completed".</w:t>
+        <w:t xml:space="preserve">Реализован механизм автоматического обновления статусов бронирований при загрузке страницы. Система отправляет POST-запрос к </w:t>
+      </w:r>
+      <w:proofErr w:type="spellStart"/>
+      <w:r>
+        <w:t>эндпоинту</w:t>
+      </w:r>
+      <w:proofErr w:type="spellEnd"/>
+      <w:r>
+        <w:t> admin/</w:t>
+      </w:r>
+      <w:proofErr w:type="spellStart"/>
+      <w:r>
+        <w:t>refresh-expired-statuses</w:t>
+      </w:r>
+      <w:proofErr w:type="spellEnd"/>
+      <w:r>
+        <w:t>, который переводит просроченные бронирования из статуса "</w:t>
+      </w:r>
+      <w:proofErr w:type="spellStart"/>
+      <w:r>
+        <w:t>in</w:t>
+      </w:r>
+      <w:proofErr w:type="spellEnd"/>
+      <w:r>
+        <w:t xml:space="preserve"> </w:t>
+      </w:r>
+      <w:proofErr w:type="spellStart"/>
+      <w:r>
+        <w:t>progress</w:t>
+      </w:r>
+      <w:proofErr w:type="spellEnd"/>
+      <w:r>
+        <w:t>" в статус "</w:t>
+      </w:r>
+      <w:proofErr w:type="spellStart"/>
+      <w:r>
+        <w:t>completed</w:t>
+      </w:r>
+      <w:proofErr w:type="spellEnd"/>
+      <w:r>
+        <w:t>".</w:t>
       </w:r>
     </w:p>
     <w:p>
@@ -7847,7 +7983,15 @@
         <w:t>д</w:t>
       </w:r>
       <w:r>
-        <w:t>анные пользователя (ФИО, email)</w:t>
+        <w:t xml:space="preserve">анные пользователя (ФИО, </w:t>
+      </w:r>
+      <w:proofErr w:type="spellStart"/>
+      <w:r>
+        <w:t>email</w:t>
+      </w:r>
+      <w:proofErr w:type="spellEnd"/>
+      <w:r>
+        <w:t>)</w:t>
       </w:r>
       <w:r>
         <w:rPr>
@@ -7966,7 +8110,39 @@
         <w:t>о</w:t>
       </w:r>
       <w:r>
-        <w:t>тправка PUT-запроса к эндпоинту BookingsAdvanced/{bookingId}/cancel;</w:t>
+        <w:t xml:space="preserve">тправка PUT-запроса к </w:t>
+      </w:r>
+      <w:proofErr w:type="spellStart"/>
+      <w:r>
+        <w:t>эндпоинту</w:t>
+      </w:r>
+      <w:proofErr w:type="spellEnd"/>
+      <w:r>
+        <w:t xml:space="preserve"> </w:t>
+      </w:r>
+      <w:proofErr w:type="spellStart"/>
+      <w:r>
+        <w:t>BookingsAdvanced</w:t>
+      </w:r>
+      <w:proofErr w:type="spellEnd"/>
+      <w:r>
+        <w:t>/{</w:t>
+      </w:r>
+      <w:proofErr w:type="spellStart"/>
+      <w:r>
+        <w:t>bookingId</w:t>
+      </w:r>
+      <w:proofErr w:type="spellEnd"/>
+      <w:r>
+        <w:t>}/</w:t>
+      </w:r>
+      <w:proofErr w:type="spellStart"/>
+      <w:r>
+        <w:t>cancel</w:t>
+      </w:r>
+      <w:proofErr w:type="spellEnd"/>
+      <w:r>
+        <w:t>;</w:t>
       </w:r>
     </w:p>
     <w:p>
@@ -8067,14 +8243,44 @@
         </w:rPr>
         <w:t xml:space="preserve"> </w:t>
       </w:r>
+      <w:proofErr w:type="spellStart"/>
       <w:r>
         <w:t>эндпоинту</w:t>
       </w:r>
-      <w:r>
-        <w:rPr>
-          <w:lang w:val="en-US"/>
-        </w:rPr>
-        <w:t xml:space="preserve"> BookingsAdvanced/{bookingId}/reschedule</w:t>
+      <w:proofErr w:type="spellEnd"/>
+      <w:r>
+        <w:rPr>
+          <w:lang w:val="en-US"/>
+        </w:rPr>
+        <w:t xml:space="preserve"> </w:t>
+      </w:r>
+      <w:proofErr w:type="spellStart"/>
+      <w:r>
+        <w:rPr>
+          <w:lang w:val="en-US"/>
+        </w:rPr>
+        <w:t>BookingsAdvanced</w:t>
+      </w:r>
+      <w:proofErr w:type="spellEnd"/>
+      <w:r>
+        <w:rPr>
+          <w:lang w:val="en-US"/>
+        </w:rPr>
+        <w:t>/{</w:t>
+      </w:r>
+      <w:proofErr w:type="spellStart"/>
+      <w:r>
+        <w:rPr>
+          <w:lang w:val="en-US"/>
+        </w:rPr>
+        <w:t>bookingId</w:t>
+      </w:r>
+      <w:proofErr w:type="spellEnd"/>
+      <w:r>
+        <w:rPr>
+          <w:lang w:val="en-US"/>
+        </w:rPr>
+        <w:t>}/reschedule</w:t>
       </w:r>
       <w:r>
         <w:rPr>
@@ -8309,12 +8515,17 @@
       <w:pPr>
         <w:pStyle w:val="04"/>
       </w:pPr>
+      <w:proofErr w:type="spellStart"/>
       <w:r>
         <w:lastRenderedPageBreak/>
         <w:t>п</w:t>
       </w:r>
       <w:r>
-        <w:t>редзаполнение формы существующими значениями</w:t>
+        <w:t>редзаполнение</w:t>
+      </w:r>
+      <w:proofErr w:type="spellEnd"/>
+      <w:r>
+        <w:t xml:space="preserve"> формы существующими значениями</w:t>
       </w:r>
       <w:r>
         <w:t>;</w:t>
@@ -8610,12 +8821,42 @@
           <w:lang w:val="en-US"/>
         </w:rPr>
       </w:pPr>
-      <w:r>
-        <w:rPr>
-          <w:lang w:val="en-US"/>
-        </w:rPr>
-        <w:t>количество доступных сессий</w:t>
-      </w:r>
+      <w:proofErr w:type="spellStart"/>
+      <w:r>
+        <w:rPr>
+          <w:lang w:val="en-US"/>
+        </w:rPr>
+        <w:t>количество</w:t>
+      </w:r>
+      <w:proofErr w:type="spellEnd"/>
+      <w:r>
+        <w:rPr>
+          <w:lang w:val="en-US"/>
+        </w:rPr>
+        <w:t xml:space="preserve"> </w:t>
+      </w:r>
+      <w:proofErr w:type="spellStart"/>
+      <w:r>
+        <w:rPr>
+          <w:lang w:val="en-US"/>
+        </w:rPr>
+        <w:t>доступных</w:t>
+      </w:r>
+      <w:proofErr w:type="spellEnd"/>
+      <w:r>
+        <w:rPr>
+          <w:lang w:val="en-US"/>
+        </w:rPr>
+        <w:t xml:space="preserve"> </w:t>
+      </w:r>
+      <w:proofErr w:type="spellStart"/>
+      <w:r>
+        <w:rPr>
+          <w:lang w:val="en-US"/>
+        </w:rPr>
+        <w:t>сессий</w:t>
+      </w:r>
+      <w:proofErr w:type="spellEnd"/>
       <w:r>
         <w:rPr>
           <w:lang w:val="en-US"/>
@@ -8691,37 +8932,51 @@
         <w:t>API</w:t>
       </w:r>
       <w:r>
-        <w:t>-эндпоинты, использованные в административной части:</w:t>
-      </w:r>
-    </w:p>
-    <w:p>
-      <w:pPr>
-        <w:pStyle w:val="04"/>
-      </w:pPr>
+        <w:t>-</w:t>
+      </w:r>
+      <w:proofErr w:type="spellStart"/>
+      <w:r>
+        <w:t>эндпоинты</w:t>
+      </w:r>
+      <w:proofErr w:type="spellEnd"/>
+      <w:r>
+        <w:t>, использованные в административной части:</w:t>
+      </w:r>
+    </w:p>
+    <w:p>
+      <w:pPr>
+        <w:pStyle w:val="04"/>
+      </w:pPr>
+      <w:proofErr w:type="spellStart"/>
       <w:r>
         <w:rPr>
           <w:lang w:val="en-US"/>
         </w:rPr>
         <w:t>StaffAdvanced</w:t>
       </w:r>
+      <w:proofErr w:type="spellEnd"/>
       <w:r>
         <w:t>/</w:t>
       </w:r>
+      <w:proofErr w:type="spellStart"/>
       <w:r>
         <w:rPr>
           <w:lang w:val="en-US"/>
         </w:rPr>
         <w:t>byUser</w:t>
       </w:r>
+      <w:proofErr w:type="spellEnd"/>
       <w:r>
         <w:t>/{</w:t>
       </w:r>
+      <w:proofErr w:type="spellStart"/>
       <w:r>
         <w:rPr>
           <w:lang w:val="en-US"/>
         </w:rPr>
         <w:t>userUid</w:t>
       </w:r>
+      <w:proofErr w:type="spellEnd"/>
       <w:r>
         <w:t>} — проверка административных прав;</w:t>
       </w:r>
@@ -8730,12 +8985,14 @@
       <w:pPr>
         <w:pStyle w:val="04"/>
       </w:pPr>
+      <w:proofErr w:type="spellStart"/>
       <w:r>
         <w:rPr>
           <w:lang w:val="en-US"/>
         </w:rPr>
         <w:t>BookingsAdvanced</w:t>
       </w:r>
+      <w:proofErr w:type="spellEnd"/>
       <w:r>
         <w:t>/</w:t>
       </w:r>
@@ -8756,11 +9013,19 @@
           <w:lang w:val="en-US"/>
         </w:rPr>
       </w:pPr>
-      <w:r>
-        <w:rPr>
-          <w:lang w:val="en-US"/>
-        </w:rPr>
-        <w:t xml:space="preserve">BookingsAdvanced/admin/refresh-expired-statuses — </w:t>
+      <w:proofErr w:type="spellStart"/>
+      <w:r>
+        <w:rPr>
+          <w:lang w:val="en-US"/>
+        </w:rPr>
+        <w:t>BookingsAdvanced</w:t>
+      </w:r>
+      <w:proofErr w:type="spellEnd"/>
+      <w:r>
+        <w:rPr>
+          <w:lang w:val="en-US"/>
+        </w:rPr>
+        <w:t xml:space="preserve">/admin/refresh-expired-statuses — </w:t>
       </w:r>
       <w:r>
         <w:t>обновление</w:t>
@@ -8797,11 +9062,33 @@
           <w:lang w:val="en-US"/>
         </w:rPr>
       </w:pPr>
-      <w:r>
-        <w:rPr>
-          <w:lang w:val="en-US"/>
-        </w:rPr>
-        <w:t xml:space="preserve">BookingsAdvanced/{bookingId}/cancel — </w:t>
+      <w:proofErr w:type="spellStart"/>
+      <w:r>
+        <w:rPr>
+          <w:lang w:val="en-US"/>
+        </w:rPr>
+        <w:t>BookingsAdvanced</w:t>
+      </w:r>
+      <w:proofErr w:type="spellEnd"/>
+      <w:r>
+        <w:rPr>
+          <w:lang w:val="en-US"/>
+        </w:rPr>
+        <w:t>/{</w:t>
+      </w:r>
+      <w:proofErr w:type="spellStart"/>
+      <w:r>
+        <w:rPr>
+          <w:lang w:val="en-US"/>
+        </w:rPr>
+        <w:t>bookingId</w:t>
+      </w:r>
+      <w:proofErr w:type="spellEnd"/>
+      <w:r>
+        <w:rPr>
+          <w:lang w:val="en-US"/>
+        </w:rPr>
+        <w:t xml:space="preserve">}/cancel — </w:t>
       </w:r>
       <w:r>
         <w:t>отмена</w:t>
@@ -8829,11 +9116,33 @@
           <w:lang w:val="en-US"/>
         </w:rPr>
       </w:pPr>
-      <w:r>
-        <w:rPr>
-          <w:lang w:val="en-US"/>
-        </w:rPr>
-        <w:t xml:space="preserve">BookingsAdvanced/{bookingId}/reschedule — </w:t>
+      <w:proofErr w:type="spellStart"/>
+      <w:r>
+        <w:rPr>
+          <w:lang w:val="en-US"/>
+        </w:rPr>
+        <w:t>BookingsAdvanced</w:t>
+      </w:r>
+      <w:proofErr w:type="spellEnd"/>
+      <w:r>
+        <w:rPr>
+          <w:lang w:val="en-US"/>
+        </w:rPr>
+        <w:t>/{</w:t>
+      </w:r>
+      <w:proofErr w:type="spellStart"/>
+      <w:r>
+        <w:rPr>
+          <w:lang w:val="en-US"/>
+        </w:rPr>
+        <w:t>bookingId</w:t>
+      </w:r>
+      <w:proofErr w:type="spellEnd"/>
+      <w:r>
+        <w:rPr>
+          <w:lang w:val="en-US"/>
+        </w:rPr>
+        <w:t xml:space="preserve">}/reschedule — </w:t>
       </w:r>
       <w:r>
         <w:t>перенос</w:t>
@@ -8858,12 +9167,14 @@
       <w:pPr>
         <w:pStyle w:val="04"/>
       </w:pPr>
+      <w:proofErr w:type="spellStart"/>
       <w:r>
         <w:rPr>
           <w:lang w:val="en-US"/>
         </w:rPr>
         <w:t>Equipments</w:t>
       </w:r>
+      <w:proofErr w:type="spellEnd"/>
       <w:r>
         <w:t xml:space="preserve"> — </w:t>
       </w:r>
@@ -8904,12 +9215,14 @@
       <w:pPr>
         <w:pStyle w:val="04"/>
       </w:pPr>
+      <w:proofErr w:type="spellStart"/>
       <w:r>
         <w:rPr>
           <w:lang w:val="en-US"/>
         </w:rPr>
         <w:t>SubscriptionPlans</w:t>
       </w:r>
+      <w:proofErr w:type="spellEnd"/>
       <w:r>
         <w:t xml:space="preserve"> — </w:t>
       </w:r>
@@ -8944,25 +9257,37 @@
         <w:pStyle w:val="04"/>
       </w:pPr>
       <w:r>
-        <w:t>передача staff</w:t>
-      </w:r>
+        <w:t xml:space="preserve">передача </w:t>
+      </w:r>
+      <w:proofErr w:type="spellStart"/>
+      <w:r>
+        <w:t>staff</w:t>
+      </w:r>
+      <w:proofErr w:type="spellEnd"/>
       <w:r>
         <w:rPr>
           <w:lang w:val="en-US"/>
         </w:rPr>
         <w:t>U</w:t>
       </w:r>
+      <w:proofErr w:type="spellStart"/>
       <w:r>
         <w:t>ser</w:t>
       </w:r>
+      <w:proofErr w:type="spellEnd"/>
       <w:r>
         <w:rPr>
           <w:lang w:val="en-US"/>
         </w:rPr>
         <w:t>U</w:t>
       </w:r>
-      <w:r>
-        <w:t>id в теле запросов для аудита действий;</w:t>
+      <w:proofErr w:type="spellStart"/>
+      <w:r>
+        <w:t>id</w:t>
+      </w:r>
+      <w:proofErr w:type="spellEnd"/>
+      <w:r>
+        <w:t xml:space="preserve"> в теле запросов для аудита действий;</w:t>
       </w:r>
     </w:p>
     <w:p>
@@ -9132,24 +9457,47 @@
       <w:pPr>
         <w:pStyle w:val="04"/>
       </w:pPr>
-      <w:r>
-        <w:t>in progress — активное бронирование, период действия которого ещё не завершён;</w:t>
-      </w:r>
-    </w:p>
-    <w:p>
-      <w:pPr>
-        <w:pStyle w:val="04"/>
-      </w:pPr>
-      <w:r>
-        <w:t>completed — бронирование, период действия которого успешно завершён;</w:t>
-      </w:r>
-    </w:p>
-    <w:p>
-      <w:pPr>
-        <w:pStyle w:val="04"/>
-      </w:pPr>
-      <w:r>
-        <w:t>cancelled — бронирование, отменённое пользователем или администратором до наступления времени начала.</w:t>
+      <w:proofErr w:type="spellStart"/>
+      <w:r>
+        <w:t>in</w:t>
+      </w:r>
+      <w:proofErr w:type="spellEnd"/>
+      <w:r>
+        <w:t xml:space="preserve"> </w:t>
+      </w:r>
+      <w:proofErr w:type="spellStart"/>
+      <w:r>
+        <w:t>progress</w:t>
+      </w:r>
+      <w:proofErr w:type="spellEnd"/>
+      <w:r>
+        <w:t xml:space="preserve"> — активное бронирование, период действия которого ещё не завершён;</w:t>
+      </w:r>
+    </w:p>
+    <w:p>
+      <w:pPr>
+        <w:pStyle w:val="04"/>
+      </w:pPr>
+      <w:proofErr w:type="spellStart"/>
+      <w:r>
+        <w:t>completed</w:t>
+      </w:r>
+      <w:proofErr w:type="spellEnd"/>
+      <w:r>
+        <w:t xml:space="preserve"> — бронирование, период действия которого успешно завершён;</w:t>
+      </w:r>
+    </w:p>
+    <w:p>
+      <w:pPr>
+        <w:pStyle w:val="04"/>
+      </w:pPr>
+      <w:proofErr w:type="spellStart"/>
+      <w:r>
+        <w:t>cancelled</w:t>
+      </w:r>
+      <w:proofErr w:type="spellEnd"/>
+      <w:r>
+        <w:t xml:space="preserve"> — бронирование, отменённое пользователем или администратором до наступления времени начала.</w:t>
       </w:r>
     </w:p>
     <w:p>
@@ -9157,7 +9505,23 @@
         <w:pStyle w:val="03"/>
       </w:pPr>
       <w:r>
-        <w:t>Однако в исходной реализации отсутствовал механизм автоматического обновления статусов бронирований по истечении их временного периода. Это приводило к ситуации, когда бронирование, время окончания которого уже наступило, продолжало числиться в статусе "in progress", что искажало статистику и создавало неудобства при администрировании.</w:t>
+        <w:t>Однако в исходной реализации отсутствовал механизм автоматического обновления статусов бронирований по истечении их временного периода. Это приводило к ситуации, когда бронирование, время окончания которого уже наступило, продолжало числиться в статусе "</w:t>
+      </w:r>
+      <w:proofErr w:type="spellStart"/>
+      <w:r>
+        <w:t>in</w:t>
+      </w:r>
+      <w:proofErr w:type="spellEnd"/>
+      <w:r>
+        <w:t xml:space="preserve"> </w:t>
+      </w:r>
+      <w:proofErr w:type="spellStart"/>
+      <w:r>
+        <w:t>progress</w:t>
+      </w:r>
+      <w:proofErr w:type="spellEnd"/>
+      <w:r>
+        <w:t>", что искажало статистику и создавало неудобства при администрировании.</w:t>
       </w:r>
     </w:p>
     <w:p>
@@ -9189,7 +9553,15 @@
         <w:pStyle w:val="03"/>
       </w:pPr>
       <w:r>
-        <w:t>Создан дополнительный эндпоинт на стороне сервера:</w:t>
+        <w:t xml:space="preserve">Создан дополнительный </w:t>
+      </w:r>
+      <w:proofErr w:type="spellStart"/>
+      <w:r>
+        <w:t>эндпоинт</w:t>
+      </w:r>
+      <w:proofErr w:type="spellEnd"/>
+      <w:r>
+        <w:t xml:space="preserve"> на стороне сервера:</w:t>
       </w:r>
     </w:p>
     <w:p>
@@ -9206,7 +9578,35 @@
         <w:rPr>
           <w:lang w:val="en-US"/>
         </w:rPr>
-        <w:t>: POST /api/BookingsAdvanced/admin/refresh-expired-statuses</w:t>
+        <w:t>: POST /</w:t>
+      </w:r>
+      <w:proofErr w:type="spellStart"/>
+      <w:r>
+        <w:rPr>
+          <w:lang w:val="en-US"/>
+        </w:rPr>
+        <w:t>api</w:t>
+      </w:r>
+      <w:proofErr w:type="spellEnd"/>
+      <w:r>
+        <w:rPr>
+          <w:lang w:val="en-US"/>
+        </w:rPr>
+        <w:t>/</w:t>
+      </w:r>
+      <w:proofErr w:type="spellStart"/>
+      <w:r>
+        <w:rPr>
+          <w:lang w:val="en-US"/>
+        </w:rPr>
+        <w:t>BookingsAdvanced</w:t>
+      </w:r>
+      <w:proofErr w:type="spellEnd"/>
+      <w:r>
+        <w:rPr>
+          <w:lang w:val="en-US"/>
+        </w:rPr>
+        <w:t>/admin/refresh-expired-statuses</w:t>
       </w:r>
     </w:p>
     <w:p>
@@ -9214,7 +9614,23 @@
         <w:pStyle w:val="03"/>
       </w:pPr>
       <w:r>
-        <w:t>Назначение: поиск и обновление всех просроченных бронирований, имеющих статус "in progress"</w:t>
+        <w:t>Назначение: поиск и обновление всех просроченных бронирований, имеющих статус "</w:t>
+      </w:r>
+      <w:proofErr w:type="spellStart"/>
+      <w:r>
+        <w:t>in</w:t>
+      </w:r>
+      <w:proofErr w:type="spellEnd"/>
+      <w:r>
+        <w:t xml:space="preserve"> </w:t>
+      </w:r>
+      <w:proofErr w:type="spellStart"/>
+      <w:r>
+        <w:t>progress</w:t>
+      </w:r>
+      <w:proofErr w:type="spellEnd"/>
+      <w:r>
+        <w:t>"</w:t>
       </w:r>
     </w:p>
     <w:p>
@@ -9222,8 +9638,13 @@
         <w:pStyle w:val="03"/>
       </w:pPr>
       <w:r>
-        <w:t>На стороне клиента (административная панель) реализован вызов данного эндпоинта</w:t>
-      </w:r>
+        <w:t xml:space="preserve">На стороне клиента (административная панель) реализован вызов данного </w:t>
+      </w:r>
+      <w:proofErr w:type="spellStart"/>
+      <w:r>
+        <w:t>эндпоинта</w:t>
+      </w:r>
+      <w:proofErr w:type="spellEnd"/>
       <w:r>
         <w:t>.</w:t>
       </w:r>
@@ -9252,7 +9673,23 @@
         <w:pStyle w:val="04"/>
       </w:pPr>
       <w:r>
-        <w:t>сервер проверяет все бронирования со статусом "in progress" и сравнивает время их окончания с текущей датой и временем</w:t>
+        <w:t>сервер проверяет все бронирования со статусом "</w:t>
+      </w:r>
+      <w:proofErr w:type="spellStart"/>
+      <w:r>
+        <w:t>in</w:t>
+      </w:r>
+      <w:proofErr w:type="spellEnd"/>
+      <w:r>
+        <w:t xml:space="preserve"> </w:t>
+      </w:r>
+      <w:proofErr w:type="spellStart"/>
+      <w:r>
+        <w:t>progress</w:t>
+      </w:r>
+      <w:proofErr w:type="spellEnd"/>
+      <w:r>
+        <w:t>" и сравнивает время их окончания с текущей датой и временем</w:t>
       </w:r>
       <w:r>
         <w:t>;</w:t>
@@ -9263,7 +9700,15 @@
         <w:pStyle w:val="04"/>
       </w:pPr>
       <w:r>
-        <w:t>для бронирований, у которых время окончания меньше текущего момента, статус автоматически изменяется на "completed"</w:t>
+        <w:t>для бронирований, у которых время окончания меньше текущего момента, статус автоматически изменяется на "</w:t>
+      </w:r>
+      <w:proofErr w:type="spellStart"/>
+      <w:r>
+        <w:t>completed</w:t>
+      </w:r>
+      <w:proofErr w:type="spellEnd"/>
+      <w:r>
+        <w:t>"</w:t>
       </w:r>
       <w:r>
         <w:t>;</w:t>
@@ -9309,7 +9754,15 @@
         <w:pStyle w:val="04"/>
       </w:pPr>
       <w:r>
-        <w:t>автоматизация процесса: исключена необходимость ручного перевода бронирований в статус "completed" после их фактического завершения</w:t>
+        <w:t>автоматизация процесса: исключена необходимость ручного перевода бронирований в статус "</w:t>
+      </w:r>
+      <w:proofErr w:type="spellStart"/>
+      <w:r>
+        <w:t>completed</w:t>
+      </w:r>
+      <w:proofErr w:type="spellEnd"/>
+      <w:r>
+        <w:t>" после их фактического завершения</w:t>
       </w:r>
       <w:r>
         <w:t>;</w:t>
@@ -9386,7 +9839,15 @@
         <w:pStyle w:val="03"/>
       </w:pPr>
       <w:r>
-        <w:t xml:space="preserve">В процессе эксплуатации информационной системы была выявлена проблема согласованности данных при переносе бронирований администратором. Исходная архитектура системы предполагала, что после выполнения администратором операции переноса (reschedule) бронирования на новую дату и время, пользователь, просматривая свои бронирования в личном кабинете, продолжает видеть старые, неактуальные даты. Это создавало путаницу и могло приводить к пропуску пользователем актуального времени бронирования. </w:t>
+        <w:t>В процессе эксплуатации информационной системы была выявлена проблема согласованности данных при переносе бронирований администратором. Исходная архитектура системы предполагала, что после выполнения администратором операции переноса (</w:t>
+      </w:r>
+      <w:proofErr w:type="spellStart"/>
+      <w:r>
+        <w:t>reschedule</w:t>
+      </w:r>
+      <w:proofErr w:type="spellEnd"/>
+      <w:r>
+        <w:t xml:space="preserve">) бронирования на новую дату и время, пользователь, просматривая свои бронирования в личном кабинете, продолжает видеть старые, неактуальные даты. Это создавало путаницу и могло приводить к пропуску пользователем актуального времени бронирования. </w:t>
       </w:r>
     </w:p>
     <w:p>
@@ -9412,7 +9873,39 @@
         <w:pStyle w:val="04"/>
       </w:pPr>
       <w:r>
-        <w:t>API-запросы к серверу — для получения актуальных бронирований конкретного пользователя через эндпоинт BookingsAdvanced/userHistory/{userId}</w:t>
+        <w:t xml:space="preserve">API-запросы к серверу — для получения актуальных бронирований конкретного пользователя через </w:t>
+      </w:r>
+      <w:proofErr w:type="spellStart"/>
+      <w:r>
+        <w:t>эндпоинт</w:t>
+      </w:r>
+      <w:proofErr w:type="spellEnd"/>
+      <w:r>
+        <w:t xml:space="preserve"> </w:t>
+      </w:r>
+      <w:proofErr w:type="spellStart"/>
+      <w:r>
+        <w:t>BookingsAdvanced</w:t>
+      </w:r>
+      <w:proofErr w:type="spellEnd"/>
+      <w:r>
+        <w:t>/</w:t>
+      </w:r>
+      <w:proofErr w:type="spellStart"/>
+      <w:r>
+        <w:t>userHistory</w:t>
+      </w:r>
+      <w:proofErr w:type="spellEnd"/>
+      <w:r>
+        <w:t>/{</w:t>
+      </w:r>
+      <w:proofErr w:type="spellStart"/>
+      <w:r>
+        <w:t>userId</w:t>
+      </w:r>
+      <w:proofErr w:type="spellEnd"/>
+      <w:r>
+        <w:t>}</w:t>
       </w:r>
       <w:r>
         <w:t>;</w:t>
@@ -9423,7 +9916,15 @@
         <w:pStyle w:val="04"/>
       </w:pPr>
       <w:r>
-        <w:t>локальное хранилище (localStorage) — для кэширования истории бронирований с целью обеспечения работы приложения при отсутствии соединения с сервером</w:t>
+        <w:t>локальное хранилище (</w:t>
+      </w:r>
+      <w:proofErr w:type="spellStart"/>
+      <w:r>
+        <w:t>localStorage</w:t>
+      </w:r>
+      <w:proofErr w:type="spellEnd"/>
+      <w:r>
+        <w:t>) — для кэширования истории бронирований с целью обеспечения работы приложения при отсутствии соединения с сервером</w:t>
       </w:r>
       <w:r>
         <w:t>.</w:t>
@@ -9472,7 +9973,15 @@
       </w:pPr>
       <w:r>
         <w:lastRenderedPageBreak/>
-        <w:t>В функции loadBookingsFromAPI реализован механизм принудительной загрузки актуальных данных из API при каждом переходе пользователя на страницу профиля.</w:t>
+        <w:t xml:space="preserve">В функции </w:t>
+      </w:r>
+      <w:proofErr w:type="spellStart"/>
+      <w:r>
+        <w:t>loadBookingsFromAPI</w:t>
+      </w:r>
+      <w:proofErr w:type="spellEnd"/>
+      <w:r>
+        <w:t xml:space="preserve"> реализован механизм принудительной загрузки актуальных данных из API при каждом переходе пользователя на страницу профиля.</w:t>
       </w:r>
     </w:p>
     <w:p>
@@ -9480,7 +9989,15 @@
         <w:pStyle w:val="03"/>
       </w:pPr>
       <w:r>
-        <w:t>2. Автоматическое обновление localStorage после успешной операции переноса.</w:t>
+        <w:t xml:space="preserve">2. Автоматическое обновление </w:t>
+      </w:r>
+      <w:proofErr w:type="spellStart"/>
+      <w:r>
+        <w:t>localStorage</w:t>
+      </w:r>
+      <w:proofErr w:type="spellEnd"/>
+      <w:r>
+        <w:t xml:space="preserve"> после успешной операции переноса.</w:t>
       </w:r>
     </w:p>
     <w:p>
@@ -9496,7 +10013,15 @@
         <w:pStyle w:val="03"/>
       </w:pPr>
       <w:r>
-        <w:t>3. Механизм обогащения данных (enrichBookingsWithDetails).</w:t>
+        <w:t>3. Механизм обогащения данных (</w:t>
+      </w:r>
+      <w:proofErr w:type="spellStart"/>
+      <w:r>
+        <w:t>enrichBookingsWithDetails</w:t>
+      </w:r>
+      <w:proofErr w:type="spellEnd"/>
+      <w:r>
+        <w:t>).</w:t>
       </w:r>
     </w:p>
     <w:p>
@@ -9504,7 +10029,15 @@
         <w:pStyle w:val="03"/>
       </w:pPr>
       <w:r>
-        <w:t>Для корректного отображения информации о бронировании после переноса была реализована функция enrichBookingsWithDetails, которая:</w:t>
+        <w:t xml:space="preserve">Для корректного отображения информации о бронировании после переноса была реализована функция </w:t>
+      </w:r>
+      <w:proofErr w:type="spellStart"/>
+      <w:r>
+        <w:t>enrichBookingsWithDetails</w:t>
+      </w:r>
+      <w:proofErr w:type="spellEnd"/>
+      <w:r>
+        <w:t>, которая:</w:t>
       </w:r>
     </w:p>
     <w:p>
@@ -9564,9 +10097,6 @@
         <w:t>.</w:t>
       </w:r>
       <w:r>
-        <w:rPr>
-          <w:lang w:val="en-US"/>
-        </w:rPr>
         <w:t>4</w:t>
       </w:r>
       <w:r>
@@ -9705,7 +10235,23 @@
         <w:pStyle w:val="04"/>
       </w:pPr>
       <w:r>
-        <w:t>кнопка "Перенести" — для каждого активного бронирования (со статусом "in progress") в административной панели отображается кнопка переноса</w:t>
+        <w:t>кнопка "Перенести" — для каждого активного бронирования (со статусом "</w:t>
+      </w:r>
+      <w:proofErr w:type="spellStart"/>
+      <w:r>
+        <w:t>in</w:t>
+      </w:r>
+      <w:proofErr w:type="spellEnd"/>
+      <w:r>
+        <w:t xml:space="preserve"> </w:t>
+      </w:r>
+      <w:proofErr w:type="spellStart"/>
+      <w:r>
+        <w:t>progress</w:t>
+      </w:r>
+      <w:proofErr w:type="spellEnd"/>
+      <w:r>
+        <w:t>") в административной панели отображается кнопка переноса</w:t>
       </w:r>
       <w:r>
         <w:t>,</w:t>
@@ -9728,13 +10274,29 @@
         <w:pStyle w:val="04"/>
       </w:pPr>
       <w:r>
-        <w:t>модальное окно выбора даты и времени — при нажатии на кнопку переноса открывается кастомное модальное окно, позволяющее администратору выбрать новую дату и время</w:t>
+        <w:t xml:space="preserve">модальное окно выбора даты и времени — при нажатии на кнопку переноса открывается </w:t>
+      </w:r>
+      <w:proofErr w:type="spellStart"/>
+      <w:r>
+        <w:t>кастомное</w:t>
+      </w:r>
+      <w:proofErr w:type="spellEnd"/>
+      <w:r>
+        <w:t xml:space="preserve"> модальное окно, позволяющее администратору выбрать новую дату и время</w:t>
       </w:r>
       <w:r>
         <w:t>, о</w:t>
       </w:r>
       <w:r>
-        <w:t>кно реализовано с использованием собственного компонента showDateTimePicker, который обеспечивает единообразный интерфейс для выбора временных параметров.</w:t>
+        <w:t xml:space="preserve">кно реализовано с использованием собственного компонента </w:t>
+      </w:r>
+      <w:proofErr w:type="spellStart"/>
+      <w:r>
+        <w:t>showDateTimePicker</w:t>
+      </w:r>
+      <w:proofErr w:type="spellEnd"/>
+      <w:r>
+        <w:t>, который обеспечивает единообразный интерфейс для выбора временных параметров.</w:t>
       </w:r>
     </w:p>
     <w:p>
@@ -9805,7 +10367,15 @@
         <w:pStyle w:val="04"/>
       </w:pPr>
       <w:r>
-        <w:t>обратная связь — после успешного переноса пользователь получает подтверждение через alert-сообщение, а страница автоматически обновляется для отображения актуальных данных.</w:t>
+        <w:t xml:space="preserve">обратная связь — после успешного переноса пользователь получает подтверждение через </w:t>
+      </w:r>
+      <w:proofErr w:type="spellStart"/>
+      <w:r>
+        <w:t>alert</w:t>
+      </w:r>
+      <w:proofErr w:type="spellEnd"/>
+      <w:r>
+        <w:t>-сообщение, а страница автоматически обновляется для отображения актуальных данных.</w:t>
       </w:r>
     </w:p>
     <w:p>
@@ -9897,7 +10467,15 @@
         <w:t>в</w:t>
       </w:r>
       <w:r>
-        <w:t>озможность изменения всех параметров существующего инструмента через модальное окно с предзаполненными данными;</w:t>
+        <w:t xml:space="preserve">озможность изменения всех параметров существующего инструмента через модальное окно с </w:t>
+      </w:r>
+      <w:proofErr w:type="spellStart"/>
+      <w:r>
+        <w:t>предзаполненными</w:t>
+      </w:r>
+      <w:proofErr w:type="spellEnd"/>
+      <w:r>
+        <w:t xml:space="preserve"> данными;</w:t>
       </w:r>
     </w:p>
     <w:p>
@@ -9958,7 +10536,15 @@
         <w:t>к</w:t>
       </w:r>
       <w:r>
-        <w:t>нопка удаления (крестик) на карточке инструмента — для каждого инструмента в каталоге администратор видит кнопку удаления. При нажатии выполняется проверка через confirm-диалог, после чего отправляется DELETE-запрос на сервер, и карточка инструмента удаляется из DOM.</w:t>
+        <w:t xml:space="preserve">нопка удаления (крестик) на карточке инструмента — для каждого инструмента в каталоге администратор видит кнопку удаления. При нажатии выполняется проверка через </w:t>
+      </w:r>
+      <w:proofErr w:type="spellStart"/>
+      <w:r>
+        <w:t>confirm</w:t>
+      </w:r>
+      <w:proofErr w:type="spellEnd"/>
+      <w:r>
+        <w:t>-диалог, после чего отправляется DELETE-запрос на сервер, и карточка инструмента удаляется из DOM.</w:t>
       </w:r>
     </w:p>
     <w:p>
@@ -10202,7 +10788,15 @@
         <w:pStyle w:val="03"/>
       </w:pPr>
       <w:r>
-        <w:t>Для управления отображением цен на клиентской части реализован механизм кастомных карточек цен:</w:t>
+        <w:t xml:space="preserve">Для управления отображением цен на клиентской части реализован механизм </w:t>
+      </w:r>
+      <w:proofErr w:type="spellStart"/>
+      <w:r>
+        <w:t>кастомных</w:t>
+      </w:r>
+      <w:proofErr w:type="spellEnd"/>
+      <w:r>
+        <w:t xml:space="preserve"> карточек цен:</w:t>
       </w:r>
     </w:p>
     <w:p>
@@ -10242,13 +10836,29 @@
         <w:t>;</w:t>
       </w:r>
       <w:r>
-        <w:t xml:space="preserve"> появляется возможность добавлять новые кастомные карточки</w:t>
+        <w:t xml:space="preserve"> появляется возможность добавлять новые </w:t>
+      </w:r>
+      <w:proofErr w:type="spellStart"/>
+      <w:r>
+        <w:t>кастомные</w:t>
+      </w:r>
+      <w:proofErr w:type="spellEnd"/>
+      <w:r>
+        <w:t xml:space="preserve"> карточки</w:t>
       </w:r>
       <w:r>
         <w:t>;</w:t>
       </w:r>
       <w:r>
-        <w:t xml:space="preserve"> для кастомных карточек доступно удаление</w:t>
+        <w:t xml:space="preserve"> для </w:t>
+      </w:r>
+      <w:proofErr w:type="spellStart"/>
+      <w:r>
+        <w:t>кастомных</w:t>
+      </w:r>
+      <w:proofErr w:type="spellEnd"/>
+      <w:r>
+        <w:t xml:space="preserve"> карточек доступно удаление</w:t>
       </w:r>
       <w:r>
         <w:t xml:space="preserve">; </w:t>
@@ -10268,7 +10878,23 @@
         <w:t>с</w:t>
       </w:r>
       <w:r>
-        <w:t>охранение изменений: все изменения сохраняются в localStorage под ключом customPriceCards и подгружаются при последующих загрузках страницы, переопределяя базовые цены из API.</w:t>
+        <w:t xml:space="preserve">охранение изменений: все изменения сохраняются в </w:t>
+      </w:r>
+      <w:proofErr w:type="spellStart"/>
+      <w:r>
+        <w:t>localStorage</w:t>
+      </w:r>
+      <w:proofErr w:type="spellEnd"/>
+      <w:r>
+        <w:t xml:space="preserve"> под ключом </w:t>
+      </w:r>
+      <w:proofErr w:type="spellStart"/>
+      <w:r>
+        <w:t>customPriceCards</w:t>
+      </w:r>
+      <w:proofErr w:type="spellEnd"/>
+      <w:r>
+        <w:t xml:space="preserve"> и подгружаются при последующих загрузках страницы, переопределяя базовые цены из API.</w:t>
       </w:r>
     </w:p>
     <w:p>
@@ -10311,7 +10937,23 @@
         <w:pStyle w:val="03"/>
       </w:pPr>
       <w:r>
-        <w:t xml:space="preserve">В процессе развития информационной системы музыкальной студии возникла необходимость внедрения подсистемы учёта финансовых операций. На момент начала работ в базе данных уже существовали таблицы bills_advanced и bill_items_advanced, однако они не использовались в бизнес-логике приложения. Требовалось реализовать механизм автоматического формирования счетов на основании подтверждённых бронирований с возможностью отслеживания статуса оплаты и детализации услуг. </w:t>
+        <w:t xml:space="preserve">В процессе развития информационной системы музыкальной студии возникла необходимость внедрения подсистемы учёта финансовых операций. На момент начала работ в базе данных уже существовали таблицы </w:t>
+      </w:r>
+      <w:proofErr w:type="spellStart"/>
+      <w:r>
+        <w:t>bills_advanced</w:t>
+      </w:r>
+      <w:proofErr w:type="spellEnd"/>
+      <w:r>
+        <w:t xml:space="preserve"> и </w:t>
+      </w:r>
+      <w:proofErr w:type="spellStart"/>
+      <w:r>
+        <w:t>bill_items_advanced</w:t>
+      </w:r>
+      <w:proofErr w:type="spellEnd"/>
+      <w:r>
+        <w:t xml:space="preserve">, однако они не использовались в бизнес-логике приложения. Требовалось реализовать механизм автоматического формирования счетов на основании подтверждённых бронирований с возможностью отслеживания статуса оплаты и детализации услуг. </w:t>
       </w:r>
     </w:p>
     <w:p>
@@ -10336,10 +10978,12 @@
       <w:pPr>
         <w:pStyle w:val="04"/>
       </w:pPr>
+      <w:proofErr w:type="spellStart"/>
       <w:r>
         <w:lastRenderedPageBreak/>
         <w:t>BillsAdvanced</w:t>
       </w:r>
+      <w:proofErr w:type="spellEnd"/>
       <w:r>
         <w:t xml:space="preserve">: </w:t>
       </w:r>
@@ -10354,9 +10998,11 @@
       <w:pPr>
         <w:pStyle w:val="04"/>
       </w:pPr>
+      <w:proofErr w:type="spellStart"/>
       <w:r>
         <w:t>BillItemsAdvanced</w:t>
       </w:r>
+      <w:proofErr w:type="spellEnd"/>
       <w:r>
         <w:t>:</w:t>
       </w:r>
@@ -10372,7 +11018,15 @@
         <w:pStyle w:val="03"/>
       </w:pPr>
       <w:r>
-        <w:t xml:space="preserve">В контроллере BookingsAdvancedController при обработке POST-запроса на создание бронирования была реализована </w:t>
+        <w:t xml:space="preserve">В контроллере </w:t>
+      </w:r>
+      <w:proofErr w:type="spellStart"/>
+      <w:r>
+        <w:t>BookingsAdvancedController</w:t>
+      </w:r>
+      <w:proofErr w:type="spellEnd"/>
+      <w:r>
+        <w:t xml:space="preserve"> при обработке POST-запроса на создание бронирования была реализована </w:t>
       </w:r>
       <w:r>
         <w:rPr>
@@ -10515,7 +11169,31 @@
         <w:pStyle w:val="03"/>
       </w:pPr>
       <w:r>
-        <w:t>Для реализации функционала была задействована существующая таблица BookingEquipments, обеспечивающая связь многие-ко-многим между бронированиями и оборудованием: BookingsAdvanced ←→ BookingEquipments ←→</w:t>
+        <w:t xml:space="preserve">Для реализации функционала была задействована существующая таблица </w:t>
+      </w:r>
+      <w:proofErr w:type="spellStart"/>
+      <w:r>
+        <w:t>BookingEquipments</w:t>
+      </w:r>
+      <w:proofErr w:type="spellEnd"/>
+      <w:r>
+        <w:t xml:space="preserve">, обеспечивающая связь многие-ко-многим между бронированиями и оборудованием: </w:t>
+      </w:r>
+      <w:proofErr w:type="spellStart"/>
+      <w:r>
+        <w:t>BookingsAdvanced</w:t>
+      </w:r>
+      <w:proofErr w:type="spellEnd"/>
+      <w:r>
+        <w:t xml:space="preserve"> ←→ </w:t>
+      </w:r>
+      <w:proofErr w:type="spellStart"/>
+      <w:r>
+        <w:t>BookingEquipments</w:t>
+      </w:r>
+      <w:proofErr w:type="spellEnd"/>
+      <w:r>
+        <w:t xml:space="preserve"> ←→</w:t>
       </w:r>
       <w:r>
         <w:t> </w:t>
@@ -10527,7 +11205,15 @@
         <w:t> </w:t>
       </w:r>
       <w:r>
-        <w:t>Equipment хранит информацию об инструментах (название, цена, категория), BookingEquipments связывает бронирование с выбранным оборудованием.</w:t>
+        <w:t xml:space="preserve">Equipment хранит информацию об инструментах (название, цена, категория), </w:t>
+      </w:r>
+      <w:proofErr w:type="spellStart"/>
+      <w:r>
+        <w:t>BookingEquipments</w:t>
+      </w:r>
+      <w:proofErr w:type="spellEnd"/>
+      <w:r>
+        <w:t xml:space="preserve"> связывает бронирование с выбранным оборудованием.</w:t>
       </w:r>
     </w:p>
     <w:p>
@@ -10536,7 +11222,23 @@
       </w:pPr>
       <w:r>
         <w:lastRenderedPageBreak/>
-        <w:t>В контроллере BookingsAdvancedController в класс CreateBookingRequest было добавлено поле для передачи выбранного оборудования</w:t>
+        <w:t xml:space="preserve">В контроллере </w:t>
+      </w:r>
+      <w:proofErr w:type="spellStart"/>
+      <w:r>
+        <w:t>BookingsAdvancedController</w:t>
+      </w:r>
+      <w:proofErr w:type="spellEnd"/>
+      <w:r>
+        <w:t xml:space="preserve"> в класс </w:t>
+      </w:r>
+      <w:proofErr w:type="spellStart"/>
+      <w:r>
+        <w:t>CreateBookingRequest</w:t>
+      </w:r>
+      <w:proofErr w:type="spellEnd"/>
+      <w:r>
+        <w:t xml:space="preserve"> было добавлено поле для передачи выбранного оборудования</w:t>
       </w:r>
       <w:r>
         <w:t xml:space="preserve">. </w:t>
@@ -10548,13 +11250,45 @@
         <w:t xml:space="preserve">. </w:t>
       </w:r>
       <w:r>
-        <w:t>При формировании счёта (BillsAdvanced и BillItemsAdvanced) учитывается стоимость каждого выбранного инструмента</w:t>
+        <w:t>При формировании счёта (</w:t>
+      </w:r>
+      <w:proofErr w:type="spellStart"/>
+      <w:r>
+        <w:t>BillsAdvanced</w:t>
+      </w:r>
+      <w:proofErr w:type="spellEnd"/>
+      <w:r>
+        <w:t xml:space="preserve"> и </w:t>
+      </w:r>
+      <w:proofErr w:type="spellStart"/>
+      <w:r>
+        <w:t>BillItemsAdvanced</w:t>
+      </w:r>
+      <w:proofErr w:type="spellEnd"/>
+      <w:r>
+        <w:t>) учитывается стоимость каждого выбранного инструмента</w:t>
       </w:r>
       <w:r>
         <w:t xml:space="preserve">. </w:t>
       </w:r>
       <w:r>
-        <w:t>Для отображения выбранного оборудования в профиле пользователя в эндпоинт GetUserBookingsHistory был добавлен массив идентификаторов оборудования</w:t>
+        <w:t xml:space="preserve">Для отображения выбранного оборудования в профиле пользователя в </w:t>
+      </w:r>
+      <w:proofErr w:type="spellStart"/>
+      <w:r>
+        <w:t>эндпоинт</w:t>
+      </w:r>
+      <w:proofErr w:type="spellEnd"/>
+      <w:r>
+        <w:t xml:space="preserve"> </w:t>
+      </w:r>
+      <w:proofErr w:type="spellStart"/>
+      <w:r>
+        <w:t>GetUserBookingsHistory</w:t>
+      </w:r>
+      <w:proofErr w:type="spellEnd"/>
+      <w:r>
+        <w:t xml:space="preserve"> был добавлен массив идентификаторов оборудования</w:t>
       </w:r>
       <w:r>
         <w:t>.</w:t>
@@ -10794,15 +11528,71 @@
         <w:t>API</w:t>
       </w:r>
       <w:r>
-        <w:t>-эндпоинты:</w:t>
-      </w:r>
-    </w:p>
-    <w:p>
-      <w:pPr>
-        <w:pStyle w:val="04"/>
-      </w:pPr>
-      <w:r>
-        <w:t xml:space="preserve">GET /api/BookingsAdvanced/available-ids?date={date}&amp;type=instrument - </w:t>
+        <w:t>-</w:t>
+      </w:r>
+      <w:proofErr w:type="spellStart"/>
+      <w:r>
+        <w:t>эндпоинты</w:t>
+      </w:r>
+      <w:proofErr w:type="spellEnd"/>
+      <w:r>
+        <w:t>:</w:t>
+      </w:r>
+    </w:p>
+    <w:p>
+      <w:pPr>
+        <w:pStyle w:val="04"/>
+      </w:pPr>
+      <w:r>
+        <w:t>GET /</w:t>
+      </w:r>
+      <w:proofErr w:type="spellStart"/>
+      <w:r>
+        <w:t>api</w:t>
+      </w:r>
+      <w:proofErr w:type="spellEnd"/>
+      <w:r>
+        <w:t>/</w:t>
+      </w:r>
+      <w:proofErr w:type="spellStart"/>
+      <w:r>
+        <w:t>BookingsAdvanced</w:t>
+      </w:r>
+      <w:proofErr w:type="spellEnd"/>
+      <w:r>
+        <w:t>/</w:t>
+      </w:r>
+      <w:proofErr w:type="spellStart"/>
+      <w:r>
+        <w:t>available-ids?date</w:t>
+      </w:r>
+      <w:proofErr w:type="spellEnd"/>
+      <w:r>
+        <w:t>={</w:t>
+      </w:r>
+      <w:proofErr w:type="spellStart"/>
+      <w:r>
+        <w:t>date</w:t>
+      </w:r>
+      <w:proofErr w:type="spellEnd"/>
+      <w:r>
+        <w:t>}&amp;</w:t>
+      </w:r>
+      <w:proofErr w:type="spellStart"/>
+      <w:r>
+        <w:t>type</w:t>
+      </w:r>
+      <w:proofErr w:type="spellEnd"/>
+      <w:r>
+        <w:t>=</w:t>
+      </w:r>
+      <w:proofErr w:type="spellStart"/>
+      <w:r>
+        <w:t>instrument</w:t>
+      </w:r>
+      <w:proofErr w:type="spellEnd"/>
+      <w:r>
+        <w:t xml:space="preserve"> - </w:t>
       </w:r>
       <w:r>
         <w:t>в</w:t>
@@ -10815,6 +11605,7 @@
       <w:pPr>
         <w:pStyle w:val="04"/>
       </w:pPr>
+      <w:proofErr w:type="gramStart"/>
       <w:r>
         <w:t>GET</w:t>
       </w:r>
@@ -10822,7 +11613,11 @@
         <w:t> </w:t>
       </w:r>
       <w:r>
-        <w:t> /api/BookingsAdvanced/available-</w:t>
+        <w:t> /</w:t>
+      </w:r>
+      <w:proofErr w:type="gramEnd"/>
+      <w:r>
+        <w:t>api/BookingsAdvanced/available-</w:t>
       </w:r>
       <w:r>
         <w:t> </w:t>
@@ -10854,7 +11649,20 @@
         <w:t xml:space="preserve"> для инструментов и для помещений. </w:t>
       </w:r>
       <w:r>
-        <w:t>Фильтр по дате интегрирован в общую функцию applyFilters(), что позволяет комбинировать его с другими критериями (категория, цена, состояние и т.д.)</w:t>
+        <w:t xml:space="preserve">Фильтр по дате интегрирован в общую функцию </w:t>
+      </w:r>
+      <w:proofErr w:type="spellStart"/>
+      <w:proofErr w:type="gramStart"/>
+      <w:r>
+        <w:t>applyFilters</w:t>
+      </w:r>
+      <w:proofErr w:type="spellEnd"/>
+      <w:r>
+        <w:t>(</w:t>
+      </w:r>
+      <w:proofErr w:type="gramEnd"/>
+      <w:r>
+        <w:t>), что позволяет комбинировать его с другими критериями (категория, цена, состояние и т.д.)</w:t>
       </w:r>
       <w:r>
         <w:t xml:space="preserve">. </w:t>
@@ -11009,7 +11817,23 @@
         <w:pStyle w:val="03"/>
       </w:pPr>
       <w:r>
-        <w:t>В процессе анализа существующей информационной системы было выявлено, что модуль абонементов находился в нерабочем состоянии. Несмотря на наличие в базе данных таблиц SubscriptionPlans (тарифные планы) и UserSubscriptionsAdvanced (приобретённые пользователем абонементы), соответствующий функционал не был интегрирован в бизнес-логику бронирования. Пользователи могли приобретать абонементы, но при создании бронирования система не учитывала их наличие, не применяла скидку и не списывала сеансы.</w:t>
+        <w:t xml:space="preserve">В процессе анализа существующей информационной системы было выявлено, что модуль абонементов находился в нерабочем состоянии. Несмотря на наличие в базе данных таблиц </w:t>
+      </w:r>
+      <w:proofErr w:type="spellStart"/>
+      <w:r>
+        <w:t>SubscriptionPlans</w:t>
+      </w:r>
+      <w:proofErr w:type="spellEnd"/>
+      <w:r>
+        <w:t xml:space="preserve"> (тарифные планы) и </w:t>
+      </w:r>
+      <w:proofErr w:type="spellStart"/>
+      <w:r>
+        <w:t>UserSubscriptionsAdvanced</w:t>
+      </w:r>
+      <w:proofErr w:type="spellEnd"/>
+      <w:r>
+        <w:t xml:space="preserve"> (приобретённые пользователем абонементы), соответствующий функционал не был интегрирован в бизнес-логику бронирования. Пользователи могли приобретать абонементы, но при создании бронирования система не учитывала их наличие, не применяла скидку и не списывала сеансы.</w:t>
       </w:r>
     </w:p>
     <w:p>
@@ -11108,9 +11932,11 @@
       <w:pPr>
         <w:pStyle w:val="04"/>
       </w:pPr>
+      <w:proofErr w:type="spellStart"/>
       <w:r>
         <w:t>SubscriptionPlans</w:t>
       </w:r>
+      <w:proofErr w:type="spellEnd"/>
       <w:r>
         <w:t xml:space="preserve"> - т</w:t>
       </w:r>
@@ -11122,9 +11948,11 @@
       <w:pPr>
         <w:pStyle w:val="04"/>
       </w:pPr>
+      <w:proofErr w:type="spellStart"/>
       <w:r>
         <w:t>UserSubscriptionsAdvanced</w:t>
       </w:r>
+      <w:proofErr w:type="spellEnd"/>
       <w:r>
         <w:t xml:space="preserve"> </w:t>
       </w:r>
@@ -11140,7 +11968,15 @@
         <w:pStyle w:val="03"/>
       </w:pPr>
       <w:r>
-        <w:t xml:space="preserve">В контроллере BookingsAdvancedController при создании бронирования реализована проверка наличия у пользователя активного абонемента. </w:t>
+        <w:t xml:space="preserve">В контроллере </w:t>
+      </w:r>
+      <w:proofErr w:type="spellStart"/>
+      <w:r>
+        <w:t>BookingsAdvancedController</w:t>
+      </w:r>
+      <w:proofErr w:type="spellEnd"/>
+      <w:r>
+        <w:t xml:space="preserve"> при создании бронирования реализована проверка наличия у пользователя активного абонемента. </w:t>
       </w:r>
       <w:r>
         <w:t>Условия активного абонемента:</w:t>
@@ -11150,16 +11986,39 @@
       <w:pPr>
         <w:pStyle w:val="04"/>
       </w:pPr>
-      <w:r>
-        <w:t>IsActive == true — абонемент не отменён;</w:t>
-      </w:r>
-    </w:p>
-    <w:p>
-      <w:pPr>
-        <w:pStyle w:val="04"/>
-      </w:pPr>
-      <w:r>
-        <w:t>SessionsRemaining &gt; 0 — остались неиспользованные сеансы</w:t>
+      <w:proofErr w:type="spellStart"/>
+      <w:r>
+        <w:t>IsActive</w:t>
+      </w:r>
+      <w:proofErr w:type="spellEnd"/>
+      <w:r>
+        <w:t xml:space="preserve"> == </w:t>
+      </w:r>
+      <w:proofErr w:type="spellStart"/>
+      <w:r>
+        <w:t>true</w:t>
+      </w:r>
+      <w:proofErr w:type="spellEnd"/>
+      <w:r>
+        <w:t xml:space="preserve"> — абонемент не отменён;</w:t>
+      </w:r>
+    </w:p>
+    <w:p>
+      <w:pPr>
+        <w:pStyle w:val="04"/>
+      </w:pPr>
+      <w:proofErr w:type="spellStart"/>
+      <w:proofErr w:type="gramStart"/>
+      <w:r>
+        <w:t>SessionsRemaining</w:t>
+      </w:r>
+      <w:proofErr w:type="spellEnd"/>
+      <w:r>
+        <w:t xml:space="preserve"> &gt;</w:t>
+      </w:r>
+      <w:proofErr w:type="gramEnd"/>
+      <w:r>
+        <w:t xml:space="preserve"> 0 — остались неиспользованные сеансы</w:t>
       </w:r>
       <w:r>
         <w:rPr>
@@ -11172,8 +12031,26 @@
       <w:pPr>
         <w:pStyle w:val="04"/>
       </w:pPr>
-      <w:r>
-        <w:t>ValidUntil &gt; DateTime.Now — срок действия не истёк.</w:t>
+      <w:proofErr w:type="spellStart"/>
+      <w:proofErr w:type="gramStart"/>
+      <w:r>
+        <w:t>ValidUntil</w:t>
+      </w:r>
+      <w:proofErr w:type="spellEnd"/>
+      <w:r>
+        <w:t xml:space="preserve"> &gt;</w:t>
+      </w:r>
+      <w:proofErr w:type="gramEnd"/>
+      <w:r>
+        <w:t xml:space="preserve"> </w:t>
+      </w:r>
+      <w:proofErr w:type="spellStart"/>
+      <w:r>
+        <w:t>DateTime.Now</w:t>
+      </w:r>
+      <w:proofErr w:type="spellEnd"/>
+      <w:r>
+        <w:t xml:space="preserve"> — срок действия не истёк.</w:t>
       </w:r>
     </w:p>
     <w:p>
@@ -11184,14 +12061,35 @@
         <w:t>При наличии активного абонемента из соответствующего тарифного плана извлекается процент скидки и рассчитывается коэффициент для применения к стоимости бронирования. Коэффициент скидки применяется ко всем позициям счёта. Информация о применении абонемента сохраняется в таблице счетов для последующего отображения пользователю.</w:t>
       </w:r>
       <w:r>
-        <w:t xml:space="preserve"> Для поддержки функционала скидок в модель тарифного плана SubscriptionPlan было добавлено поле</w:t>
-      </w:r>
-      <w:r>
-        <w:t xml:space="preserve"> DiscountPercentage, соответствующее полю</w:t>
-      </w:r>
-      <w:r>
-        <w:t xml:space="preserve"> discount_percentage</w:t>
-      </w:r>
+        <w:t xml:space="preserve"> Для поддержки функционала скидок в модель тарифного плана </w:t>
+      </w:r>
+      <w:proofErr w:type="spellStart"/>
+      <w:r>
+        <w:t>SubscriptionPlan</w:t>
+      </w:r>
+      <w:proofErr w:type="spellEnd"/>
+      <w:r>
+        <w:t xml:space="preserve"> было добавлено поле</w:t>
+      </w:r>
+      <w:r>
+        <w:t xml:space="preserve"> </w:t>
+      </w:r>
+      <w:proofErr w:type="spellStart"/>
+      <w:r>
+        <w:t>DiscountPercentage</w:t>
+      </w:r>
+      <w:proofErr w:type="spellEnd"/>
+      <w:r>
+        <w:t>, соответствующее полю</w:t>
+      </w:r>
+      <w:r>
+        <w:t xml:space="preserve"> </w:t>
+      </w:r>
+      <w:proofErr w:type="spellStart"/>
+      <w:r>
+        <w:t>discount_percentage</w:t>
+      </w:r>
+      <w:proofErr w:type="spellEnd"/>
       <w:r>
         <w:t xml:space="preserve"> в таблице БД</w:t>
       </w:r>
@@ -11290,8 +12188,13 @@
         <w:t xml:space="preserve"> </w:t>
       </w:r>
       <w:r>
-        <w:t>Реализован функционал отмены подписки через отдельный эндпоинт</w:t>
-      </w:r>
+        <w:t xml:space="preserve">Реализован функционал отмены подписки через отдельный </w:t>
+      </w:r>
+      <w:proofErr w:type="spellStart"/>
+      <w:r>
+        <w:t>эндпоинт</w:t>
+      </w:r>
+      <w:proofErr w:type="spellEnd"/>
       <w:r>
         <w:t>.</w:t>
       </w:r>
@@ -11560,8 +12463,13 @@
         </w:rPr>
         <w:t>N</w:t>
       </w:r>
-      <w:r>
-        <w:t>otificationId (GUID) - уникальный идентификатор уведомления</w:t>
+      <w:proofErr w:type="spellStart"/>
+      <w:r>
+        <w:t>otificationId</w:t>
+      </w:r>
+      <w:proofErr w:type="spellEnd"/>
+      <w:r>
+        <w:t xml:space="preserve"> (GUID) - уникальный идентификатор уведомления</w:t>
       </w:r>
       <w:r>
         <w:t>;</w:t>
@@ -11571,8 +12479,13 @@
       <w:pPr>
         <w:pStyle w:val="04"/>
       </w:pPr>
-      <w:r>
-        <w:t>UserUid (GUID) - идентификатор пользователя-получателя</w:t>
+      <w:proofErr w:type="spellStart"/>
+      <w:r>
+        <w:t>UserUid</w:t>
+      </w:r>
+      <w:proofErr w:type="spellEnd"/>
+      <w:r>
+        <w:t xml:space="preserve"> (GUID) - идентификатор пользователя-получателя</w:t>
       </w:r>
       <w:r>
         <w:t>;</w:t>
@@ -11582,10 +12495,12 @@
       <w:pPr>
         <w:pStyle w:val="04"/>
       </w:pPr>
+      <w:proofErr w:type="spellStart"/>
       <w:r>
         <w:lastRenderedPageBreak/>
         <w:t>BookingUid</w:t>
       </w:r>
+      <w:proofErr w:type="spellEnd"/>
       <w:r>
         <w:t xml:space="preserve"> (</w:t>
       </w:r>
@@ -11609,12 +12524,14 @@
           <w:lang w:val="en-US"/>
         </w:rPr>
       </w:pPr>
+      <w:proofErr w:type="spellStart"/>
       <w:r>
         <w:rPr>
           <w:lang w:val="en-US"/>
         </w:rPr>
         <w:t>NotificationType</w:t>
       </w:r>
+      <w:proofErr w:type="spellEnd"/>
       <w:r>
         <w:rPr>
           <w:lang w:val="en-US"/>
@@ -11670,7 +12587,49 @@
         <w:rPr>
           <w:lang w:val="en-US"/>
         </w:rPr>
-        <w:t xml:space="preserve"> (new_booking, booking_rescheduled, booking_cancelled)</w:t>
+        <w:t xml:space="preserve"> (</w:t>
+      </w:r>
+      <w:proofErr w:type="spellStart"/>
+      <w:r>
+        <w:rPr>
+          <w:lang w:val="en-US"/>
+        </w:rPr>
+        <w:t>new_booking</w:t>
+      </w:r>
+      <w:proofErr w:type="spellEnd"/>
+      <w:r>
+        <w:rPr>
+          <w:lang w:val="en-US"/>
+        </w:rPr>
+        <w:t xml:space="preserve">, </w:t>
+      </w:r>
+      <w:proofErr w:type="spellStart"/>
+      <w:r>
+        <w:rPr>
+          <w:lang w:val="en-US"/>
+        </w:rPr>
+        <w:t>booking_rescheduled</w:t>
+      </w:r>
+      <w:proofErr w:type="spellEnd"/>
+      <w:r>
+        <w:rPr>
+          <w:lang w:val="en-US"/>
+        </w:rPr>
+        <w:t xml:space="preserve">, </w:t>
+      </w:r>
+      <w:proofErr w:type="spellStart"/>
+      <w:r>
+        <w:rPr>
+          <w:lang w:val="en-US"/>
+        </w:rPr>
+        <w:t>booking_cancelled</w:t>
+      </w:r>
+      <w:proofErr w:type="spellEnd"/>
+      <w:r>
+        <w:rPr>
+          <w:lang w:val="en-US"/>
+        </w:rPr>
+        <w:t>)</w:t>
       </w:r>
       <w:r>
         <w:rPr>
@@ -11683,15 +12642,19 @@
       <w:pPr>
         <w:pStyle w:val="04"/>
       </w:pPr>
+      <w:proofErr w:type="spellStart"/>
       <w:r>
         <w:t>Title</w:t>
       </w:r>
+      <w:proofErr w:type="spellEnd"/>
       <w:r>
         <w:t xml:space="preserve"> (</w:t>
       </w:r>
+      <w:proofErr w:type="spellStart"/>
       <w:r>
         <w:t>string</w:t>
       </w:r>
+      <w:proofErr w:type="spellEnd"/>
       <w:r>
         <w:t>) - з</w:t>
       </w:r>
@@ -11712,9 +12675,11 @@
       <w:r>
         <w:t xml:space="preserve"> (</w:t>
       </w:r>
+      <w:proofErr w:type="spellStart"/>
       <w:r>
         <w:t>string</w:t>
       </w:r>
+      <w:proofErr w:type="spellEnd"/>
       <w:r>
         <w:t>)</w:t>
       </w:r>
@@ -11735,18 +12700,22 @@
       <w:pPr>
         <w:pStyle w:val="04"/>
       </w:pPr>
+      <w:proofErr w:type="spellStart"/>
       <w:r>
         <w:t>CreatedAt</w:t>
       </w:r>
+      <w:proofErr w:type="spellEnd"/>
       <w:r>
         <w:tab/>
       </w:r>
       <w:r>
         <w:t>(</w:t>
       </w:r>
+      <w:proofErr w:type="spellStart"/>
       <w:r>
         <w:t>DateTime</w:t>
       </w:r>
+      <w:proofErr w:type="spellEnd"/>
       <w:r>
         <w:t>) - д</w:t>
       </w:r>
@@ -11761,15 +12730,19 @@
       <w:pPr>
         <w:pStyle w:val="04"/>
       </w:pPr>
+      <w:proofErr w:type="spellStart"/>
       <w:r>
         <w:t>IsRead</w:t>
       </w:r>
+      <w:proofErr w:type="spellEnd"/>
       <w:r>
         <w:t xml:space="preserve"> (</w:t>
       </w:r>
+      <w:proofErr w:type="spellStart"/>
       <w:r>
         <w:t>bool</w:t>
       </w:r>
+      <w:proofErr w:type="spellEnd"/>
       <w:r>
         <w:t>) - ф</w:t>
       </w:r>
@@ -11785,7 +12758,23 @@
         <w:pStyle w:val="03"/>
       </w:pPr>
       <w:r>
-        <w:t>В контроллере NotificationsController были реализованы следующие эндпоинты:</w:t>
+        <w:t xml:space="preserve">В контроллере </w:t>
+      </w:r>
+      <w:proofErr w:type="spellStart"/>
+      <w:r>
+        <w:t>NotificationsController</w:t>
+      </w:r>
+      <w:proofErr w:type="spellEnd"/>
+      <w:r>
+        <w:t xml:space="preserve"> были реализованы следующие </w:t>
+      </w:r>
+      <w:proofErr w:type="spellStart"/>
+      <w:r>
+        <w:t>эндпоинты</w:t>
+      </w:r>
+      <w:proofErr w:type="spellEnd"/>
+      <w:r>
+        <w:t>:</w:t>
       </w:r>
     </w:p>
     <w:p>
@@ -11797,7 +12786,39 @@
       </w:r>
       <w:r>
         <w:tab/>
-        <w:t>/api/Notifications/user/{userUid}</w:t>
+        <w:t>/</w:t>
+      </w:r>
+      <w:proofErr w:type="spellStart"/>
+      <w:r>
+        <w:t>api</w:t>
+      </w:r>
+      <w:proofErr w:type="spellEnd"/>
+      <w:r>
+        <w:t>/</w:t>
+      </w:r>
+      <w:proofErr w:type="spellStart"/>
+      <w:r>
+        <w:t>Notifications</w:t>
+      </w:r>
+      <w:proofErr w:type="spellEnd"/>
+      <w:r>
+        <w:t>/</w:t>
+      </w:r>
+      <w:proofErr w:type="spellStart"/>
+      <w:r>
+        <w:t>user</w:t>
+      </w:r>
+      <w:proofErr w:type="spellEnd"/>
+      <w:r>
+        <w:t>/{</w:t>
+      </w:r>
+      <w:proofErr w:type="spellStart"/>
+      <w:r>
+        <w:t>userUid</w:t>
+      </w:r>
+      <w:proofErr w:type="spellEnd"/>
+      <w:r>
+        <w:t>}</w:t>
       </w:r>
       <w:r>
         <w:t xml:space="preserve"> - п</w:t>
@@ -11818,8 +12839,45 @@
       </w:r>
       <w:r>
         <w:tab/>
-        <w:t>/api/Notifications/user/{userUid}/unread</w:t>
-      </w:r>
+        <w:t>/</w:t>
+      </w:r>
+      <w:proofErr w:type="spellStart"/>
+      <w:r>
+        <w:t>api</w:t>
+      </w:r>
+      <w:proofErr w:type="spellEnd"/>
+      <w:r>
+        <w:t>/</w:t>
+      </w:r>
+      <w:proofErr w:type="spellStart"/>
+      <w:r>
+        <w:t>Notifications</w:t>
+      </w:r>
+      <w:proofErr w:type="spellEnd"/>
+      <w:r>
+        <w:t>/</w:t>
+      </w:r>
+      <w:proofErr w:type="spellStart"/>
+      <w:r>
+        <w:t>user</w:t>
+      </w:r>
+      <w:proofErr w:type="spellEnd"/>
+      <w:r>
+        <w:t>/{</w:t>
+      </w:r>
+      <w:proofErr w:type="spellStart"/>
+      <w:r>
+        <w:t>userUid</w:t>
+      </w:r>
+      <w:proofErr w:type="spellEnd"/>
+      <w:r>
+        <w:t>}/</w:t>
+      </w:r>
+      <w:proofErr w:type="spellStart"/>
+      <w:r>
+        <w:t>unread</w:t>
+      </w:r>
+      <w:proofErr w:type="spellEnd"/>
       <w:r>
         <w:tab/>
       </w:r>
@@ -11842,8 +12900,37 @@
       </w:r>
       <w:r>
         <w:tab/>
-        <w:t>/api/Notifications/{notificationId}/read</w:t>
-      </w:r>
+        <w:t>/</w:t>
+      </w:r>
+      <w:proofErr w:type="spellStart"/>
+      <w:r>
+        <w:t>api</w:t>
+      </w:r>
+      <w:proofErr w:type="spellEnd"/>
+      <w:r>
+        <w:t>/</w:t>
+      </w:r>
+      <w:proofErr w:type="spellStart"/>
+      <w:r>
+        <w:t>Notifications</w:t>
+      </w:r>
+      <w:proofErr w:type="spellEnd"/>
+      <w:r>
+        <w:t>/{</w:t>
+      </w:r>
+      <w:proofErr w:type="spellStart"/>
+      <w:r>
+        <w:t>notificationId</w:t>
+      </w:r>
+      <w:proofErr w:type="spellEnd"/>
+      <w:r>
+        <w:t>}/</w:t>
+      </w:r>
+      <w:proofErr w:type="spellStart"/>
+      <w:r>
+        <w:t>read</w:t>
+      </w:r>
+      <w:proofErr w:type="spellEnd"/>
       <w:r>
         <w:tab/>
       </w:r>
@@ -11866,8 +12953,45 @@
       </w:r>
       <w:r>
         <w:tab/>
-        <w:t>/api/Notifications/user/{userUid}/mark-all-read</w:t>
-      </w:r>
+        <w:t>/</w:t>
+      </w:r>
+      <w:proofErr w:type="spellStart"/>
+      <w:r>
+        <w:t>api</w:t>
+      </w:r>
+      <w:proofErr w:type="spellEnd"/>
+      <w:r>
+        <w:t>/</w:t>
+      </w:r>
+      <w:proofErr w:type="spellStart"/>
+      <w:r>
+        <w:t>Notifications</w:t>
+      </w:r>
+      <w:proofErr w:type="spellEnd"/>
+      <w:r>
+        <w:t>/</w:t>
+      </w:r>
+      <w:proofErr w:type="spellStart"/>
+      <w:r>
+        <w:t>user</w:t>
+      </w:r>
+      <w:proofErr w:type="spellEnd"/>
+      <w:r>
+        <w:t>/{</w:t>
+      </w:r>
+      <w:proofErr w:type="spellStart"/>
+      <w:r>
+        <w:t>userUid</w:t>
+      </w:r>
+      <w:proofErr w:type="spellEnd"/>
+      <w:r>
+        <w:t>}/</w:t>
+      </w:r>
+      <w:proofErr w:type="spellStart"/>
+      <w:r>
+        <w:t>mark-all-read</w:t>
+      </w:r>
+      <w:proofErr w:type="spellEnd"/>
       <w:r>
         <w:tab/>
       </w:r>
@@ -11890,8 +13014,21 @@
       </w:r>
       <w:r>
         <w:tab/>
-        <w:t>/api/Notifications</w:t>
-      </w:r>
+        <w:t>/</w:t>
+      </w:r>
+      <w:proofErr w:type="spellStart"/>
+      <w:r>
+        <w:t>api</w:t>
+      </w:r>
+      <w:proofErr w:type="spellEnd"/>
+      <w:r>
+        <w:t>/</w:t>
+      </w:r>
+      <w:proofErr w:type="spellStart"/>
+      <w:r>
+        <w:t>Notifications</w:t>
+      </w:r>
+      <w:proofErr w:type="spellEnd"/>
       <w:r>
         <w:tab/>
       </w:r>
@@ -11970,9 +13107,11 @@
       <w:pPr>
         <w:pStyle w:val="04"/>
       </w:pPr>
+      <w:proofErr w:type="spellStart"/>
       <w:r>
         <w:t>new_booking</w:t>
       </w:r>
+      <w:proofErr w:type="spellEnd"/>
       <w:r>
         <w:t xml:space="preserve">: </w:t>
       </w:r>
@@ -11988,9 +13127,11 @@
       <w:pPr>
         <w:pStyle w:val="04"/>
       </w:pPr>
+      <w:proofErr w:type="spellStart"/>
       <w:r>
         <w:t>booking_rescheduled</w:t>
       </w:r>
+      <w:proofErr w:type="spellEnd"/>
       <w:r>
         <w:t xml:space="preserve">: </w:t>
       </w:r>
@@ -12002,9 +13143,11 @@
       <w:pPr>
         <w:pStyle w:val="04"/>
       </w:pPr>
+      <w:proofErr w:type="spellStart"/>
       <w:r>
         <w:t>booking_cancelled</w:t>
       </w:r>
+      <w:proofErr w:type="spellEnd"/>
       <w:r>
         <w:t xml:space="preserve">: </w:t>
       </w:r>
@@ -12154,8 +13297,8 @@
       <w:pPr>
         <w:pStyle w:val="0213"/>
       </w:pPr>
-      <w:bookmarkStart w:id="65" w:name="_Hlk230358221"/>
-      <w:bookmarkStart w:id="66" w:name="_Toc230988508"/>
+      <w:bookmarkStart w:id="65" w:name="_Toc230988508"/>
+      <w:bookmarkStart w:id="66" w:name="_Hlk230358221"/>
       <w:r>
         <w:t>2.1</w:t>
       </w:r>
@@ -12165,9 +13308,9 @@
       <w:r>
         <w:t>.1 Постановка задачи</w:t>
       </w:r>
-      <w:bookmarkEnd w:id="66"/>
-    </w:p>
-    <w:bookmarkEnd w:id="65"/>
+      <w:bookmarkEnd w:id="65"/>
+    </w:p>
+    <w:bookmarkEnd w:id="66"/>
     <w:p>
       <w:pPr>
         <w:pStyle w:val="03"/>
@@ -12228,8 +13371,13 @@
       <w:pPr>
         <w:pStyle w:val="04"/>
       </w:pPr>
-      <w:r>
-        <w:t xml:space="preserve">UsersAdvanced (пользователи системы) </w:t>
+      <w:proofErr w:type="spellStart"/>
+      <w:r>
+        <w:t>UsersAdvanced</w:t>
+      </w:r>
+      <w:proofErr w:type="spellEnd"/>
+      <w:r>
+        <w:t xml:space="preserve"> (пользователи системы) </w:t>
       </w:r>
       <w:r>
         <w:t>-</w:t>
@@ -12262,8 +13410,13 @@
       <w:pPr>
         <w:pStyle w:val="04"/>
       </w:pPr>
-      <w:r>
-        <w:t>Rooms (помещения для аренды) - используется;</w:t>
+      <w:proofErr w:type="spellStart"/>
+      <w:r>
+        <w:t>Rooms</w:t>
+      </w:r>
+      <w:proofErr w:type="spellEnd"/>
+      <w:r>
+        <w:t xml:space="preserve"> (помещения для аренды) - используется;</w:t>
       </w:r>
       <w:r>
         <w:tab/>
@@ -12273,8 +13426,13 @@
       <w:pPr>
         <w:pStyle w:val="04"/>
       </w:pPr>
-      <w:r>
-        <w:t>RoomTypes (типы помещений) - используется;</w:t>
+      <w:proofErr w:type="spellStart"/>
+      <w:r>
+        <w:t>RoomTypes</w:t>
+      </w:r>
+      <w:proofErr w:type="spellEnd"/>
+      <w:r>
+        <w:t xml:space="preserve"> (типы помещений) - используется;</w:t>
       </w:r>
       <w:r>
         <w:tab/>
@@ -12284,8 +13442,13 @@
       <w:pPr>
         <w:pStyle w:val="04"/>
       </w:pPr>
-      <w:r>
-        <w:t xml:space="preserve">BookingsAdvanced (бронирования) </w:t>
+      <w:proofErr w:type="spellStart"/>
+      <w:r>
+        <w:t>BookingsAdvanced</w:t>
+      </w:r>
+      <w:proofErr w:type="spellEnd"/>
+      <w:r>
+        <w:t xml:space="preserve"> (бронирования) </w:t>
       </w:r>
       <w:r>
         <w:t>-</w:t>
@@ -12307,17 +13470,24 @@
       <w:pPr>
         <w:pStyle w:val="04"/>
       </w:pPr>
-      <w:r>
-        <w:t>BookingEquipments (связь бронирований с оборудованием) - не использовалась;</w:t>
-      </w:r>
-    </w:p>
-    <w:p>
-      <w:pPr>
-        <w:pStyle w:val="04"/>
-      </w:pPr>
+      <w:proofErr w:type="spellStart"/>
+      <w:r>
+        <w:t>BookingEquipments</w:t>
+      </w:r>
+      <w:proofErr w:type="spellEnd"/>
+      <w:r>
+        <w:t xml:space="preserve"> (связь бронирований с оборудованием) - не использовалась;</w:t>
+      </w:r>
+    </w:p>
+    <w:p>
+      <w:pPr>
+        <w:pStyle w:val="04"/>
+      </w:pPr>
+      <w:proofErr w:type="spellStart"/>
       <w:r>
         <w:t>BillsAdvanced</w:t>
       </w:r>
+      <w:proofErr w:type="spellEnd"/>
       <w:r>
         <w:t xml:space="preserve"> </w:t>
       </w:r>
@@ -12329,9 +13499,11 @@
       <w:pPr>
         <w:pStyle w:val="04"/>
       </w:pPr>
+      <w:proofErr w:type="spellStart"/>
       <w:r>
         <w:t>BillItemsAdvanced</w:t>
       </w:r>
+      <w:proofErr w:type="spellEnd"/>
       <w:r>
         <w:t xml:space="preserve"> </w:t>
       </w:r>
@@ -12346,9 +13518,11 @@
       <w:pPr>
         <w:pStyle w:val="04"/>
       </w:pPr>
+      <w:proofErr w:type="spellStart"/>
       <w:r>
         <w:t>SubscriptionPlans</w:t>
       </w:r>
+      <w:proofErr w:type="spellEnd"/>
       <w:r>
         <w:tab/>
       </w:r>
@@ -12366,33 +13540,53 @@
       <w:pPr>
         <w:pStyle w:val="04"/>
       </w:pPr>
-      <w:r>
-        <w:t>UserSubscriptionsAdvanced (абонементы пользователей) - частично;</w:t>
-      </w:r>
-    </w:p>
-    <w:p>
-      <w:pPr>
-        <w:pStyle w:val="04"/>
-      </w:pPr>
+      <w:proofErr w:type="spellStart"/>
+      <w:r>
+        <w:t>UserSubscriptionsAdvanced</w:t>
+      </w:r>
+      <w:proofErr w:type="spellEnd"/>
+      <w:r>
+        <w:t xml:space="preserve"> (абонементы пользователей) - частично;</w:t>
+      </w:r>
+    </w:p>
+    <w:p>
+      <w:pPr>
+        <w:pStyle w:val="04"/>
+      </w:pPr>
+      <w:proofErr w:type="spellStart"/>
       <w:r>
         <w:lastRenderedPageBreak/>
-        <w:t>StaffAdvanced (сотрудники) - частично;</w:t>
-      </w:r>
-    </w:p>
-    <w:p>
-      <w:pPr>
-        <w:pStyle w:val="04"/>
-      </w:pPr>
-      <w:r>
-        <w:t>Notifications (уведомления) - не использовалась;</w:t>
-      </w:r>
-    </w:p>
-    <w:p>
-      <w:pPr>
-        <w:pStyle w:val="04"/>
-      </w:pPr>
-      <w:r>
-        <w:t xml:space="preserve">RoomEquipment (инструменты, которые есть в наличии в бронируемом помещении) </w:t>
+        <w:t>StaffAdvanced</w:t>
+      </w:r>
+      <w:proofErr w:type="spellEnd"/>
+      <w:r>
+        <w:t xml:space="preserve"> (сотрудники) - частично;</w:t>
+      </w:r>
+    </w:p>
+    <w:p>
+      <w:pPr>
+        <w:pStyle w:val="04"/>
+      </w:pPr>
+      <w:proofErr w:type="spellStart"/>
+      <w:r>
+        <w:t>Notifications</w:t>
+      </w:r>
+      <w:proofErr w:type="spellEnd"/>
+      <w:r>
+        <w:t xml:space="preserve"> (уведомления) - не использовалась;</w:t>
+      </w:r>
+    </w:p>
+    <w:p>
+      <w:pPr>
+        <w:pStyle w:val="04"/>
+      </w:pPr>
+      <w:proofErr w:type="spellStart"/>
+      <w:r>
+        <w:t>RoomEquipment</w:t>
+      </w:r>
+      <w:proofErr w:type="spellEnd"/>
+      <w:r>
+        <w:t xml:space="preserve"> (инструменты, которые есть в наличии в бронируемом помещении) </w:t>
       </w:r>
       <w:r>
         <w:t>-</w:t>
@@ -12411,12 +13605,14 @@
       <w:r>
         <w:t xml:space="preserve"> </w:t>
       </w:r>
+      <w:proofErr w:type="spellStart"/>
       <w:r>
         <w:rPr>
           <w:lang w:val="en-US"/>
         </w:rPr>
         <w:t>StaffAdvanced</w:t>
       </w:r>
+      <w:proofErr w:type="spellEnd"/>
       <w:r>
         <w:t xml:space="preserve"> </w:t>
       </w:r>
@@ -12426,24 +13622,28 @@
       <w:r>
         <w:t xml:space="preserve">Внедрение </w:t>
       </w:r>
+      <w:proofErr w:type="spellStart"/>
       <w:r>
         <w:rPr>
           <w:lang w:val="en-US"/>
         </w:rPr>
         <w:t>BillsAdvanced</w:t>
       </w:r>
+      <w:proofErr w:type="spellEnd"/>
       <w:r>
         <w:t xml:space="preserve"> </w:t>
       </w:r>
       <w:r>
         <w:t xml:space="preserve">и </w:t>
       </w:r>
+      <w:proofErr w:type="spellStart"/>
       <w:r>
         <w:rPr>
           <w:lang w:val="en-US"/>
         </w:rPr>
         <w:t>BillItemsAdvanced</w:t>
       </w:r>
+      <w:proofErr w:type="spellEnd"/>
       <w:r>
         <w:t xml:space="preserve"> </w:t>
       </w:r>
@@ -12462,24 +13662,28 @@
       <w:r>
         <w:t xml:space="preserve"> </w:t>
       </w:r>
+      <w:proofErr w:type="spellStart"/>
       <w:r>
         <w:rPr>
           <w:lang w:val="en-US"/>
         </w:rPr>
         <w:t>BookingEquipments</w:t>
       </w:r>
+      <w:proofErr w:type="spellEnd"/>
       <w:r>
         <w:t xml:space="preserve"> </w:t>
       </w:r>
       <w:r>
         <w:t xml:space="preserve">и </w:t>
       </w:r>
+      <w:proofErr w:type="spellStart"/>
       <w:r>
         <w:rPr>
           <w:lang w:val="en-US"/>
         </w:rPr>
         <w:t>RoomEquipment</w:t>
       </w:r>
+      <w:proofErr w:type="spellEnd"/>
       <w:r>
         <w:t>,</w:t>
       </w:r>
@@ -12492,15 +13696,19 @@
       <w:r>
         <w:t xml:space="preserve"> </w:t>
       </w:r>
+      <w:proofErr w:type="spellStart"/>
       <w:r>
         <w:t>SubscriptionPlans</w:t>
       </w:r>
+      <w:proofErr w:type="spellEnd"/>
       <w:r>
         <w:t xml:space="preserve"> и </w:t>
       </w:r>
+      <w:proofErr w:type="spellStart"/>
       <w:r>
         <w:t>UserSubscriptionsAdvanced</w:t>
       </w:r>
+      <w:proofErr w:type="spellEnd"/>
       <w:r>
         <w:t xml:space="preserve"> участвуют в решении задачи с внедрением абонементов (пункт 2.11)</w:t>
       </w:r>
@@ -12978,7 +14186,15 @@
         <w:t xml:space="preserve"> новых функций</w:t>
       </w:r>
       <w:r>
-        <w:t>. Реляционная база данных PostgreSQL с</w:t>
+        <w:t xml:space="preserve">. Реляционная база данных </w:t>
+      </w:r>
+      <w:proofErr w:type="spellStart"/>
+      <w:r>
+        <w:t>PostgreSQL</w:t>
+      </w:r>
+      <w:proofErr w:type="spellEnd"/>
+      <w:r>
+        <w:t xml:space="preserve"> с</w:t>
       </w:r>
       <w:r>
         <w:t>одержит полный набор таблиц</w:t>
@@ -13029,7 +14245,15 @@
         <w:t>навыки</w:t>
       </w:r>
       <w:r>
-        <w:t xml:space="preserve"> интеграции фронтенд-части с серверной платформой </w:t>
+        <w:t xml:space="preserve"> интеграции </w:t>
+      </w:r>
+      <w:proofErr w:type="spellStart"/>
+      <w:r>
+        <w:t>фронтенд</w:t>
+      </w:r>
+      <w:proofErr w:type="spellEnd"/>
+      <w:r>
+        <w:t xml:space="preserve">-части с серверной платформой </w:t>
       </w:r>
       <w:r>
         <w:rPr>
@@ -13199,7 +14423,15 @@
         <w:ind w:left="993"/>
       </w:pPr>
       <w:r>
-        <w:t>Документация PostgreSQL: [сайт]. — URL:</w:t>
+        <w:t xml:space="preserve">Документация </w:t>
+      </w:r>
+      <w:proofErr w:type="spellStart"/>
+      <w:r>
+        <w:t>PostgreSQL</w:t>
+      </w:r>
+      <w:proofErr w:type="spellEnd"/>
+      <w:r>
+        <w:t>: [сайт]. — URL:</w:t>
       </w:r>
       <w:hyperlink r:id="rId9" w:history="1">
         <w:r>
@@ -13263,7 +14495,15 @@
         <w:ind w:left="993"/>
       </w:pPr>
       <w:r>
-        <w:t>Metanit.com: руководство по Entity Framework Core: [сайт]. — URL:</w:t>
+        <w:t xml:space="preserve">Metanit.com: руководство по </w:t>
+      </w:r>
+      <w:proofErr w:type="spellStart"/>
+      <w:r>
+        <w:t>Entity</w:t>
+      </w:r>
+      <w:proofErr w:type="spellEnd"/>
+      <w:r>
+        <w:t xml:space="preserve"> Framework Core: [сайт]. — URL:</w:t>
       </w:r>
     </w:p>
     <w:p>
@@ -13297,7 +14537,15 @@
         <w:ind w:left="993"/>
       </w:pPr>
       <w:r>
-        <w:t xml:space="preserve">MDN Web Docs: [сайт]. — URL: </w:t>
+        <w:t xml:space="preserve">MDN Web </w:t>
+      </w:r>
+      <w:proofErr w:type="spellStart"/>
+      <w:r>
+        <w:t>Docs</w:t>
+      </w:r>
+      <w:proofErr w:type="spellEnd"/>
+      <w:r>
+        <w:t xml:space="preserve">: [сайт]. — URL: </w:t>
       </w:r>
       <w:hyperlink r:id="rId11" w:history="1">
         <w:r>
@@ -13443,7 +14691,15 @@
         <w:t>GitHub</w:t>
       </w:r>
       <w:r>
-        <w:t xml:space="preserve"> // GitHub: [сайт]. — URL: </w:t>
+        <w:t xml:space="preserve"> // </w:t>
+      </w:r>
+      <w:proofErr w:type="spellStart"/>
+      <w:r>
+        <w:t>GitHub</w:t>
+      </w:r>
+      <w:proofErr w:type="spellEnd"/>
+      <w:r>
+        <w:t xml:space="preserve">: [сайт]. — URL: </w:t>
       </w:r>
       <w:hyperlink r:id="rId13" w:history="1">
         <w:r>

</xml_diff>